<commit_message>
refactor: migrate thesis content into modular builder sections and reorganize diagram assets
</commit_message>
<xml_diff>
--- a/thesis/builder/taskinator_thesis_v2.docx
+++ b/thesis/builder/taskinator_thesis_v2.docx
@@ -5480,7 +5480,7 @@
           <w:sz w:val="22"/>
           <w:szCs w:val="22"/>
         </w:rPr>
-        <w:t xml:space="preserve">The foundational backbone of Taskinator is its highly tuned Event-Driven Architecture (EDA). This architecture rejects synchronous side-effect processing entirely, instead utilizing pervasive batching strategies that begin all the way upstream at the producer level and carry through to the downstream consumers.</w:t>
+        <w:t xml:space="preserve">The foundational backbone of Taskinator is its highly tuned Event-Driven Architecture (EDA). This architecture rejects synchronous side-effect processing entirely, instead utilizing pervasive batching strategies that begin all the way upstream at the producer level and carry through to the downstream consumers. The primary motivation for this architecture is to decouple fast, optimistic writes from expensive, blocking reads and analytics updates.</w:t>
       </w:r>
     </w:p>
     <w:p>
@@ -5524,7 +5524,7 @@
           <w:sz w:val="22"/>
           <w:szCs w:val="22"/>
         </w:rPr>
-        <w:t xml:space="preserve">Taskinator utilizes the Transactional Outbox Pattern to guarantee absolute atomic writes without dual-write failures.</w:t>
+        <w:t xml:space="preserve">To completely eradicate this dual-write problem, Taskinator utilizes the Transactional Outbox Pattern. This guarantees absolute atomic writes: the business entity mutation and the domain event emission are committed to the same exact SQL database simultaneously. If either fails, the entire transaction rolls back.</w:t>
       </w:r>
     </w:p>
     <w:p>
@@ -5608,16 +5608,46 @@
     </w:p>
     <w:p>
       <w:pPr>
-        <w:spacing w:after="120" w:before="0"/>
-        <w:jc w:val="both"/>
-      </w:pPr>
-      <w:r>
-        <w:rPr>
-          <w:rFonts w:ascii="Times New Roman" w:cs="Times New Roman" w:eastAsia="Times New Roman" w:hAnsi="Times New Roman"/>
-          <w:sz w:val="22"/>
-          <w:szCs w:val="22"/>
-        </w:rPr>
-        <w:t xml:space="preserve">While traditional Outbox implementations execute multiple sequential SQL INSERT statements within a BEGIN...COMMIT block, Taskinator optimizes this using PostgreSQL's Data-Modifying Common Table Expressions (wCTE). A single SQL query uses WITH clauses to insert the business data and immediately insert the serialized JSON payload into the outbox_events table simultaneously:</w:t>
+        <w:pStyle w:val="Heading3"/>
+        <w:spacing w:after="120" w:before="200"/>
+      </w:pPr>
+      <w:r>
+        <w:rPr>
+          <w:rFonts w:ascii="Times New Roman" w:cs="Times New Roman" w:eastAsia="Times New Roman" w:hAnsi="Times New Roman"/>
+          <w:b/>
+          <w:bCs/>
+          <w:sz w:val="22"/>
+          <w:szCs w:val="22"/>
+        </w:rPr>
+        <w:t xml:space="preserve">4.1.1 Eliminating Multi-Statement Overhead with Data-Modifying CTEs</w:t>
+      </w:r>
+    </w:p>
+    <w:p>
+      <w:pPr>
+        <w:spacing w:after="120" w:before="0"/>
+        <w:jc w:val="both"/>
+      </w:pPr>
+      <w:r>
+        <w:rPr>
+          <w:rFonts w:ascii="Times New Roman" w:cs="Times New Roman" w:eastAsia="Times New Roman" w:hAnsi="Times New Roman"/>
+          <w:sz w:val="22"/>
+          <w:szCs w:val="22"/>
+        </w:rPr>
+        <w:t xml:space="preserve">While traditional Outbox implementations execute multiple sequential SQL statements (e.g., BEGIN, INSERT INTO entities, INSERT INTO outbox, COMMIT), this approach is fundamentally slow. It requires multiple network round-trips between the Node.js application server and the PostgreSQL database engine, increasing the total duration of the transaction lock.</w:t>
+      </w:r>
+    </w:p>
+    <w:p>
+      <w:pPr>
+        <w:spacing w:after="120" w:before="0"/>
+        <w:jc w:val="both"/>
+      </w:pPr>
+      <w:r>
+        <w:rPr>
+          <w:rFonts w:ascii="Times New Roman" w:cs="Times New Roman" w:eastAsia="Times New Roman" w:hAnsi="Times New Roman"/>
+          <w:sz w:val="22"/>
+          <w:szCs w:val="22"/>
+        </w:rPr>
+        <w:t xml:space="preserve">Taskinator optimizes this by exclusively utilizing PostgreSQL's Data-Modifying Common Table Expressions (wCTE). A single SQL query is compiled using Kysely and sent to the database. This query uses WITH clauses to insert the business data and immediately insert the serialized JSON payload into the outbox_events table simultaneously, entirely within the database engine's execution planner:</w:t>
       </w:r>
     </w:p>
     <w:p>
@@ -5827,7 +5857,7 @@
           <w:sz w:val="22"/>
           <w:szCs w:val="22"/>
         </w:rPr>
-        <w:t xml:space="preserve">If the transaction rolls back due to a constraint violation or a server crash mid-flight, both the task and the event are safely discarded by the database engine. They succeed or fail as a singular, indivisible unit of work, requiring only one network roundtrip.</w:t>
+        <w:t xml:space="preserve">This pattern ensures that network latency is incurred only once per HTTP request. The database engine executes the statements atomically in memory before writing to the write-ahead log (WAL). If a constraint is violated on the outbox table, the task insertion is cleanly aborted, and the application receives an immediate rejection. This single-trip architecture is a crucial factor in achieving the target of 10,000 RPS, as it drastically reduces connection pool exhaustion on the PgBouncer layer.</w:t>
       </w:r>
     </w:p>
     <w:p>
@@ -5857,35 +5887,35 @@
           <w:sz w:val="22"/>
           <w:szCs w:val="22"/>
         </w:rPr>
-        <w:t xml:space="preserve">Traditional outbox relays utilize primitive setInterval loops to aggressively poll the database for new events. At 10,000 RPS, this creates severe database CPU load even when the system is idle.</w:t>
-      </w:r>
-    </w:p>
-    <w:p>
-      <w:pPr>
-        <w:spacing w:after="120" w:before="0"/>
-        <w:jc w:val="both"/>
-      </w:pPr>
-      <w:r>
-        <w:rPr>
-          <w:rFonts w:ascii="Times New Roman" w:cs="Times New Roman" w:eastAsia="Times New Roman" w:hAnsi="Times New Roman"/>
-          <w:sz w:val="22"/>
-          <w:szCs w:val="22"/>
-        </w:rPr>
-        <w:t xml:space="preserve">Taskinator discards polling entirely in favor of reactivity. The Outbox Relay connects via the pg driver and executes a persistent LISTEN outbox_event_notification command. When the aforementioned wCTE commits, PostgreSQL natively pushes a highly efficient, lightweight notification through the socket.</w:t>
-      </w:r>
-    </w:p>
-    <w:p>
-      <w:pPr>
-        <w:spacing w:after="120" w:before="0"/>
-        <w:jc w:val="both"/>
-      </w:pPr>
-      <w:r>
-        <w:rPr>
-          <w:rFonts w:ascii="Times New Roman" w:cs="Times New Roman" w:eastAsia="Times New Roman" w:hAnsi="Times New Roman"/>
-          <w:sz w:val="22"/>
-          <w:szCs w:val="22"/>
-        </w:rPr>
-        <w:t xml:space="preserve">However, in a horizontally scaled Kubernetes environment, this reactivity creates a catastrophic "Thundering Herd" problem: 50 different relay pods wake up simultaneously to grab the exact same batch of events.</w:t>
+        <w:t xml:space="preserve">Writing events safely to the outbox is only the first phase; the system must efficiently relay these events to the Kafka broker. Traditional outbox relays utilize primitive setInterval loops within background worker threads to repeatedly poll the database (e.g., SELECT * FROM outbox_events WHERE status = 'PENDING').</w:t>
+      </w:r>
+    </w:p>
+    <w:p>
+      <w:pPr>
+        <w:spacing w:after="120" w:before="0"/>
+        <w:jc w:val="both"/>
+      </w:pPr>
+      <w:r>
+        <w:rPr>
+          <w:rFonts w:ascii="Times New Roman" w:cs="Times New Roman" w:eastAsia="Times New Roman" w:hAnsi="Times New Roman"/>
+          <w:sz w:val="22"/>
+          <w:szCs w:val="22"/>
+        </w:rPr>
+        <w:t xml:space="preserve">At an operational scale of 10,000 RPS, this polling methodology is catastrophic. Even when the system is relatively idle, aggressive polling introduces severe database CPU load and saturates network bandwidth.</w:t>
+      </w:r>
+    </w:p>
+    <w:p>
+      <w:pPr>
+        <w:spacing w:after="120" w:before="0"/>
+        <w:jc w:val="both"/>
+      </w:pPr>
+      <w:r>
+        <w:rPr>
+          <w:rFonts w:ascii="Times New Roman" w:cs="Times New Roman" w:eastAsia="Times New Roman" w:hAnsi="Times New Roman"/>
+          <w:sz w:val="22"/>
+          <w:szCs w:val="22"/>
+        </w:rPr>
+        <w:t xml:space="preserve">Taskinator discards polling entirely in favor of reactivity. The Outbox Relay connects via the native pg driver and executes a persistent LISTEN outbox_event_notification command. When the aforementioned wCTE commits, PostgreSQL natively pushes a highly efficient, lightweight notification through the socket, instantly waking the idle relay.</w:t>
       </w:r>
     </w:p>
     <w:p>
@@ -5969,30 +5999,104 @@
     </w:p>
     <w:p>
       <w:pPr>
-        <w:spacing w:after="120" w:before="0"/>
-        <w:jc w:val="both"/>
-      </w:pPr>
-      <w:r>
-        <w:rPr>
-          <w:rFonts w:ascii="Times New Roman" w:cs="Times New Roman" w:eastAsia="Times New Roman" w:hAnsi="Times New Roman"/>
-          <w:sz w:val="22"/>
-          <w:szCs w:val="22"/>
-        </w:rPr>
-        <w:t xml:space="preserve">To solve this, Taskinator utilizes the advanced FOR UPDATE SKIP LOCKED database directive. When the notification fires, Pod 1 executes SELECT ... FOR UPDATE SKIP LOCKED LIMIT 100. It immediately acquires a row-level lock on rows 1 through 100. Milliseconds later, Pod 2 executes the exact same query. Because of the SKIP LOCKED directive, the PostgreSQL engine instructs Pod 2 to completely bypass rows 1-100 without waiting for the lock to release. Pod 2 instead reads and instantly locks rows 101 through 200.</w:t>
-      </w:r>
-    </w:p>
-    <w:p>
-      <w:pPr>
-        <w:spacing w:after="120" w:before="0"/>
-        <w:jc w:val="both"/>
-      </w:pPr>
-      <w:r>
-        <w:rPr>
-          <w:rFonts w:ascii="Times New Roman" w:cs="Times New Roman" w:eastAsia="Times New Roman" w:hAnsi="Times New Roman"/>
-          <w:sz w:val="22"/>
-          <w:szCs w:val="22"/>
-        </w:rPr>
-        <w:t xml:space="preserve">The result is massive, lock-free concurrent throughput across dozens of pods without polling loops, database deadlocks, or duplicate event publishing.</w:t>
+        <w:pStyle w:val="Heading3"/>
+        <w:spacing w:after="120" w:before="200"/>
+      </w:pPr>
+      <w:r>
+        <w:rPr>
+          <w:rFonts w:ascii="Times New Roman" w:cs="Times New Roman" w:eastAsia="Times New Roman" w:hAnsi="Times New Roman"/>
+          <w:b/>
+          <w:bCs/>
+          <w:sz w:val="22"/>
+          <w:szCs w:val="22"/>
+        </w:rPr>
+        <w:t xml:space="preserve">4.2.1 The Thundering Herd Problem in Kubernetes Clusters</w:t>
+      </w:r>
+    </w:p>
+    <w:p>
+      <w:pPr>
+        <w:spacing w:after="120" w:before="0"/>
+        <w:jc w:val="both"/>
+      </w:pPr>
+      <w:r>
+        <w:rPr>
+          <w:rFonts w:ascii="Times New Roman" w:cs="Times New Roman" w:eastAsia="Times New Roman" w:hAnsi="Times New Roman"/>
+          <w:sz w:val="22"/>
+          <w:szCs w:val="22"/>
+        </w:rPr>
+        <w:t xml:space="preserve">While reactive LISTEN/NOTIFY is highly efficient on a single node, enterprise deployments utilize Kubernetes to horizontally scale backend pods. If 50 identical backend pods are actively listening to the same outbox channel, a single pg_notify event will simultaneously wake up all 50 pods.</w:t>
+      </w:r>
+    </w:p>
+    <w:p>
+      <w:pPr>
+        <w:spacing w:after="120" w:before="0"/>
+        <w:jc w:val="both"/>
+      </w:pPr>
+      <w:r>
+        <w:rPr>
+          <w:rFonts w:ascii="Times New Roman" w:cs="Times New Roman" w:eastAsia="Times New Roman" w:hAnsi="Times New Roman"/>
+          <w:sz w:val="22"/>
+          <w:szCs w:val="22"/>
+        </w:rPr>
+        <w:t xml:space="preserve">This creates a disastrous scenario known as the "Thundering Herd." All 50 pods will instantly attempt to execute a SELECT ... FOR UPDATE query to claim the exact same batch of pending events. Pod 1 acquires the lock, while Pods 2 through 50 are forced to block and wait. When Pod 1 commits, Pod 2 wakes up, discovers the events are already processed, and goes back to sleep. This contention leads to massive CPU spikes, transaction timeouts, and eventual database deadlocks as threads fight over the same B-Tree index rows.</w:t>
+      </w:r>
+    </w:p>
+    <w:p>
+      <w:pPr>
+        <w:pStyle w:val="Heading3"/>
+        <w:spacing w:after="120" w:before="200"/>
+      </w:pPr>
+      <w:r>
+        <w:rPr>
+          <w:rFonts w:ascii="Times New Roman" w:cs="Times New Roman" w:eastAsia="Times New Roman" w:hAnsi="Times New Roman"/>
+          <w:b/>
+          <w:bCs/>
+          <w:sz w:val="22"/>
+          <w:szCs w:val="22"/>
+        </w:rPr>
+        <w:t xml:space="preserve">4.2.2 High-Concurrency Queue Processing with SKIP LOCKED</w:t>
+      </w:r>
+    </w:p>
+    <w:p>
+      <w:pPr>
+        <w:spacing w:after="120" w:before="0"/>
+        <w:jc w:val="both"/>
+      </w:pPr>
+      <w:r>
+        <w:rPr>
+          <w:rFonts w:ascii="Times New Roman" w:cs="Times New Roman" w:eastAsia="Times New Roman" w:hAnsi="Times New Roman"/>
+          <w:sz w:val="22"/>
+          <w:szCs w:val="22"/>
+        </w:rPr>
+        <w:t xml:space="preserve">To solve the Thundering Herd contention, Taskinator utilizes the advanced FOR UPDATE SKIP LOCKED database directive during the event claiming phase.</w:t>
+      </w:r>
+    </w:p>
+    <w:p>
+      <w:pPr>
+        <w:spacing w:after="120" w:before="0"/>
+        <w:jc w:val="both"/>
+      </w:pPr>
+      <w:r>
+        <w:rPr>
+          <w:rFonts w:ascii="Times New Roman" w:cs="Times New Roman" w:eastAsia="Times New Roman" w:hAnsi="Times New Roman"/>
+          <w:sz w:val="22"/>
+          <w:szCs w:val="22"/>
+        </w:rPr>
+        <w:t xml:space="preserve">When the notification fires, Pod 1 executes SELECT * FROM outbox_events WHERE status = 'PENDING' FOR UPDATE SKIP LOCKED LIMIT 100. It immediately acquires an exclusive row-level lock on rows 1 through 100. Milliseconds later, Pod 2 executes the exact same query. Because of the SKIP LOCKED directive, the PostgreSQL query planner intercepts Pod 2's request and instructs it to completely bypass the locked rows (1-100) without waiting.</w:t>
+      </w:r>
+    </w:p>
+    <w:p>
+      <w:pPr>
+        <w:spacing w:after="120" w:before="0"/>
+        <w:jc w:val="both"/>
+      </w:pPr>
+      <w:r>
+        <w:rPr>
+          <w:rFonts w:ascii="Times New Roman" w:cs="Times New Roman" w:eastAsia="Times New Roman" w:hAnsi="Times New Roman"/>
+          <w:sz w:val="22"/>
+          <w:szCs w:val="22"/>
+        </w:rPr>
+        <w:t xml:space="preserve">Pod 2 instead reads and instantly locks rows 101 through 200. Pod 3 locks rows 201 through 300, and so on. The result is massive, lock-free concurrent throughput. Dozens of pods can drain the outbox queue simultaneously at maximum speed without polling loops, database deadlocks, or duplicate event publishing. Once the events are safely pushed to Kafka, the pods execute a bulk DELETE on the processed rows, keeping the outbox table small and the B-Tree indexes highly optimized.</w:t>
       </w:r>
     </w:p>
     <w:p>
@@ -6022,21 +6126,21 @@
           <w:sz w:val="22"/>
           <w:szCs w:val="22"/>
         </w:rPr>
-        <w:t xml:space="preserve">Pushing millions of events efficiently into Kafka is entirely useless if the downstream consumers cannot process them rapidly enough. Naive consumers execute one database transaction per incoming Kafka event. At 10k RPS, executing 10,000 sequential UPDATE transactions crushes the database connection pool.</w:t>
-      </w:r>
-    </w:p>
-    <w:p>
-      <w:pPr>
-        <w:spacing w:after="120" w:before="0"/>
-        <w:jc w:val="both"/>
-      </w:pPr>
-      <w:r>
-        <w:rPr>
-          <w:rFonts w:ascii="Times New Roman" w:cs="Times New Roman" w:eastAsia="Times New Roman" w:hAnsi="Times New Roman"/>
-          <w:sz w:val="22"/>
-          <w:szCs w:val="22"/>
-        </w:rPr>
-        <w:t xml:space="preserve">Taskinator introduces the Smart Batch Aggregator.</w:t>
+        <w:t xml:space="preserve">Pushing millions of events efficiently into the Kafka broker solves the upstream producer bottleneck. However, if the downstream consumers cannot process these events rapidly enough, Kafka will experience massive partition lag. Naive consumer implementations process one Kafka event at a time, executing a separate database transaction for every incoming event. At 10,000 RPS, executing 10,000 sequential UPDATE transactions to modify counters or analytics will instantly exhaust the database connection pool.</w:t>
+      </w:r>
+    </w:p>
+    <w:p>
+      <w:pPr>
+        <w:spacing w:after="120" w:before="0"/>
+        <w:jc w:val="both"/>
+      </w:pPr>
+      <w:r>
+        <w:rPr>
+          <w:rFonts w:ascii="Times New Roman" w:cs="Times New Roman" w:eastAsia="Times New Roman" w:hAnsi="Times New Roman"/>
+          <w:sz w:val="22"/>
+          <w:szCs w:val="22"/>
+        </w:rPr>
+        <w:t xml:space="preserve">To mitigate this, Taskinator introduces a specialized background worker pattern called the Smart Batch Aggregator.</w:t>
       </w:r>
     </w:p>
     <w:p>
@@ -6120,16 +6224,76 @@
     </w:p>
     <w:p>
       <w:pPr>
-        <w:spacing w:after="120" w:before="0"/>
-        <w:jc w:val="both"/>
-      </w:pPr>
-      <w:r>
-        <w:rPr>
-          <w:rFonts w:ascii="Times New Roman" w:cs="Times New Roman" w:eastAsia="Times New Roman" w:hAnsi="Times New Roman"/>
-          <w:sz w:val="22"/>
-          <w:szCs w:val="22"/>
-        </w:rPr>
-        <w:t xml:space="preserve">The Kafka consumer receives a massive batch of events (e.g., batchSize: 5000) and buffers them chronologically. It loops over the events strictly in memory. If the aggregator detects 50 "Task Created" events and 20 "Task Deleted" events pertaining to the exact same project within the batch window, it does not execute 70 individual SQL updates. Instead, it executes a Semantic Folding Algorithm to calculate a net mathematical delta (+30). It then executes a single, batched database update to the denormalized project.task_count metric.</w:t>
+        <w:pStyle w:val="Heading3"/>
+        <w:spacing w:after="120" w:before="200"/>
+      </w:pPr>
+      <w:r>
+        <w:rPr>
+          <w:rFonts w:ascii="Times New Roman" w:cs="Times New Roman" w:eastAsia="Times New Roman" w:hAnsi="Times New Roman"/>
+          <w:b/>
+          <w:bCs/>
+          <w:sz w:val="22"/>
+          <w:szCs w:val="22"/>
+        </w:rPr>
+        <w:t xml:space="preserve">4.3.1 Kafka Partitioning Strategy</w:t>
+      </w:r>
+    </w:p>
+    <w:p>
+      <w:pPr>
+        <w:spacing w:after="120" w:before="0"/>
+        <w:jc w:val="both"/>
+      </w:pPr>
+      <w:r>
+        <w:rPr>
+          <w:rFonts w:ascii="Times New Roman" w:cs="Times New Roman" w:eastAsia="Times New Roman" w:hAnsi="Times New Roman"/>
+          <w:sz w:val="22"/>
+          <w:szCs w:val="22"/>
+        </w:rPr>
+        <w:t xml:space="preserve">The prerequisite for semantic folding is strict causal ordering. The Kafka producer explicitly sets the message partitioning key to the projectId. This guarantees that all events related to "Project A"—regardless of which node generated them or when they occurred—will consistently land on the exact same Kafka topic partition. Consequently, only one specific consumer thread will ever process the event stream for Project A at a given time, eliminating the possibility of distributed race conditions during aggregation.</w:t>
+      </w:r>
+    </w:p>
+    <w:p>
+      <w:pPr>
+        <w:pStyle w:val="Heading3"/>
+        <w:spacing w:after="120" w:before="200"/>
+      </w:pPr>
+      <w:r>
+        <w:rPr>
+          <w:rFonts w:ascii="Times New Roman" w:cs="Times New Roman" w:eastAsia="Times New Roman" w:hAnsi="Times New Roman"/>
+          <w:b/>
+          <w:bCs/>
+          <w:sz w:val="22"/>
+          <w:szCs w:val="22"/>
+        </w:rPr>
+        <w:t xml:space="preserve">4.3.2 The Semantic Folding Algorithm</w:t>
+      </w:r>
+    </w:p>
+    <w:p>
+      <w:pPr>
+        <w:spacing w:after="120" w:before="0"/>
+        <w:jc w:val="both"/>
+      </w:pPr>
+      <w:r>
+        <w:rPr>
+          <w:rFonts w:ascii="Times New Roman" w:cs="Times New Roman" w:eastAsia="Times New Roman" w:hAnsi="Times New Roman"/>
+          <w:sz w:val="22"/>
+          <w:szCs w:val="22"/>
+        </w:rPr>
+        <w:t xml:space="preserve">The Kafka consumer is configured to ingest massive chunks of events (e.g., batchSize: 5000) from the broker and buffer them chronologically in memory. Instead of executing 5000 individual SQL queries, the aggregator loops over the buffered array and executes a Semantic Folding Algorithm.</w:t>
+      </w:r>
+    </w:p>
+    <w:p>
+      <w:pPr>
+        <w:spacing w:after="120" w:before="0"/>
+        <w:jc w:val="both"/>
+      </w:pPr>
+      <w:r>
+        <w:rPr>
+          <w:rFonts w:ascii="Times New Roman" w:cs="Times New Roman" w:eastAsia="Times New Roman" w:hAnsi="Times New Roman"/>
+          <w:sz w:val="22"/>
+          <w:szCs w:val="22"/>
+        </w:rPr>
+        <w:t xml:space="preserve">If the aggregator detects 50 "Task Created" events and 20 "Task Deleted" events pertaining to the exact same project within the 500-millisecond batch window, it does not execute 70 individual SQL updates. Instead, it calculates a net mathematical delta (+30). It then executes a single, highly optimized, batched database update to the denormalized project.task_count metric.</w:t>
       </w:r>
     </w:p>
     <w:p>
@@ -6451,7 +6615,12 @@
           <w:sz w:val="22"/>
           <w:szCs w:val="22"/>
         </w:rPr>
-        <w:t xml:space="preserve">By partitioning the Kafka topic strictly by projectId, the system guarantees that related events land on the same consumer thread, making in-memory folding highly effective and drastically reducing database write amplification.</w:t>
+        <w:t xml:space="preserve">By performing these mathematical reductions purely in the Node.js V8 memory heap, the aggregator collapses thousands of sequential database operations into a handful of batched updates. This drastically reduces database write amplification, minimizes transaction overhead, and ensures that the analytics dashboard remains incredibly responsive, even under peak enterprise loads.</w:t>
+      </w:r>
+    </w:p>
+    <w:p>
+      <w:r>
+        <w:br w:type="page"/>
       </w:r>
     </w:p>
     <w:p>
@@ -6481,7 +6650,21 @@
           <w:sz w:val="22"/>
           <w:szCs w:val="22"/>
         </w:rPr>
-        <w:t xml:space="preserve">In hierarchical systems, deleting a root node that possesses 50,000 descendants via a synchronous SQL ON DELETE CASCADE command will acquire an exclusive database table lock for several seconds. Taskinator circumvents this by implementing Declarative Signalling and Self-Chunking.</w:t>
+        <w:t xml:space="preserve">In hierarchical systems, deleting a root node that possesses 50,000 descendants via a synchronous SQL ON DELETE CASCADE command is computationally disastrous. A standard RDBMS will acquire an exclusive table lock or massive row locks, traversing the foreign key relationships to verify constraints and delete every single child row within a single, massive transaction. This operation can take several seconds to execute. During this window, the database is severely restricted; concurrent operations from other users are blocked, and transaction queues rapidly hit their maximum capacity, resulting in widespread 503 Service Unavailable errors across the entire application.</w:t>
+      </w:r>
+    </w:p>
+    <w:p>
+      <w:pPr>
+        <w:spacing w:after="120" w:before="0"/>
+        <w:jc w:val="both"/>
+      </w:pPr>
+      <w:r>
+        <w:rPr>
+          <w:rFonts w:ascii="Times New Roman" w:cs="Times New Roman" w:eastAsia="Times New Roman" w:hAnsi="Times New Roman"/>
+          <w:sz w:val="22"/>
+          <w:szCs w:val="22"/>
+        </w:rPr>
+        <w:t xml:space="preserve">Taskinator completely circumvents this bottleneck by implementing a specialized architectural pattern termed "Declarative Signalling and Self-Chunking.", colloquially referred to as "The Bubbling Effect".</w:t>
       </w:r>
     </w:p>
     <w:p>
@@ -6565,30 +6748,120 @@
     </w:p>
     <w:p>
       <w:pPr>
-        <w:spacing w:after="120" w:before="0"/>
-        <w:jc w:val="both"/>
-      </w:pPr>
-      <w:r>
-        <w:rPr>
-          <w:rFonts w:ascii="Times New Roman" w:cs="Times New Roman" w:eastAsia="Times New Roman" w:hAnsi="Times New Roman"/>
-          <w:sz w:val="22"/>
-          <w:szCs w:val="22"/>
-        </w:rPr>
-        <w:t xml:space="preserve">When a user deletes a large project, the API does not execute a SQL DELETE on the tasks. Instead, it merely emits a declarative signal: PROJECT_DELETED into the Outbox. A specialized Background Listener picks up this signal and queries a very small chunk using explicit limits: SELECT id FROM project_task WHERE fk_project_id = X LIMIT 2000. The Listener deletes only those 2000 rows.</w:t>
-      </w:r>
-    </w:p>
-    <w:p>
-      <w:pPr>
-        <w:spacing w:after="120" w:before="0"/>
-        <w:jc w:val="both"/>
-      </w:pPr>
-      <w:r>
-        <w:rPr>
-          <w:rFonts w:ascii="Times New Roman" w:cs="Times New Roman" w:eastAsia="Times New Roman" w:hAnsi="Times New Roman"/>
-          <w:sz w:val="22"/>
-          <w:szCs w:val="22"/>
-        </w:rPr>
-        <w:t xml:space="preserve">If more rows remain in the project, the Listener deliberately emits a new, identical self-signal (PROJECT_DELETED) back into the outbox. This recursively "bubbles" through the message queue until the table is completely purged. By enforcing strict LIMIT 2000 bounds on every operation, the maximum duration of a database lock never exceeds a few milliseconds, ensuring the application remains 100% available to all other users during massive cleanup operations.</w:t>
+        <w:pStyle w:val="Heading3"/>
+        <w:spacing w:after="120" w:before="200"/>
+      </w:pPr>
+      <w:r>
+        <w:rPr>
+          <w:rFonts w:ascii="Times New Roman" w:cs="Times New Roman" w:eastAsia="Times New Roman" w:hAnsi="Times New Roman"/>
+          <w:b/>
+          <w:bCs/>
+          <w:sz w:val="22"/>
+          <w:szCs w:val="22"/>
+        </w:rPr>
+        <w:t xml:space="preserve">4.4.1 The Declarative Signal</w:t>
+      </w:r>
+    </w:p>
+    <w:p>
+      <w:pPr>
+        <w:spacing w:after="120" w:before="0"/>
+        <w:jc w:val="both"/>
+      </w:pPr>
+      <w:r>
+        <w:rPr>
+          <w:rFonts w:ascii="Times New Roman" w:cs="Times New Roman" w:eastAsia="Times New Roman" w:hAnsi="Times New Roman"/>
+          <w:sz w:val="22"/>
+          <w:szCs w:val="22"/>
+        </w:rPr>
+        <w:t xml:space="preserve">When an authenticated user requests the deletion of a massive project, the primary API gateway does not execute a SQL DELETE query against the tasks table. Instead, it merely updates the project's status column to 'DELETING' and emits a declarative signal event (PROJECT_DELETED) into the Transactional Outbox. The HTTP request is then immediately resolved, and the user receives a 202 Accepted response in less than 50 milliseconds.</w:t>
+      </w:r>
+    </w:p>
+    <w:p>
+      <w:pPr>
+        <w:pStyle w:val="Heading3"/>
+        <w:spacing w:after="120" w:before="200"/>
+      </w:pPr>
+      <w:r>
+        <w:rPr>
+          <w:rFonts w:ascii="Times New Roman" w:cs="Times New Roman" w:eastAsia="Times New Roman" w:hAnsi="Times New Roman"/>
+          <w:b/>
+          <w:bCs/>
+          <w:sz w:val="22"/>
+          <w:szCs w:val="22"/>
+        </w:rPr>
+        <w:t xml:space="preserve">4.4.2 Bounded Transaction Chunks</w:t>
+      </w:r>
+    </w:p>
+    <w:p>
+      <w:pPr>
+        <w:spacing w:after="120" w:before="0"/>
+        <w:jc w:val="both"/>
+      </w:pPr>
+      <w:r>
+        <w:rPr>
+          <w:rFonts w:ascii="Times New Roman" w:cs="Times New Roman" w:eastAsia="Times New Roman" w:hAnsi="Times New Roman"/>
+          <w:sz w:val="22"/>
+          <w:szCs w:val="22"/>
+        </w:rPr>
+        <w:t xml:space="preserve">A specialized asynchronous Background Listener, operating as a distinct Kafka consumer group, receives the PROJECT_DELETED signal. Rather than executing a blind delete, the Listener executes a strictly bounded query using explicit SQL LIMIT parameters: SELECT id FROM project_task WHERE fk_project_id = X LIMIT 2000. It then proceeds to delete exclusively those 2000 specific rows within a heavily constrained transaction.</w:t>
+      </w:r>
+    </w:p>
+    <w:p>
+      <w:pPr>
+        <w:spacing w:after="120" w:before="0"/>
+        <w:jc w:val="both"/>
+      </w:pPr>
+      <w:r>
+        <w:rPr>
+          <w:rFonts w:ascii="Times New Roman" w:cs="Times New Roman" w:eastAsia="Times New Roman" w:hAnsi="Times New Roman"/>
+          <w:sz w:val="22"/>
+          <w:szCs w:val="22"/>
+        </w:rPr>
+        <w:t xml:space="preserve">By enforcing a strict upper bound of 2000 rows, the maximum continuous duration of the database lock never exceeds 10 to 15 milliseconds. After the chunk is purged, the transaction commits, instantly releasing all locks back to the connection pool. This microscopic lock duration guarantees that concurrent HTTP requests from other active users can seamlessly interleave between the deletion chunks, experiencing zero noticeable latency degradation.</w:t>
+      </w:r>
+    </w:p>
+    <w:p>
+      <w:pPr>
+        <w:pStyle w:val="Heading3"/>
+        <w:spacing w:after="120" w:before="200"/>
+      </w:pPr>
+      <w:r>
+        <w:rPr>
+          <w:rFonts w:ascii="Times New Roman" w:cs="Times New Roman" w:eastAsia="Times New Roman" w:hAnsi="Times New Roman"/>
+          <w:b/>
+          <w:bCs/>
+          <w:sz w:val="22"/>
+          <w:szCs w:val="22"/>
+        </w:rPr>
+        <w:t xml:space="preserve">4.4.3 Recursive Bubbling</w:t>
+      </w:r>
+    </w:p>
+    <w:p>
+      <w:pPr>
+        <w:spacing w:after="120" w:before="0"/>
+        <w:jc w:val="both"/>
+      </w:pPr>
+      <w:r>
+        <w:rPr>
+          <w:rFonts w:ascii="Times New Roman" w:cs="Times New Roman" w:eastAsia="Times New Roman" w:hAnsi="Times New Roman"/>
+          <w:sz w:val="22"/>
+          <w:szCs w:val="22"/>
+        </w:rPr>
+        <w:t xml:space="preserve">After the first chunk of 2000 rows is successfully deleted, the Listener checks if the operation is complete. If the initial SELECT query returned exactly 2000 rows, there is a high statistical probability that further descendant rows remain in the database. To address this without locking the thread in a synchronous loop, the Listener deliberately emits a new, identical self-signal (PROJECT_DELETED) back into the outbox.</w:t>
+      </w:r>
+    </w:p>
+    <w:p>
+      <w:pPr>
+        <w:spacing w:after="120" w:before="0"/>
+        <w:jc w:val="both"/>
+      </w:pPr>
+      <w:r>
+        <w:rPr>
+          <w:rFonts w:ascii="Times New Roman" w:cs="Times New Roman" w:eastAsia="Times New Roman" w:hAnsi="Times New Roman"/>
+          <w:sz w:val="22"/>
+          <w:szCs w:val="22"/>
+        </w:rPr>
+        <w:t xml:space="preserve">This signal propagates through Kafka, eventually re-triggering the Listener a few milliseconds later. The process repeats recursively—"bubbling" through the message queue—until a SELECT ... LIMIT 2000 query returns 0 rows. At this point, the mathematical certainty of complete deletion is achieved, the recursive loop terminates, and the parent project record is safely hard-deleted. This pattern represents a fundamental paradigm shift from optimistic database locking to asynchronous, bounded chunk management, proving critical for achieving multi-tenant enterprise scalability.</w:t>
       </w:r>
     </w:p>
     <w:p>
@@ -6609,21 +6882,21 @@
           <w:sz w:val="28"/>
           <w:szCs w:val="28"/>
         </w:rPr>
-        <w:t xml:space="preserve">5. FRONTEND ARCHITECTURE AND REAL-TIME SYNCHRONIZATION</w:t>
-      </w:r>
-    </w:p>
-    <w:p>
-      <w:pPr>
-        <w:spacing w:after="120" w:before="0"/>
-        <w:jc w:val="both"/>
-      </w:pPr>
-      <w:r>
-        <w:rPr>
-          <w:rFonts w:ascii="Times New Roman" w:cs="Times New Roman" w:eastAsia="Times New Roman" w:hAnsi="Times New Roman"/>
-          <w:sz w:val="22"/>
-          <w:szCs w:val="22"/>
-        </w:rPr>
-        <w:t xml:space="preserve">Pushing data to the client efficiently is only half the battle in a real-time system. If the client simply triggers a full-page data refetch upon receiving a Server-Sent Event (SSE) payload, the backend database will be instantly overwhelmed by redundant read queries, defeating the purpose of the Event-Driven Architecture entirely. Taskinator's frontend is engineered to surgically inject updates directly into the in-memory cache, achieving O(1) rendering complexity.</w:t>
+        <w:t xml:space="preserve">5. SECURITY AND ACCESS CONTROL</w:t>
+      </w:r>
+    </w:p>
+    <w:p>
+      <w:pPr>
+        <w:spacing w:after="120" w:before="0"/>
+        <w:jc w:val="both"/>
+      </w:pPr>
+      <w:r>
+        <w:rPr>
+          <w:rFonts w:ascii="Times New Roman" w:cs="Times New Roman" w:eastAsia="Times New Roman" w:hAnsi="Times New Roman"/>
+          <w:sz w:val="22"/>
+          <w:szCs w:val="22"/>
+        </w:rPr>
+        <w:t xml:space="preserve">In a multi-tenant enterprise orchestration tool, robust data segregation and authorization are paramount. Users must be mathematically proven to have access to specific project entities before any mutation can occur. However, calculating these permissions synchronously during high-throughput HTTP requests typically incurs massive database overhead due to the required JOIN operations.</w:t>
       </w:r>
     </w:p>
     <w:p>
@@ -6639,93 +6912,21 @@
           <w:sz w:val="24"/>
           <w:szCs w:val="24"/>
         </w:rPr>
-        <w:t xml:space="preserve">5.1 The React Task Graph and D3.js Visualization</w:t>
-      </w:r>
-    </w:p>
-    <w:p>
-      <w:pPr>
-        <w:spacing w:after="120" w:before="0"/>
-        <w:jc w:val="both"/>
-      </w:pPr>
-      <w:r>
-        <w:rPr>
-          <w:rFonts w:ascii="Times New Roman" w:cs="Times New Roman" w:eastAsia="Times New Roman" w:hAnsi="Times New Roman"/>
-          <w:sz w:val="22"/>
-          <w:szCs w:val="22"/>
-        </w:rPr>
-        <w:t xml:space="preserve">To represent the deeply nested Directed Acyclic Graphs (DAGs) generated by the Reachability Engine, traditional list-based HTML UI components are fundamentally inadequate. Taskinator employs a custom visualization engine utilizing React 18 and D3.js.</w:t>
-      </w:r>
-    </w:p>
-    <w:p>
-      <w:pPr>
-        <w:spacing w:after="120" w:before="0"/>
-        <w:jc w:val="both"/>
-      </w:pPr>
-      <w:r>
-        <w:rPr>
-          <w:rFonts w:ascii="Times New Roman" w:cs="Times New Roman" w:eastAsia="Times New Roman" w:hAnsi="Times New Roman"/>
-          <w:sz w:val="22"/>
-          <w:szCs w:val="22"/>
-        </w:rPr>
-        <w:t xml:space="preserve">D3.js is utilized purely for its powerful mathematical layout algorithms (e.g., d3.hierarchy and d3.tree). However, unlike traditional D3 implementations that forcefully manipulate the DOM, Taskinator strictly delegates all DOM rendering to React. D3 calculates the (x, y) SVG coordinates of the tasks and the bezier curves of the linking edges in memory, and React maps over this data array to render pure SVG &lt;circle&gt; and &lt;path&gt; components.</w:t>
-      </w:r>
-    </w:p>
-    <w:p>
-      <w:pPr>
-        <w:spacing w:after="120" w:before="0"/>
-        <w:jc w:val="both"/>
-      </w:pPr>
-      <w:r>
-        <w:rPr>
-          <w:rFonts w:ascii="Times New Roman" w:cs="Times New Roman" w:eastAsia="Times New Roman" w:hAnsi="Times New Roman"/>
-          <w:sz w:val="22"/>
-          <w:szCs w:val="22"/>
-        </w:rPr>
-        <w:t xml:space="preserve">This hybrid approach prevents costly layout thrashing and allows React's Concurrent Mode to interrupt and prioritize rendering frames smoothly, even when displaying thousands of simultaneous SVG nodes.</w:t>
-      </w:r>
-    </w:p>
-    <w:p>
-      <w:pPr>
-        <w:pStyle w:val="Heading2"/>
-        <w:spacing w:after="180" w:before="280"/>
-      </w:pPr>
-      <w:r>
-        <w:rPr>
-          <w:rFonts w:ascii="Times New Roman" w:cs="Times New Roman" w:eastAsia="Times New Roman" w:hAnsi="Times New Roman"/>
-          <w:b/>
-          <w:bCs/>
-          <w:sz w:val="24"/>
-          <w:szCs w:val="24"/>
-        </w:rPr>
-        <w:t xml:space="preserve">5.2 Zero-Fan-Out Targeted Routing via Redis</w:t>
-      </w:r>
-    </w:p>
-    <w:p>
-      <w:pPr>
-        <w:spacing w:after="120" w:before="0"/>
-        <w:jc w:val="both"/>
-      </w:pPr>
-      <w:r>
-        <w:rPr>
-          <w:rFonts w:ascii="Times New Roman" w:cs="Times New Roman" w:eastAsia="Times New Roman" w:hAnsi="Times New Roman"/>
-          <w:sz w:val="22"/>
-          <w:szCs w:val="22"/>
-        </w:rPr>
-        <w:t xml:space="preserve">In standard real-time web architectures, the prevailing pattern for distributing events across a horizontally scaled cluster of backend instances is "Pub/Sub Fan-Out". If a user marks a task as complete, the server handling that request publishes the event to Redis, which blindly broadcasts it to every single Node.js instance in the cluster. Every instance then checks its local memory to see if it holds a WebSocket connection for a user who cares about that project.</w:t>
-      </w:r>
-    </w:p>
-    <w:p>
-      <w:pPr>
-        <w:spacing w:after="120" w:before="0"/>
-        <w:jc w:val="both"/>
-      </w:pPr>
-      <w:r>
-        <w:rPr>
-          <w:rFonts w:ascii="Times New Roman" w:cs="Times New Roman" w:eastAsia="Times New Roman" w:hAnsi="Times New Roman"/>
-          <w:sz w:val="22"/>
-          <w:szCs w:val="22"/>
-        </w:rPr>
-        <w:t xml:space="preserve">At 10,000 RPS, this creates an enormous volume of useless internal network traffic, essentially turning the internal Pub/Sub network into a localized Distributed Denial of Service (DDoS) attack. Taskinator implements a highly tuned Zero-Fan-Out Targeted Routing layer.</w:t>
+        <w:t xml:space="preserve">5.1 CTE-Based Atomic Authorization</w:t>
+      </w:r>
+    </w:p>
+    <w:p>
+      <w:pPr>
+        <w:spacing w:after="120" w:before="0"/>
+        <w:jc w:val="both"/>
+      </w:pPr>
+      <w:r>
+        <w:rPr>
+          <w:rFonts w:ascii="Times New Roman" w:cs="Times New Roman" w:eastAsia="Times New Roman" w:hAnsi="Times New Roman"/>
+          <w:sz w:val="22"/>
+          <w:szCs w:val="22"/>
+        </w:rPr>
+        <w:t xml:space="preserve">To avoid executing multiple sequential roundtrips to an external authorization service or executing separate SELECT permission verification queries before every single mutation, Taskinator bakes the Role-Based Access Control (RBAC) security matrix directly into the underlying SQL mutation utilizing Common Table Expressions (CTEs).</w:t>
       </w:r>
     </w:p>
     <w:p>
@@ -6783,7 +6984,7 @@
                 <w:sz w:val="20"/>
                 <w:szCs w:val="20"/>
               </w:rPr>
-              <w:t xml:space="preserve">[ Image Placeholder: Figure 5.1: Targeted Redis Routing for Real-time Server-Sent Events (SSE) ]</w:t>
+              <w:t xml:space="preserve">[ Image Placeholder: Figure 5.1: RBAC Authorization Flow ]</w:t>
             </w:r>
           </w:p>
         </w:tc>
@@ -6804,49 +7005,177 @@
           <w:sz w:val="20"/>
           <w:szCs w:val="20"/>
         </w:rPr>
-        <w:t xml:space="preserve">Figure 5.1: Targeted Redis Routing for Real-time Server-Sent Events (SSE)</w:t>
-      </w:r>
-    </w:p>
-    <w:p>
-      <w:pPr>
-        <w:spacing w:after="120" w:before="0"/>
-        <w:jc w:val="both"/>
-      </w:pPr>
-      <w:r>
-        <w:rPr>
-          <w:rFonts w:ascii="Times New Roman" w:cs="Times New Roman" w:eastAsia="Times New Roman" w:hAnsi="Times New Roman"/>
-          <w:sz w:val="22"/>
-          <w:szCs w:val="22"/>
-        </w:rPr>
-        <w:t xml:space="preserve">When a user opens the React frontend dashboard for Project X, their browser establishes an SSE connection with Node Instance 2. Instance 2 immediately registers this connection in Redis by executing a Set Add operation: SADD route:project:X "Instance2".</w:t>
-      </w:r>
-    </w:p>
-    <w:p>
-      <w:pPr>
-        <w:spacing w:after="120" w:before="0"/>
-        <w:jc w:val="both"/>
-      </w:pPr>
-      <w:r>
-        <w:rPr>
-          <w:rFonts w:ascii="Times New Roman" w:cs="Times New Roman" w:eastAsia="Times New Roman" w:hAnsi="Times New Roman"/>
-          <w:sz w:val="22"/>
-          <w:szCs w:val="22"/>
-        </w:rPr>
-        <w:t xml:space="preserve">When an asynchronous Kafka event occurs (e.g., a background worker completes a bulk task assignment for Project X), the Real-Time Router (a dedicated Kafka consumer module) executes a query to determine exactly where the interested clients are located: SMEMBERS route:project:X. Redis returns the specific array: ["Instance2"]. The Router then issues a highly targeted publish command explicitly to that instance's private channel: PUBLISH instance:Instance2 payload.</w:t>
-      </w:r>
-    </w:p>
-    <w:p>
-      <w:pPr>
-        <w:spacing w:after="120" w:before="0"/>
-        <w:jc w:val="both"/>
-      </w:pPr>
-      <w:r>
-        <w:rPr>
-          <w:rFonts w:ascii="Times New Roman" w:cs="Times New Roman" w:eastAsia="Times New Roman" w:hAnsi="Times New Roman"/>
-          <w:sz w:val="22"/>
-          <w:szCs w:val="22"/>
-        </w:rPr>
-        <w:t xml:space="preserve">If SMEMBERS returns an empty array, it means no users are currently viewing the project, and the Router drops the event instantly into the void. This architecture completely eliminates Fan-Out, reducing network traffic linearly relative to the number of active, observing connections rather than the total number of system instances.</w:t>
+        <w:t xml:space="preserve">Figure 5.1: RBAC Authorization Flow</w:t>
+      </w:r>
+    </w:p>
+    <w:p>
+      <w:pPr>
+        <w:pStyle w:val="Heading3"/>
+        <w:spacing w:after="120" w:before="200"/>
+      </w:pPr>
+      <w:r>
+        <w:rPr>
+          <w:rFonts w:ascii="Times New Roman" w:cs="Times New Roman" w:eastAsia="Times New Roman" w:hAnsi="Times New Roman"/>
+          <w:b/>
+          <w:bCs/>
+          <w:sz w:val="22"/>
+          <w:szCs w:val="22"/>
+        </w:rPr>
+        <w:t xml:space="preserve">5.1.1 The Single-Trip Security Paradigm</w:t>
+      </w:r>
+    </w:p>
+    <w:p>
+      <w:pPr>
+        <w:spacing w:after="120" w:before="0"/>
+        <w:jc w:val="both"/>
+      </w:pPr>
+      <w:r>
+        <w:rPr>
+          <w:rFonts w:ascii="Times New Roman" w:cs="Times New Roman" w:eastAsia="Times New Roman" w:hAnsi="Times New Roman"/>
+          <w:sz w:val="22"/>
+          <w:szCs w:val="22"/>
+        </w:rPr>
+        <w:t xml:space="preserve">Traditional monolithic APIs often utilize a middleware approach: a request arrives, the middleware pauses execution, queries the database to verify if the user's ID exists in the project_member mapping table, waits for the boolean result, and then either rejects the request or allows the controller to proceed with the mutation.</w:t>
+      </w:r>
+    </w:p>
+    <w:p>
+      <w:pPr>
+        <w:spacing w:after="120" w:before="0"/>
+        <w:jc w:val="both"/>
+      </w:pPr>
+      <w:r>
+        <w:rPr>
+          <w:rFonts w:ascii="Times New Roman" w:cs="Times New Roman" w:eastAsia="Times New Roman" w:hAnsi="Times New Roman"/>
+          <w:sz w:val="22"/>
+          <w:szCs w:val="22"/>
+        </w:rPr>
+        <w:t xml:space="preserve">At 10,000 RPS, this doubling of query volume (one for auth, one for mutation) halves the effective capacity of the database connection pool. Taskinator implements Single-Trip Atomic Security:</w:t>
+      </w:r>
+    </w:p>
+    <w:p>
+      <w:pPr>
+        <w:spacing w:after="0" w:before="120"/>
+        <w:ind w:left="720"/>
+      </w:pPr>
+      <w:r>
+        <w:rPr>
+          <w:rFonts w:ascii="Courier New" w:cs="Courier New" w:eastAsia="Courier New" w:hAnsi="Courier New"/>
+          <w:sz w:val="20"/>
+          <w:szCs w:val="20"/>
+        </w:rPr>
+        <w:t xml:space="preserve">WITH auth_check AS (</w:t>
+      </w:r>
+    </w:p>
+    <w:p>
+      <w:pPr>
+        <w:spacing w:after="0" w:before="0"/>
+        <w:ind w:left="720"/>
+      </w:pPr>
+      <w:r>
+        <w:rPr>
+          <w:rFonts w:ascii="Courier New" w:cs="Courier New" w:eastAsia="Courier New" w:hAnsi="Courier New"/>
+          <w:sz w:val="20"/>
+          <w:szCs w:val="20"/>
+        </w:rPr>
+        <w:t xml:space="preserve">    SELECT 1 FROM project_member</w:t>
+      </w:r>
+    </w:p>
+    <w:p>
+      <w:pPr>
+        <w:spacing w:after="0" w:before="0"/>
+        <w:ind w:left="720"/>
+      </w:pPr>
+      <w:r>
+        <w:rPr>
+          <w:rFonts w:ascii="Courier New" w:cs="Courier New" w:eastAsia="Courier New" w:hAnsi="Courier New"/>
+          <w:sz w:val="20"/>
+          <w:szCs w:val="20"/>
+        </w:rPr>
+        <w:t xml:space="preserve">    WHERE fk_project_id = $1 AND fk_user_id = $2</w:t>
+      </w:r>
+    </w:p>
+    <w:p>
+      <w:pPr>
+        <w:spacing w:after="0" w:before="0"/>
+        <w:ind w:left="720"/>
+      </w:pPr>
+      <w:r>
+        <w:rPr>
+          <w:rFonts w:ascii="Courier New" w:cs="Courier New" w:eastAsia="Courier New" w:hAnsi="Courier New"/>
+          <w:sz w:val="20"/>
+          <w:szCs w:val="20"/>
+        </w:rPr>
+        <w:t xml:space="preserve">    AND role IN ('OWNER', 'ADMIN', 'EDITOR')</w:t>
+      </w:r>
+    </w:p>
+    <w:p>
+      <w:pPr>
+        <w:spacing w:after="0" w:before="0"/>
+        <w:ind w:left="720"/>
+      </w:pPr>
+      <w:r>
+        <w:rPr>
+          <w:rFonts w:ascii="Courier New" w:cs="Courier New" w:eastAsia="Courier New" w:hAnsi="Courier New"/>
+          <w:sz w:val="20"/>
+          <w:szCs w:val="20"/>
+        </w:rPr>
+        <w:t xml:space="preserve">)</w:t>
+      </w:r>
+    </w:p>
+    <w:p>
+      <w:pPr>
+        <w:spacing w:after="0" w:before="0"/>
+        <w:ind w:left="720"/>
+      </w:pPr>
+      <w:r>
+        <w:rPr>
+          <w:rFonts w:ascii="Courier New" w:cs="Courier New" w:eastAsia="Courier New" w:hAnsi="Courier New"/>
+          <w:sz w:val="20"/>
+          <w:szCs w:val="20"/>
+        </w:rPr>
+        <w:t xml:space="preserve">UPDATE project_task SET title = $3</w:t>
+      </w:r>
+    </w:p>
+    <w:p>
+      <w:pPr>
+        <w:spacing w:after="0" w:before="0"/>
+        <w:ind w:left="720"/>
+      </w:pPr>
+      <w:r>
+        <w:rPr>
+          <w:rFonts w:ascii="Courier New" w:cs="Courier New" w:eastAsia="Courier New" w:hAnsi="Courier New"/>
+          <w:sz w:val="20"/>
+          <w:szCs w:val="20"/>
+        </w:rPr>
+        <w:t xml:space="preserve">WHERE id = $4 AND EXISTS (SELECT 1 FROM auth_check)</w:t>
+      </w:r>
+    </w:p>
+    <w:p>
+      <w:pPr>
+        <w:spacing w:after="120" w:before="0"/>
+        <w:ind w:left="720"/>
+      </w:pPr>
+      <w:r>
+        <w:rPr>
+          <w:rFonts w:ascii="Courier New" w:cs="Courier New" w:eastAsia="Courier New" w:hAnsi="Courier New"/>
+          <w:sz w:val="20"/>
+          <w:szCs w:val="20"/>
+        </w:rPr>
+        <w:t xml:space="preserve">RETURNING *;</w:t>
+      </w:r>
+    </w:p>
+    <w:p>
+      <w:pPr>
+        <w:spacing w:after="120" w:before="0"/>
+        <w:jc w:val="both"/>
+      </w:pPr>
+      <w:r>
+        <w:rPr>
+          <w:rFonts w:ascii="Times New Roman" w:cs="Times New Roman" w:eastAsia="Times New Roman" w:hAnsi="Times New Roman"/>
+          <w:sz w:val="22"/>
+          <w:szCs w:val="22"/>
+        </w:rPr>
+        <w:t xml:space="preserve">The query execution planner evaluates the EXISTS clause first. If the user lacks the necessary hierarchical permissions, the CTE returns empty, the EXISTS clause evaluates to FALSE, and the UPDATE statement is safely and silently aborted at the engine level without locking the target row. The database immediately returns 0 affected rows to the Node.js API, which translates this into an HTTP 403 Forbidden or 404 Not Found response, obscuring the exact failure reason from potential attackers to prevent enumeration vectors.</w:t>
       </w:r>
     </w:p>
     <w:p>
@@ -6862,21 +7191,158 @@
           <w:sz w:val="24"/>
           <w:szCs w:val="24"/>
         </w:rPr>
-        <w:t xml:space="preserve">5.3 Apollo Client Cache Reconciliation</w:t>
-      </w:r>
-    </w:p>
-    <w:p>
-      <w:pPr>
-        <w:spacing w:after="120" w:before="0"/>
-        <w:jc w:val="both"/>
-      </w:pPr>
-      <w:r>
-        <w:rPr>
-          <w:rFonts w:ascii="Times New Roman" w:cs="Times New Roman" w:eastAsia="Times New Roman" w:hAnsi="Times New Roman"/>
-          <w:sz w:val="22"/>
-          <w:szCs w:val="22"/>
-        </w:rPr>
-        <w:t xml:space="preserve">When the targeted SSE payload arrives at the browser (e.g., { id: "Task:123", status: "DONE" }), the client must process it without triggering a network refetch.</w:t>
+        <w:t xml:space="preserve">5.2 Team Hierarchy and Inheritance</w:t>
+      </w:r>
+    </w:p>
+    <w:p>
+      <w:pPr>
+        <w:spacing w:after="120" w:before="0"/>
+        <w:jc w:val="both"/>
+      </w:pPr>
+      <w:r>
+        <w:rPr>
+          <w:rFonts w:ascii="Times New Roman" w:cs="Times New Roman" w:eastAsia="Times New Roman" w:hAnsi="Times New Roman"/>
+          <w:sz w:val="22"/>
+          <w:szCs w:val="22"/>
+        </w:rPr>
+        <w:t xml:space="preserve">Enterprise organizations rarely operate flat lists of users. Access control is typically managed via nested hierarchies: a Global Admin team contains the Engineering team, which contains the Frontend sub-team. If a project is assigned to the Engineering team, all members of the Frontend sub-team must automatically inherit access.</w:t>
+      </w:r>
+    </w:p>
+    <w:p>
+      <w:pPr>
+        <w:spacing w:after="120" w:before="0"/>
+        <w:jc w:val="both"/>
+      </w:pPr>
+      <w:r>
+        <w:rPr>
+          <w:rFonts w:ascii="Times New Roman" w:cs="Times New Roman" w:eastAsia="Times New Roman" w:hAnsi="Times New Roman"/>
+          <w:sz w:val="22"/>
+          <w:szCs w:val="22"/>
+        </w:rPr>
+        <w:t xml:space="preserve">This introduces a complex challenge for the CTE-based authorization model, as determining inherited membership requires calculating paths through a Directed Acyclic Graph (DAG) of teams during the mutation.</w:t>
+      </w:r>
+    </w:p>
+    <w:p>
+      <w:pPr>
+        <w:pStyle w:val="Heading3"/>
+        <w:spacing w:after="120" w:before="200"/>
+      </w:pPr>
+      <w:r>
+        <w:rPr>
+          <w:rFonts w:ascii="Times New Roman" w:cs="Times New Roman" w:eastAsia="Times New Roman" w:hAnsi="Times New Roman"/>
+          <w:b/>
+          <w:bCs/>
+          <w:sz w:val="22"/>
+          <w:szCs w:val="22"/>
+        </w:rPr>
+        <w:t xml:space="preserve">5.2.1 Team Closure Tables</w:t>
+      </w:r>
+    </w:p>
+    <w:p>
+      <w:pPr>
+        <w:spacing w:after="120" w:before="0"/>
+        <w:jc w:val="both"/>
+      </w:pPr>
+      <w:r>
+        <w:rPr>
+          <w:rFonts w:ascii="Times New Roman" w:cs="Times New Roman" w:eastAsia="Times New Roman" w:hAnsi="Times New Roman"/>
+          <w:sz w:val="22"/>
+          <w:szCs w:val="22"/>
+        </w:rPr>
+        <w:t xml:space="preserve">To support instant O(1) inheritance checks, Taskinator applies the Custom Closure Table pattern not just to the tasks, but also to the Team organizational structures. A team_reachability table explicitly stores every mathematical path from an ancestor team to all descendant sub-teams.</w:t>
+      </w:r>
+    </w:p>
+    <w:p>
+      <w:pPr>
+        <w:spacing w:after="120" w:before="0"/>
+        <w:jc w:val="both"/>
+      </w:pPr>
+      <w:r>
+        <w:rPr>
+          <w:rFonts w:ascii="Times New Roman" w:cs="Times New Roman" w:eastAsia="Times New Roman" w:hAnsi="Times New Roman"/>
+          <w:sz w:val="22"/>
+          <w:szCs w:val="22"/>
+        </w:rPr>
+        <w:t xml:space="preserve">When the aforementioned auth_check CTE executes, it does not merely check if the user is a direct member of the project. It executes a highly optimized JOIN against the team_reachability index to determine if the user belongs to ANY team that is mathematically deemed a descendant of the team assigned to the project.</w:t>
+      </w:r>
+    </w:p>
+    <w:p>
+      <w:pPr>
+        <w:spacing w:after="120" w:before="0"/>
+        <w:jc w:val="both"/>
+      </w:pPr>
+      <w:r>
+        <w:rPr>
+          <w:rFonts w:ascii="Times New Roman" w:cs="Times New Roman" w:eastAsia="Times New Roman" w:hAnsi="Times New Roman"/>
+          <w:sz w:val="22"/>
+          <w:szCs w:val="22"/>
+        </w:rPr>
+        <w:t xml:space="preserve">Because the reachability matrix is calculated asynchronously via Kafka during team restructuring events, the read-path mutation query remains blazingly fast. This architectural decision ensures that even in organizations with thousands of deeply nested sub-teams, the authorization overhead remains constant, completely circumventing the catastrophic performance degradation associated with runtime recursive traversals.</w:t>
+      </w:r>
+    </w:p>
+    <w:p>
+      <w:r>
+        <w:br w:type="page"/>
+      </w:r>
+    </w:p>
+    <w:p>
+      <w:pPr>
+        <w:pStyle w:val="Heading1"/>
+        <w:spacing w:after="240" w:before="360"/>
+      </w:pPr>
+      <w:r>
+        <w:rPr>
+          <w:rFonts w:ascii="Times New Roman" w:cs="Times New Roman" w:eastAsia="Times New Roman" w:hAnsi="Times New Roman"/>
+          <w:b/>
+          <w:bCs/>
+          <w:sz w:val="28"/>
+          <w:szCs w:val="28"/>
+        </w:rPr>
+        <w:t xml:space="preserve">6. FRONTEND ARCHITECTURE AND REAL-TIME SYNCHRONIZATION</w:t>
+      </w:r>
+    </w:p>
+    <w:p>
+      <w:pPr>
+        <w:spacing w:after="120" w:before="0"/>
+        <w:jc w:val="both"/>
+      </w:pPr>
+      <w:r>
+        <w:rPr>
+          <w:rFonts w:ascii="Times New Roman" w:cs="Times New Roman" w:eastAsia="Times New Roman" w:hAnsi="Times New Roman"/>
+          <w:sz w:val="22"/>
+          <w:szCs w:val="22"/>
+        </w:rPr>
+        <w:t xml:space="preserve">Pushing data to the client efficiently is only half the battle in a real-time collaborative system. If the client simply triggers a full-page data refetch upon receiving a Server-Sent Event (SSE) payload, the backend database will be instantly overwhelmed by redundant read queries, defeating the purpose of the Event-Driven Architecture entirely. Taskinator's frontend is engineered to surgically inject updates directly into the in-memory cache, achieving O(1) rendering complexity.</w:t>
+      </w:r>
+    </w:p>
+    <w:p>
+      <w:pPr>
+        <w:pStyle w:val="Heading2"/>
+        <w:spacing w:after="180" w:before="280"/>
+      </w:pPr>
+      <w:r>
+        <w:rPr>
+          <w:rFonts w:ascii="Times New Roman" w:cs="Times New Roman" w:eastAsia="Times New Roman" w:hAnsi="Times New Roman"/>
+          <w:b/>
+          <w:bCs/>
+          <w:sz w:val="24"/>
+          <w:szCs w:val="24"/>
+        </w:rPr>
+        <w:t xml:space="preserve">6.1 The React Task Graph and D3.js Visualization</w:t>
+      </w:r>
+    </w:p>
+    <w:p>
+      <w:pPr>
+        <w:spacing w:after="120" w:before="0"/>
+        <w:jc w:val="both"/>
+      </w:pPr>
+      <w:r>
+        <w:rPr>
+          <w:rFonts w:ascii="Times New Roman" w:cs="Times New Roman" w:eastAsia="Times New Roman" w:hAnsi="Times New Roman"/>
+          <w:sz w:val="22"/>
+          <w:szCs w:val="22"/>
+        </w:rPr>
+        <w:t xml:space="preserve">To represent the deeply nested Directed Acyclic Graphs (DAGs) generated by the Reachability Engine, traditional list-based HTML UI components are fundamentally inadequate. Complex multi-parent dependencies require spatial visualization. Taskinator employs a custom visualization engine utilizing React 18 and D3.js.</w:t>
       </w:r>
     </w:p>
     <w:p>
@@ -6934,7 +7400,7 @@
                 <w:sz w:val="20"/>
                 <w:szCs w:val="20"/>
               </w:rPr>
-              <w:t xml:space="preserve">[ Image Placeholder: Figure 5.2: Apollo Client SSE State Reconciliation Sequence ]</w:t>
+              <w:t xml:space="preserve">[ Image Placeholder: Figure 6.1: Frontend UI State Machine ]</w:t>
             </w:r>
           </w:p>
         </w:tc>
@@ -6955,182 +7421,49 @@
           <w:sz w:val="20"/>
           <w:szCs w:val="20"/>
         </w:rPr>
-        <w:t xml:space="preserve">Figure 5.2: Apollo Client SSE State Reconciliation Sequence</w:t>
-      </w:r>
-    </w:p>
-    <w:p>
-      <w:pPr>
-        <w:spacing w:after="120" w:before="0"/>
-        <w:jc w:val="both"/>
-      </w:pPr>
-      <w:r>
-        <w:rPr>
-          <w:rFonts w:ascii="Times New Roman" w:cs="Times New Roman" w:eastAsia="Times New Roman" w:hAnsi="Times New Roman"/>
-          <w:sz w:val="22"/>
-          <w:szCs w:val="22"/>
-        </w:rPr>
-        <w:t xml:space="preserve">Taskinator hooks the SSE stream directly into the Apollo GraphQL Link architecture. Apollo maintains a highly normalized, flat, in-memory cache mapping unique IDs to object fields. Upon receiving the payload, the client executes the cache.modify method. This method surgically locates the specific object in the cache (e.g., Task:123) and injects the delta mutation directly into memory.</w:t>
-      </w:r>
-    </w:p>
-    <w:p>
-      <w:pPr>
-        <w:spacing w:after="0" w:before="120"/>
-        <w:ind w:left="720"/>
-      </w:pPr>
-      <w:r>
-        <w:rPr>
-          <w:rFonts w:ascii="Courier New" w:cs="Courier New" w:eastAsia="Courier New" w:hAnsi="Courier New"/>
-          <w:sz w:val="20"/>
-          <w:szCs w:val="20"/>
-        </w:rPr>
-        <w:t xml:space="preserve">// Apollo Cache Modification Snippet</w:t>
-      </w:r>
-    </w:p>
-    <w:p>
-      <w:pPr>
-        <w:spacing w:after="0" w:before="0"/>
-        <w:ind w:left="720"/>
-      </w:pPr>
-      <w:r>
-        <w:rPr>
-          <w:rFonts w:ascii="Courier New" w:cs="Courier New" w:eastAsia="Courier New" w:hAnsi="Courier New"/>
-          <w:sz w:val="20"/>
-          <w:szCs w:val="20"/>
-        </w:rPr>
-        <w:t xml:space="preserve">apolloClient.cache.modify({</w:t>
-      </w:r>
-    </w:p>
-    <w:p>
-      <w:pPr>
-        <w:spacing w:after="0" w:before="0"/>
-        <w:ind w:left="720"/>
-      </w:pPr>
-      <w:r>
-        <w:rPr>
-          <w:rFonts w:ascii="Courier New" w:cs="Courier New" w:eastAsia="Courier New" w:hAnsi="Courier New"/>
-          <w:sz w:val="20"/>
-          <w:szCs w:val="20"/>
-        </w:rPr>
-        <w:t xml:space="preserve">  id: apolloClient.cache.identify({ __typename: 'Task', id: event.id }),</w:t>
-      </w:r>
-    </w:p>
-    <w:p>
-      <w:pPr>
-        <w:spacing w:after="0" w:before="0"/>
-        <w:ind w:left="720"/>
-      </w:pPr>
-      <w:r>
-        <w:rPr>
-          <w:rFonts w:ascii="Courier New" w:cs="Courier New" w:eastAsia="Courier New" w:hAnsi="Courier New"/>
-          <w:sz w:val="20"/>
-          <w:szCs w:val="20"/>
-        </w:rPr>
-        <w:t xml:space="preserve">  fields: {</w:t>
-      </w:r>
-    </w:p>
-    <w:p>
-      <w:pPr>
-        <w:spacing w:after="0" w:before="0"/>
-        <w:ind w:left="720"/>
-      </w:pPr>
-      <w:r>
-        <w:rPr>
-          <w:rFonts w:ascii="Courier New" w:cs="Courier New" w:eastAsia="Courier New" w:hAnsi="Courier New"/>
-          <w:sz w:val="20"/>
-          <w:szCs w:val="20"/>
-        </w:rPr>
-        <w:t xml:space="preserve">    status() {</w:t>
-      </w:r>
-    </w:p>
-    <w:p>
-      <w:pPr>
-        <w:spacing w:after="0" w:before="0"/>
-        <w:ind w:left="720"/>
-      </w:pPr>
-      <w:r>
-        <w:rPr>
-          <w:rFonts w:ascii="Courier New" w:cs="Courier New" w:eastAsia="Courier New" w:hAnsi="Courier New"/>
-          <w:sz w:val="20"/>
-          <w:szCs w:val="20"/>
-        </w:rPr>
-        <w:t xml:space="preserve">      return event.status; // Inject the new status without a network request</w:t>
-      </w:r>
-    </w:p>
-    <w:p>
-      <w:pPr>
-        <w:spacing w:after="0" w:before="0"/>
-        <w:ind w:left="720"/>
-      </w:pPr>
-      <w:r>
-        <w:rPr>
-          <w:rFonts w:ascii="Courier New" w:cs="Courier New" w:eastAsia="Courier New" w:hAnsi="Courier New"/>
-          <w:sz w:val="20"/>
-          <w:szCs w:val="20"/>
-        </w:rPr>
-        <w:t xml:space="preserve">    }</w:t>
-      </w:r>
-    </w:p>
-    <w:p>
-      <w:pPr>
-        <w:spacing w:after="0" w:before="0"/>
-        <w:ind w:left="720"/>
-      </w:pPr>
-      <w:r>
-        <w:rPr>
-          <w:rFonts w:ascii="Courier New" w:cs="Courier New" w:eastAsia="Courier New" w:hAnsi="Courier New"/>
-          <w:sz w:val="20"/>
-          <w:szCs w:val="20"/>
-        </w:rPr>
-        <w:t xml:space="preserve">  }</w:t>
-      </w:r>
-    </w:p>
-    <w:p>
-      <w:pPr>
-        <w:spacing w:after="120" w:before="0"/>
-        <w:ind w:left="720"/>
-      </w:pPr>
-      <w:r>
-        <w:rPr>
-          <w:rFonts w:ascii="Courier New" w:cs="Courier New" w:eastAsia="Courier New" w:hAnsi="Courier New"/>
-          <w:sz w:val="20"/>
-          <w:szCs w:val="20"/>
-        </w:rPr>
-        <w:t xml:space="preserve">});</w:t>
-      </w:r>
-    </w:p>
-    <w:p>
-      <w:pPr>
-        <w:spacing w:after="120" w:before="0"/>
-        <w:jc w:val="both"/>
-      </w:pPr>
-      <w:r>
-        <w:rPr>
-          <w:rFonts w:ascii="Times New Roman" w:cs="Times New Roman" w:eastAsia="Times New Roman" w:hAnsi="Times New Roman"/>
-          <w:sz w:val="22"/>
-          <w:szCs w:val="22"/>
-        </w:rPr>
-        <w:t xml:space="preserve">Because React components are bound to specific cached references via useQuery or useFragment, React instantly detects the specific node change and triggers a granular, localized re-render of only that specific Task UI component. This preserves O(1) rendering performance on the client device, preventing complete screen freezes or layout thrashing.</w:t>
-      </w:r>
-    </w:p>
-    <w:p>
-      <w:r>
-        <w:br w:type="page"/>
-      </w:r>
-    </w:p>
-    <w:p>
-      <w:pPr>
-        <w:pStyle w:val="Heading1"/>
-        <w:spacing w:after="240" w:before="360"/>
-      </w:pPr>
-      <w:r>
-        <w:rPr>
-          <w:rFonts w:ascii="Times New Roman" w:cs="Times New Roman" w:eastAsia="Times New Roman" w:hAnsi="Times New Roman"/>
-          <w:b/>
-          <w:bCs/>
-          <w:sz w:val="28"/>
-          <w:szCs w:val="28"/>
-        </w:rPr>
-        <w:t xml:space="preserve">6. IMPLEMENTATION, AUTOMATION, AND TESTING</w:t>
+        <w:t xml:space="preserve">Figure 6.1: Frontend UI State Machine</w:t>
+      </w:r>
+    </w:p>
+    <w:p>
+      <w:pPr>
+        <w:spacing w:after="120" w:before="0"/>
+        <w:jc w:val="both"/>
+      </w:pPr>
+      <w:r>
+        <w:rPr>
+          <w:rFonts w:ascii="Times New Roman" w:cs="Times New Roman" w:eastAsia="Times New Roman" w:hAnsi="Times New Roman"/>
+          <w:sz w:val="22"/>
+          <w:szCs w:val="22"/>
+        </w:rPr>
+        <w:t xml:space="preserve">D3.js is universally recognized for its powerful mathematical layout algorithms (e.g., d3.hierarchy, d3.dag, and d3.tree). However, traditional D3 implementations forcefully mutate the Document Object Model (DOM) directly, competing with React's virtual DOM reconciliation cycle and causing severe layout thrashing.</w:t>
+      </w:r>
+    </w:p>
+    <w:p>
+      <w:pPr>
+        <w:spacing w:after="120" w:before="0"/>
+        <w:jc w:val="both"/>
+      </w:pPr>
+      <w:r>
+        <w:rPr>
+          <w:rFonts w:ascii="Times New Roman" w:cs="Times New Roman" w:eastAsia="Times New Roman" w:hAnsi="Times New Roman"/>
+          <w:sz w:val="22"/>
+          <w:szCs w:val="22"/>
+        </w:rPr>
+        <w:t xml:space="preserve">Taskinator strictly delegates all DOM rendering exclusively to React. D3 is relegated to a pure mathematical calculation role. It calculates the absolute (x, y) SVG coordinates of the individual task nodes and computes the complex bezier curves for the linking edges purely in memory. React then consumes this structured data array, mapping over it to rapidly render pure, declarative SVG &lt;circle&gt; and &lt;path&gt; components.</w:t>
+      </w:r>
+    </w:p>
+    <w:p>
+      <w:pPr>
+        <w:spacing w:after="120" w:before="0"/>
+        <w:jc w:val="both"/>
+      </w:pPr>
+      <w:r>
+        <w:rPr>
+          <w:rFonts w:ascii="Times New Roman" w:cs="Times New Roman" w:eastAsia="Times New Roman" w:hAnsi="Times New Roman"/>
+          <w:sz w:val="22"/>
+          <w:szCs w:val="22"/>
+        </w:rPr>
+        <w:t xml:space="preserve">This hybrid approach prevents costly browser layout reflows and allows React's Concurrent Mode to interrupt and prioritize rendering frames smoothly, guaranteeing a consistent 60 Frames Per Second (FPS) visual experience even when manipulating and panning across a canvas containing thousands of simultaneous SVG nodes.</w:t>
       </w:r>
     </w:p>
     <w:p>
@@ -7146,21 +7479,35 @@
           <w:sz w:val="24"/>
           <w:szCs w:val="24"/>
         </w:rPr>
-        <w:t xml:space="preserve">6.1 Automation and Trigger Engine</w:t>
-      </w:r>
-    </w:p>
-    <w:p>
-      <w:pPr>
-        <w:spacing w:after="120" w:before="0"/>
-        <w:jc w:val="both"/>
-      </w:pPr>
-      <w:r>
-        <w:rPr>
-          <w:rFonts w:ascii="Times New Roman" w:cs="Times New Roman" w:eastAsia="Times New Roman" w:hAnsi="Times New Roman"/>
-          <w:sz w:val="22"/>
-          <w:szCs w:val="22"/>
-        </w:rPr>
-        <w:t xml:space="preserve">Beyond standard CRUD operations, enterprise systems must support dynamic workflows. Taskinator implements a robust project-scoped Automation Engine utilizing an "IF-THEN-CLEANUP" deterministic mental model.</w:t>
+        <w:t xml:space="preserve">6.2 Zero-Fan-Out Targeted Routing via Redis</w:t>
+      </w:r>
+    </w:p>
+    <w:p>
+      <w:pPr>
+        <w:spacing w:after="120" w:before="0"/>
+        <w:jc w:val="both"/>
+      </w:pPr>
+      <w:r>
+        <w:rPr>
+          <w:rFonts w:ascii="Times New Roman" w:cs="Times New Roman" w:eastAsia="Times New Roman" w:hAnsi="Times New Roman"/>
+          <w:sz w:val="22"/>
+          <w:szCs w:val="22"/>
+        </w:rPr>
+        <w:t xml:space="preserve">In standard real-time web architectures, the prevailing pattern for distributing events across a horizontally scaled cluster of backend nodes is "Pub/Sub Fan-Out" (typically implemented via a naive Redis PUBLISH). If a user marks a task as complete, the server handling that request publishes the event to Redis, which blindly broadcasts it to every single Node.js instance in the cluster. Every instance then checks its local memory to see if it holds a WebSocket connection for a user who cares about that project.</w:t>
+      </w:r>
+    </w:p>
+    <w:p>
+      <w:pPr>
+        <w:spacing w:after="120" w:before="0"/>
+        <w:jc w:val="both"/>
+      </w:pPr>
+      <w:r>
+        <w:rPr>
+          <w:rFonts w:ascii="Times New Roman" w:cs="Times New Roman" w:eastAsia="Times New Roman" w:hAnsi="Times New Roman"/>
+          <w:sz w:val="22"/>
+          <w:szCs w:val="22"/>
+        </w:rPr>
+        <w:t xml:space="preserve">At 10,000 RPS, this creates an enormous volume of useless internal network traffic, essentially turning the internal Pub/Sub network into a localized Distributed Denial of Service (DDoS) attack. A single event is multiplied across 50 pods, forcing 49 of them to process and instantly discard the payload.</w:t>
       </w:r>
     </w:p>
     <w:p>
@@ -7218,7 +7565,7 @@
                 <w:sz w:val="20"/>
                 <w:szCs w:val="20"/>
               </w:rPr>
-              <w:t xml:space="preserve">[ Image Placeholder: Figure 6.1: Automation Trigger Engine and System Actor Flow ]</w:t>
+              <w:t xml:space="preserve">[ Image Placeholder: Figure 6.2: Targeted Redis Routing for Real-time Server-Sent Events (SSE) ]</w:t>
             </w:r>
           </w:p>
         </w:tc>
@@ -7239,123 +7586,63 @@
           <w:sz w:val="20"/>
           <w:szCs w:val="20"/>
         </w:rPr>
-        <w:t xml:space="preserve">Figure 6.1: Automation Trigger Engine and System Actor Flow</w:t>
-      </w:r>
-    </w:p>
-    <w:p>
-      <w:pPr>
-        <w:spacing w:after="120" w:before="0"/>
-        <w:jc w:val="both"/>
-      </w:pPr>
-      <w:r>
-        <w:rPr>
-          <w:rFonts w:ascii="Times New Roman" w:cs="Times New Roman" w:eastAsia="Times New Roman" w:hAnsi="Times New Roman"/>
-          <w:sz w:val="22"/>
-          <w:szCs w:val="22"/>
-        </w:rPr>
-        <w:t xml:space="preserve">The automation system reacts natively to domain events residing in Kafka (e.g., "A task is marked complete"). It utilizes asynchronous processing with a rolling state machine. To ensure system stability and operational traceability, the engine implements the following strict rules:</w:t>
-      </w:r>
-    </w:p>
-    <w:p>
-      <w:pPr>
-        <w:pStyle w:val="ListParagraph"/>
-        <w:numPr>
-          <w:ilvl w:val="0"/>
-          <w:numId w:val="10"/>
-        </w:numPr>
-        <w:spacing w:after="80" w:before="0"/>
-      </w:pPr>
-      <w:r>
-        <w:rPr>
-          <w:rFonts w:ascii="Times New Roman" w:cs="Times New Roman" w:eastAsia="Times New Roman" w:hAnsi="Times New Roman"/>
-          <w:b/>
-          <w:bCs/>
-          <w:i w:val="false"/>
-          <w:iCs w:val="false"/>
-          <w:sz w:val="22"/>
-          <w:szCs w:val="22"/>
-        </w:rPr>
-        <w:t xml:space="preserve">Correlation IDs: </w:t>
-      </w:r>
-      <w:r>
-        <w:rPr>
-          <w:rFonts w:ascii="Times New Roman" w:cs="Times New Roman" w:eastAsia="Times New Roman" w:hAnsi="Times New Roman"/>
-          <w:b w:val="false"/>
-          <w:bCs w:val="false"/>
-          <w:i w:val="false"/>
-          <w:iCs w:val="false"/>
-          <w:sz w:val="22"/>
-          <w:szCs w:val="22"/>
-        </w:rPr>
-        <w:t xml:space="preserve">Every triggered automation carries a globally unique Correlation ID linking it back to the exact user HTTP request that initiated the cascade. This ensures trace logs can be grouped and analyzed effectively across distributed microservices.</w:t>
-      </w:r>
-    </w:p>
-    <w:p>
-      <w:pPr>
-        <w:pStyle w:val="ListParagraph"/>
-        <w:numPr>
-          <w:ilvl w:val="0"/>
-          <w:numId w:val="10"/>
-        </w:numPr>
-        <w:spacing w:after="80" w:before="0"/>
-      </w:pPr>
-      <w:r>
-        <w:rPr>
-          <w:rFonts w:ascii="Times New Roman" w:cs="Times New Roman" w:eastAsia="Times New Roman" w:hAnsi="Times New Roman"/>
-          <w:b/>
-          <w:bCs/>
-          <w:i w:val="false"/>
-          <w:iCs w:val="false"/>
-          <w:sz w:val="22"/>
-          <w:szCs w:val="22"/>
-        </w:rPr>
-        <w:t xml:space="preserve">System Actor Isolation: </w:t>
-      </w:r>
-      <w:r>
-        <w:rPr>
-          <w:rFonts w:ascii="Times New Roman" w:cs="Times New Roman" w:eastAsia="Times New Roman" w:hAnsi="Times New Roman"/>
-          <w:b w:val="false"/>
-          <w:bCs w:val="false"/>
-          <w:i w:val="false"/>
-          <w:iCs w:val="false"/>
-          <w:sz w:val="22"/>
-          <w:szCs w:val="22"/>
-        </w:rPr>
-        <w:t xml:space="preserve">Automations explicitly execute under a specific SYSTEM user identity, bypassing standard user RBAC checks but enforcing domain boundary constraints. Crucially, the system possesses hard code-level gates that actively prevent consumers from reacting to events generated by the SYSTEM actor itself unless explicitly whitelisted. This circuit-breaker pattern completely eliminates the catastrophic risk of infinite recursive automation loops (e.g., Rule A triggers Rule B, which triggers Rule A ad infinitum).</w:t>
-      </w:r>
-    </w:p>
-    <w:p>
-      <w:pPr>
-        <w:pStyle w:val="ListParagraph"/>
-        <w:numPr>
-          <w:ilvl w:val="0"/>
-          <w:numId w:val="10"/>
-        </w:numPr>
-        <w:spacing w:after="80" w:before="0"/>
-      </w:pPr>
-      <w:r>
-        <w:rPr>
-          <w:rFonts w:ascii="Times New Roman" w:cs="Times New Roman" w:eastAsia="Times New Roman" w:hAnsi="Times New Roman"/>
-          <w:b/>
-          <w:bCs/>
-          <w:i w:val="false"/>
-          <w:iCs w:val="false"/>
-          <w:sz w:val="22"/>
-          <w:szCs w:val="22"/>
-        </w:rPr>
-        <w:t xml:space="preserve">Parent Guard Triggers: </w:t>
-      </w:r>
-      <w:r>
-        <w:rPr>
-          <w:rFonts w:ascii="Times New Roman" w:cs="Times New Roman" w:eastAsia="Times New Roman" w:hAnsi="Times New Roman"/>
-          <w:b w:val="false"/>
-          <w:bCs w:val="false"/>
-          <w:i w:val="false"/>
-          <w:iCs w:val="false"/>
-          <w:sz w:val="22"/>
-          <w:szCs w:val="22"/>
-        </w:rPr>
-        <w:t xml:space="preserve">The engine enforces strict mathematical domain rules without bloating the primary API endpoint. For example, a "Parent Guard Trigger" actively prevents a Parent Task from entering the 'DONE' status if any of its descendants are currently in the 'TODO' status. If a user attempts to bypass this via the API, the database allows the optimistic write, but the trigger engine immediately catches the event in Kafka, reverts the task status in the database, and emits an explanatory Server-Sent Event (SSE) notification back to the user's browser, explaining the policy violation.</w:t>
+        <w:t xml:space="preserve">Figure 6.2: Targeted Redis Routing for Real-time Server-Sent Events (SSE)</w:t>
+      </w:r>
+    </w:p>
+    <w:p>
+      <w:pPr>
+        <w:spacing w:after="120" w:before="0"/>
+        <w:jc w:val="both"/>
+      </w:pPr>
+      <w:r>
+        <w:rPr>
+          <w:rFonts w:ascii="Times New Roman" w:cs="Times New Roman" w:eastAsia="Times New Roman" w:hAnsi="Times New Roman"/>
+          <w:sz w:val="22"/>
+          <w:szCs w:val="22"/>
+        </w:rPr>
+        <w:t xml:space="preserve">Taskinator implements a highly tuned Zero-Fan-Out Targeted Routing layer utilizing Redis data structures.</w:t>
+      </w:r>
+    </w:p>
+    <w:p>
+      <w:pPr>
+        <w:spacing w:after="120" w:before="0"/>
+        <w:jc w:val="both"/>
+      </w:pPr>
+      <w:r>
+        <w:rPr>
+          <w:rFonts w:ascii="Times New Roman" w:cs="Times New Roman" w:eastAsia="Times New Roman" w:hAnsi="Times New Roman"/>
+          <w:sz w:val="22"/>
+          <w:szCs w:val="22"/>
+        </w:rPr>
+        <w:t xml:space="preserve">When a user opens the React frontend dashboard for Project X, their browser establishes an SSE connection with a specific backend pod (e.g., Node Instance 2). Instance 2 immediately registers this connection in Redis by executing a Set Add operation: SADD route:project:X "Instance2".</w:t>
+      </w:r>
+    </w:p>
+    <w:p>
+      <w:pPr>
+        <w:spacing w:after="120" w:before="0"/>
+        <w:jc w:val="both"/>
+      </w:pPr>
+      <w:r>
+        <w:rPr>
+          <w:rFonts w:ascii="Times New Roman" w:cs="Times New Roman" w:eastAsia="Times New Roman" w:hAnsi="Times New Roman"/>
+          <w:sz w:val="22"/>
+          <w:szCs w:val="22"/>
+        </w:rPr>
+        <w:t xml:space="preserve">Later, when an asynchronous Kafka event occurs (e.g., a background worker completes a bulk task assignment for Project X), the Real-Time Router (a dedicated Kafka consumer module) executes a query to determine exactly where the interested clients are located: SMEMBERS route:project:X. Redis rapidly returns the specific array: ["Instance2"]. The Router then issues a highly targeted publish command explicitly to that instance's private channel: PUBLISH instance:Instance2 payload.</w:t>
+      </w:r>
+    </w:p>
+    <w:p>
+      <w:pPr>
+        <w:spacing w:after="120" w:before="0"/>
+        <w:jc w:val="both"/>
+      </w:pPr>
+      <w:r>
+        <w:rPr>
+          <w:rFonts w:ascii="Times New Roman" w:cs="Times New Roman" w:eastAsia="Times New Roman" w:hAnsi="Times New Roman"/>
+          <w:sz w:val="22"/>
+          <w:szCs w:val="22"/>
+        </w:rPr>
+        <w:t xml:space="preserve">If SMEMBERS returns an empty array, it definitively means no users are currently viewing the project, and the Router drops the event instantly into the void without touching the Pub/Sub network. This architecture completely eliminates Fan-Out, reducing network traffic linearly relative to the number of active, observing connections rather than the total number of system instances.</w:t>
       </w:r>
     </w:p>
     <w:p>
@@ -7371,21 +7658,21 @@
           <w:sz w:val="24"/>
           <w:szCs w:val="24"/>
         </w:rPr>
-        <w:t xml:space="preserve">6.2 Testing Methodology</w:t>
-      </w:r>
-    </w:p>
-    <w:p>
-      <w:pPr>
-        <w:spacing w:after="120" w:before="0"/>
-        <w:jc w:val="both"/>
-      </w:pPr>
-      <w:r>
-        <w:rPr>
-          <w:rFonts w:ascii="Times New Roman" w:cs="Times New Roman" w:eastAsia="Times New Roman" w:hAnsi="Times New Roman"/>
-          <w:sz w:val="22"/>
-          <w:szCs w:val="22"/>
-        </w:rPr>
-        <w:t xml:space="preserve">The system's reliability and resilience under extreme event-driven load is guaranteed through a rigorous, multi-tiered testing methodology that completely eschews unreliable mocking in favor of true containerized testing.</w:t>
+        <w:t xml:space="preserve">6.3 Apollo Client Cache Reconciliation</w:t>
+      </w:r>
+    </w:p>
+    <w:p>
+      <w:pPr>
+        <w:spacing w:after="120" w:before="0"/>
+        <w:jc w:val="both"/>
+      </w:pPr>
+      <w:r>
+        <w:rPr>
+          <w:rFonts w:ascii="Times New Roman" w:cs="Times New Roman" w:eastAsia="Times New Roman" w:hAnsi="Times New Roman"/>
+          <w:sz w:val="22"/>
+          <w:szCs w:val="22"/>
+        </w:rPr>
+        <w:t xml:space="preserve">When the targeted SSE payload arrives at the browser (e.g., { id: "Task:123", status: "DONE" }), the client must process it without triggering a network refetch. A naive approach would simply force a re-render of the entire page, causing a massive layout recalculation and dropping the frame rate to zero.</w:t>
       </w:r>
     </w:p>
     <w:p>
@@ -7443,7 +7730,7 @@
                 <w:sz w:val="20"/>
                 <w:szCs w:val="20"/>
               </w:rPr>
-              <w:t xml:space="preserve">[ Image Placeholder: Figure 6.2: Containerized Testing Architecture and Mutation Testing ]</w:t>
+              <w:t xml:space="preserve">[ Image Placeholder: Figure 6.3: Apollo Client SSE State Reconciliation Sequence ]</w:t>
             </w:r>
           </w:p>
         </w:tc>
@@ -7464,7 +7751,333 @@
           <w:sz w:val="20"/>
           <w:szCs w:val="20"/>
         </w:rPr>
-        <w:t xml:space="preserve">Figure 6.2: Containerized Testing Architecture and Mutation Testing</w:t>
+        <w:t xml:space="preserve">Figure 6.3: Apollo Client SSE State Reconciliation Sequence</w:t>
+      </w:r>
+    </w:p>
+    <w:p>
+      <w:pPr>
+        <w:spacing w:after="120" w:before="0"/>
+        <w:jc w:val="both"/>
+      </w:pPr>
+      <w:r>
+        <w:rPr>
+          <w:rFonts w:ascii="Times New Roman" w:cs="Times New Roman" w:eastAsia="Times New Roman" w:hAnsi="Times New Roman"/>
+          <w:sz w:val="22"/>
+          <w:szCs w:val="22"/>
+        </w:rPr>
+        <w:t xml:space="preserve">Taskinator hooks the SSE stream directly into the Apollo GraphQL Link architecture. Apollo maintains a highly normalized, flat, in-memory cache mapping unique IDs (derived from the GraphQL __typename and id fields) to object data.</w:t>
+      </w:r>
+    </w:p>
+    <w:p>
+      <w:pPr>
+        <w:spacing w:after="120" w:before="0"/>
+        <w:jc w:val="both"/>
+      </w:pPr>
+      <w:r>
+        <w:rPr>
+          <w:rFonts w:ascii="Times New Roman" w:cs="Times New Roman" w:eastAsia="Times New Roman" w:hAnsi="Times New Roman"/>
+          <w:sz w:val="22"/>
+          <w:szCs w:val="22"/>
+        </w:rPr>
+        <w:t xml:space="preserve">Upon receiving the SSE payload, the client executes the cache.modify method. This method surgically locates the specific object in the cache (e.g., Task:123) and injects the delta mutation directly into memory, bypassing the React component tree entirely:</w:t>
+      </w:r>
+    </w:p>
+    <w:p>
+      <w:pPr>
+        <w:spacing w:after="0" w:before="120"/>
+        <w:ind w:left="720"/>
+      </w:pPr>
+      <w:r>
+        <w:rPr>
+          <w:rFonts w:ascii="Courier New" w:cs="Courier New" w:eastAsia="Courier New" w:hAnsi="Courier New"/>
+          <w:sz w:val="20"/>
+          <w:szCs w:val="20"/>
+        </w:rPr>
+        <w:t xml:space="preserve">// Apollo Cache Modification Snippet</w:t>
+      </w:r>
+    </w:p>
+    <w:p>
+      <w:pPr>
+        <w:spacing w:after="0" w:before="0"/>
+        <w:ind w:left="720"/>
+      </w:pPr>
+      <w:r>
+        <w:rPr>
+          <w:rFonts w:ascii="Courier New" w:cs="Courier New" w:eastAsia="Courier New" w:hAnsi="Courier New"/>
+          <w:sz w:val="20"/>
+          <w:szCs w:val="20"/>
+        </w:rPr>
+        <w:t xml:space="preserve">apolloClient.cache.modify({</w:t>
+      </w:r>
+    </w:p>
+    <w:p>
+      <w:pPr>
+        <w:spacing w:after="0" w:before="0"/>
+        <w:ind w:left="720"/>
+      </w:pPr>
+      <w:r>
+        <w:rPr>
+          <w:rFonts w:ascii="Courier New" w:cs="Courier New" w:eastAsia="Courier New" w:hAnsi="Courier New"/>
+          <w:sz w:val="20"/>
+          <w:szCs w:val="20"/>
+        </w:rPr>
+        <w:t xml:space="preserve">  id: apolloClient.cache.identify({ __typename: 'Task', id: event.id }),</w:t>
+      </w:r>
+    </w:p>
+    <w:p>
+      <w:pPr>
+        <w:spacing w:after="0" w:before="0"/>
+        <w:ind w:left="720"/>
+      </w:pPr>
+      <w:r>
+        <w:rPr>
+          <w:rFonts w:ascii="Courier New" w:cs="Courier New" w:eastAsia="Courier New" w:hAnsi="Courier New"/>
+          <w:sz w:val="20"/>
+          <w:szCs w:val="20"/>
+        </w:rPr>
+        <w:t xml:space="preserve">  fields: {</w:t>
+      </w:r>
+    </w:p>
+    <w:p>
+      <w:pPr>
+        <w:spacing w:after="0" w:before="0"/>
+        <w:ind w:left="720"/>
+      </w:pPr>
+      <w:r>
+        <w:rPr>
+          <w:rFonts w:ascii="Courier New" w:cs="Courier New" w:eastAsia="Courier New" w:hAnsi="Courier New"/>
+          <w:sz w:val="20"/>
+          <w:szCs w:val="20"/>
+        </w:rPr>
+        <w:t xml:space="preserve">    status() {</w:t>
+      </w:r>
+    </w:p>
+    <w:p>
+      <w:pPr>
+        <w:spacing w:after="0" w:before="0"/>
+        <w:ind w:left="720"/>
+      </w:pPr>
+      <w:r>
+        <w:rPr>
+          <w:rFonts w:ascii="Courier New" w:cs="Courier New" w:eastAsia="Courier New" w:hAnsi="Courier New"/>
+          <w:sz w:val="20"/>
+          <w:szCs w:val="20"/>
+        </w:rPr>
+        <w:t xml:space="preserve">      return event.status; // Inject the new status without a network request</w:t>
+      </w:r>
+    </w:p>
+    <w:p>
+      <w:pPr>
+        <w:spacing w:after="0" w:before="0"/>
+        <w:ind w:left="720"/>
+      </w:pPr>
+      <w:r>
+        <w:rPr>
+          <w:rFonts w:ascii="Courier New" w:cs="Courier New" w:eastAsia="Courier New" w:hAnsi="Courier New"/>
+          <w:sz w:val="20"/>
+          <w:szCs w:val="20"/>
+        </w:rPr>
+        <w:t xml:space="preserve">    }</w:t>
+      </w:r>
+    </w:p>
+    <w:p>
+      <w:pPr>
+        <w:spacing w:after="0" w:before="0"/>
+        <w:ind w:left="720"/>
+      </w:pPr>
+      <w:r>
+        <w:rPr>
+          <w:rFonts w:ascii="Courier New" w:cs="Courier New" w:eastAsia="Courier New" w:hAnsi="Courier New"/>
+          <w:sz w:val="20"/>
+          <w:szCs w:val="20"/>
+        </w:rPr>
+        <w:t xml:space="preserve">  }</w:t>
+      </w:r>
+    </w:p>
+    <w:p>
+      <w:pPr>
+        <w:spacing w:after="120" w:before="0"/>
+        <w:ind w:left="720"/>
+      </w:pPr>
+      <w:r>
+        <w:rPr>
+          <w:rFonts w:ascii="Courier New" w:cs="Courier New" w:eastAsia="Courier New" w:hAnsi="Courier New"/>
+          <w:sz w:val="20"/>
+          <w:szCs w:val="20"/>
+        </w:rPr>
+        <w:t xml:space="preserve">});</w:t>
+      </w:r>
+    </w:p>
+    <w:p>
+      <w:pPr>
+        <w:spacing w:after="120" w:before="0"/>
+        <w:jc w:val="both"/>
+      </w:pPr>
+      <w:r>
+        <w:rPr>
+          <w:rFonts w:ascii="Times New Roman" w:cs="Times New Roman" w:eastAsia="Times New Roman" w:hAnsi="Times New Roman"/>
+          <w:sz w:val="22"/>
+          <w:szCs w:val="22"/>
+        </w:rPr>
+        <w:t xml:space="preserve">Because the React components are structurally bound to specific cached references via the useQuery or useFragment hooks, React instantly detects that the specific node in the cache has changed. It triggers a granular, localized re-render of only that specific Task UI component (e.g., changing the SVG circle color from red to green).</w:t>
+      </w:r>
+    </w:p>
+    <w:p>
+      <w:pPr>
+        <w:spacing w:after="120" w:before="0"/>
+        <w:jc w:val="both"/>
+      </w:pPr>
+      <w:r>
+        <w:rPr>
+          <w:rFonts w:ascii="Times New Roman" w:cs="Times New Roman" w:eastAsia="Times New Roman" w:hAnsi="Times New Roman"/>
+          <w:sz w:val="22"/>
+          <w:szCs w:val="22"/>
+        </w:rPr>
+        <w:t xml:space="preserve">This completely preserves O(1) rendering performance on the client device, preventing complete screen freezes or layout thrashing, and ensuring that the UI remains flawlessly synced with the Eventual Consistency model of the backend without user intervention.</w:t>
+      </w:r>
+    </w:p>
+    <w:p>
+      <w:r>
+        <w:br w:type="page"/>
+      </w:r>
+    </w:p>
+    <w:p>
+      <w:pPr>
+        <w:pStyle w:val="Heading1"/>
+        <w:spacing w:after="240" w:before="360"/>
+      </w:pPr>
+      <w:r>
+        <w:rPr>
+          <w:rFonts w:ascii="Times New Roman" w:cs="Times New Roman" w:eastAsia="Times New Roman" w:hAnsi="Times New Roman"/>
+          <w:b/>
+          <w:bCs/>
+          <w:sz w:val="28"/>
+          <w:szCs w:val="28"/>
+        </w:rPr>
+        <w:t xml:space="preserve">7. IMPLEMENTATION, AUTOMATION, AND TESTING</w:t>
+      </w:r>
+    </w:p>
+    <w:p>
+      <w:pPr>
+        <w:spacing w:after="120" w:before="0"/>
+        <w:jc w:val="both"/>
+      </w:pPr>
+      <w:r>
+        <w:rPr>
+          <w:rFonts w:ascii="Times New Roman" w:cs="Times New Roman" w:eastAsia="Times New Roman" w:hAnsi="Times New Roman"/>
+          <w:sz w:val="22"/>
+          <w:szCs w:val="22"/>
+        </w:rPr>
+        <w:t xml:space="preserve">An architecture optimized for 10,000 RPS is fundamentally useless if the business logic is flawed or the database constraints fail under concurrency. Taskinator's reliability and resilience under extreme event-driven load is guaranteed through a rigorous, multi-tiered testing methodology that completely eschews unreliable mocking in favor of true containerized testing.</w:t>
+      </w:r>
+    </w:p>
+    <w:p>
+      <w:pPr>
+        <w:pStyle w:val="Heading2"/>
+        <w:spacing w:after="180" w:before="280"/>
+      </w:pPr>
+      <w:r>
+        <w:rPr>
+          <w:rFonts w:ascii="Times New Roman" w:cs="Times New Roman" w:eastAsia="Times New Roman" w:hAnsi="Times New Roman"/>
+          <w:b/>
+          <w:bCs/>
+          <w:sz w:val="24"/>
+          <w:szCs w:val="24"/>
+        </w:rPr>
+        <w:t xml:space="preserve">7.1 Containerized Integration Testing via TestContainers</w:t>
+      </w:r>
+    </w:p>
+    <w:p>
+      <w:pPr>
+        <w:spacing w:after="120" w:before="0"/>
+        <w:jc w:val="both"/>
+      </w:pPr>
+      <w:r>
+        <w:rPr>
+          <w:rFonts w:ascii="Times New Roman" w:cs="Times New Roman" w:eastAsia="Times New Roman" w:hAnsi="Times New Roman"/>
+          <w:sz w:val="22"/>
+          <w:szCs w:val="22"/>
+        </w:rPr>
+        <w:t xml:space="preserve">Unit testing complex SQL queries against mock objects (such as in-memory SQLite instances or mocked driver responses) is fundamentally flawed. These mocks fail to validate specific PostgreSQL dialect mechanics, trigger cascades, jsonb aggregations, and concurrent locking behaviors (such as the SKIP LOCKED functionality).</w:t>
+      </w:r>
+    </w:p>
+    <w:p>
+      <w:pPr>
+        <w:spacing w:after="100" w:before="0"/>
+      </w:pPr>
+      <w:r>
+        <w:t xml:space="preserve"/>
+      </w:r>
+    </w:p>
+    <w:tbl>
+      <w:tblPr>
+        <w:tblW w:type="dxa" w:w="9026"/>
+        <w:tblBorders>
+          <w:top w:val="single" w:color="auto" w:sz="4"/>
+          <w:left w:val="single" w:color="auto" w:sz="4"/>
+          <w:bottom w:val="single" w:color="auto" w:sz="4"/>
+          <w:right w:val="single" w:color="auto" w:sz="4"/>
+          <w:insideH w:val="single" w:color="auto" w:sz="4"/>
+          <w:insideV w:val="single" w:color="auto" w:sz="4"/>
+        </w:tblBorders>
+      </w:tblPr>
+      <w:tblGrid>
+        <w:gridCol w:w="9026"/>
+      </w:tblGrid>
+      <w:tr>
+        <w:tc>
+          <w:tcPr>
+            <w:tcW w:type="dxa" w:w="9026"/>
+            <w:tcBorders>
+              <w:top w:val="dashed" w:color="888888" w:sz="6"/>
+              <w:left w:val="dashed" w:color="888888" w:sz="6"/>
+              <w:bottom w:val="dashed" w:color="888888" w:sz="6"/>
+              <w:right w:val="dashed" w:color="888888" w:sz="6"/>
+            </w:tcBorders>
+            <w:shd w:fill="F2F2F2" w:val="clear"/>
+            <w:tcMar>
+              <w:top w:type="dxa" w:w="220"/>
+              <w:left w:type="dxa" w:w="220"/>
+              <w:bottom w:type="dxa" w:w="220"/>
+              <w:right w:type="dxa" w:w="220"/>
+            </w:tcMar>
+            <w:vAlign w:val="center"/>
+          </w:tcPr>
+          <w:p>
+            <w:pPr>
+              <w:jc w:val="center"/>
+            </w:pPr>
+            <w:r>
+              <w:rPr>
+                <w:rFonts w:ascii="Times New Roman" w:cs="Times New Roman" w:eastAsia="Times New Roman" w:hAnsi="Times New Roman"/>
+                <w:i/>
+                <w:iCs/>
+                <w:color w:val="666666"/>
+                <w:sz w:val="20"/>
+                <w:szCs w:val="20"/>
+              </w:rPr>
+              <w:t xml:space="preserve">[ Image Placeholder: Figure 7.1: Containerized Testing Architecture and Mutation Testing ]</w:t>
+            </w:r>
+          </w:p>
+        </w:tc>
+      </w:tr>
+    </w:tbl>
+    <w:p>
+      <w:pPr>
+        <w:spacing w:after="240" w:before="80"/>
+        <w:jc w:val="center"/>
+      </w:pPr>
+      <w:r>
+        <w:rPr>
+          <w:rFonts w:ascii="Times New Roman" w:cs="Times New Roman" w:eastAsia="Times New Roman" w:hAnsi="Times New Roman"/>
+          <w:b/>
+          <w:bCs/>
+          <w:i/>
+          <w:iCs/>
+          <w:sz w:val="20"/>
+          <w:szCs w:val="20"/>
+        </w:rPr>
+        <w:t xml:space="preserve">Figure 7.1: Containerized Testing Architecture and Mutation Testing</w:t>
       </w:r>
     </w:p>
     <w:p>
@@ -7480,65 +8093,35 @@
           <w:sz w:val="22"/>
           <w:szCs w:val="22"/>
         </w:rPr>
-        <w:t xml:space="preserve">6.2.1 Integration Testing via TestContainers</w:t>
-      </w:r>
-    </w:p>
-    <w:p>
-      <w:pPr>
-        <w:spacing w:after="120" w:before="0"/>
-        <w:jc w:val="both"/>
-      </w:pPr>
-      <w:r>
-        <w:rPr>
-          <w:rFonts w:ascii="Times New Roman" w:cs="Times New Roman" w:eastAsia="Times New Roman" w:hAnsi="Times New Roman"/>
-          <w:sz w:val="22"/>
-          <w:szCs w:val="22"/>
-        </w:rPr>
-        <w:t xml:space="preserve">Unit testing SQL queries against mock objects is fundamentally flawed because it fails to validate specific PostgreSQL dialect mechanics, trigger cascades, and locking behaviors. Taskinator utilizes the Jest framework alongside TestContainers (Docker). Before the test suite runs, a pristine, ephemeral PostgreSQL 16 container is spun up. Migrations are executed, and real SQL wCTE mutations are fired against the live container. This guarantees that complex logic—such as the SKIP LOCKED concurrent polling mechanism—performs exactly as intended in a production-equivalent environment.</w:t>
-      </w:r>
-    </w:p>
-    <w:p>
-      <w:pPr>
-        <w:pStyle w:val="Heading3"/>
-        <w:spacing w:after="120" w:before="200"/>
-      </w:pPr>
-      <w:r>
-        <w:rPr>
-          <w:rFonts w:ascii="Times New Roman" w:cs="Times New Roman" w:eastAsia="Times New Roman" w:hAnsi="Times New Roman"/>
-          <w:b/>
-          <w:bCs/>
-          <w:sz w:val="22"/>
-          <w:szCs w:val="22"/>
-        </w:rPr>
-        <w:t xml:space="preserve">6.2.2 Mutation Testing with Stryker</w:t>
-      </w:r>
-    </w:p>
-    <w:p>
-      <w:pPr>
-        <w:spacing w:after="120" w:before="0"/>
-        <w:jc w:val="both"/>
-      </w:pPr>
-      <w:r>
-        <w:rPr>
-          <w:rFonts w:ascii="Times New Roman" w:cs="Times New Roman" w:eastAsia="Times New Roman" w:hAnsi="Times New Roman"/>
-          <w:sz w:val="22"/>
-          <w:szCs w:val="22"/>
-        </w:rPr>
-        <w:t xml:space="preserve">100% Code Coverage is a deceptive metric; it proves that lines of code were executed, but not that the tests actually assert the correct outcomes. Taskinator utilizes Stryker Mutator to measure true test efficacy.</w:t>
-      </w:r>
-    </w:p>
-    <w:p>
-      <w:pPr>
-        <w:spacing w:after="120" w:before="0"/>
-        <w:jc w:val="both"/>
-      </w:pPr>
-      <w:r>
-        <w:rPr>
-          <w:rFonts w:ascii="Times New Roman" w:cs="Times New Roman" w:eastAsia="Times New Roman" w:hAnsi="Times New Roman"/>
-          <w:sz w:val="22"/>
-          <w:szCs w:val="22"/>
-        </w:rPr>
-        <w:t xml:space="preserve">Instead of merely parsing the AST (Abstract Syntax Tree) for coverage, Stryker actively injects algorithmic bugs (mutations) directly into the source code (e.g., changing a === to !==, or altering a SQL &gt;= to &lt;). It then runs the Jest test suite. If the test suite passes despite the injected bug, the mutant "survives," indicating a severe flaw in the test assertions. A high "Mutation Score" provides unparalleled confidence in the business logic.</w:t>
+        <w:t xml:space="preserve">7.1.1 Ephemeral Test Environments</w:t>
+      </w:r>
+    </w:p>
+    <w:p>
+      <w:pPr>
+        <w:spacing w:after="120" w:before="0"/>
+        <w:jc w:val="both"/>
+      </w:pPr>
+      <w:r>
+        <w:rPr>
+          <w:rFonts w:ascii="Times New Roman" w:cs="Times New Roman" w:eastAsia="Times New Roman" w:hAnsi="Times New Roman"/>
+          <w:sz w:val="22"/>
+          <w:szCs w:val="22"/>
+        </w:rPr>
+        <w:t xml:space="preserve">Taskinator utilizes the Jest testing framework integrated directly with TestContainers (a Docker orchestration library for testing). Before the test suite executes, the testing framework programmatically spins up a pristine, ephemeral PostgreSQL 16 container, alongside temporary Redis and Kafka broker containers.</w:t>
+      </w:r>
+    </w:p>
+    <w:p>
+      <w:pPr>
+        <w:spacing w:after="120" w:before="0"/>
+        <w:jc w:val="both"/>
+      </w:pPr>
+      <w:r>
+        <w:rPr>
+          <w:rFonts w:ascii="Times New Roman" w:cs="Times New Roman" w:eastAsia="Times New Roman" w:hAnsi="Times New Roman"/>
+          <w:sz w:val="22"/>
+          <w:szCs w:val="22"/>
+        </w:rPr>
+        <w:t xml:space="preserve">The entire database schema migration suite is executed against this live, containerized database. Following this, real SQL wCTE mutations are fired against the container. This guarantees that complex logic—such as the targeted outbox polling and the semantic aggregator folding—performs exactly as intended in a production-equivalent environment. Once the test suite concludes, the Docker daemon automatically destroys the containers, ensuring absolute isolation between test runs and preventing data bleed.</w:t>
       </w:r>
     </w:p>
     <w:p>
@@ -7554,7 +8137,79 @@
           <w:sz w:val="24"/>
           <w:szCs w:val="24"/>
         </w:rPr>
-        <w:t xml:space="preserve">6.3 Performance Analysis and Metrics</w:t>
+        <w:t xml:space="preserve">7.2 Mutation Testing with Stryker</w:t>
+      </w:r>
+    </w:p>
+    <w:p>
+      <w:pPr>
+        <w:spacing w:after="120" w:before="0"/>
+        <w:jc w:val="both"/>
+      </w:pPr>
+      <w:r>
+        <w:rPr>
+          <w:rFonts w:ascii="Times New Roman" w:cs="Times New Roman" w:eastAsia="Times New Roman" w:hAnsi="Times New Roman"/>
+          <w:sz w:val="22"/>
+          <w:szCs w:val="22"/>
+        </w:rPr>
+        <w:t xml:space="preserve">Traditional "100% Code Coverage" is a highly deceptive metric; it proves mathematically that the test runner executed specific lines of code, but it completely fails to guarantee that the test assertions actually validate the correct business outcomes. A test could execute a function and simply assert 'true === true', achieving coverage without providing any safety.</w:t>
+      </w:r>
+    </w:p>
+    <w:p>
+      <w:pPr>
+        <w:spacing w:after="120" w:before="0"/>
+        <w:jc w:val="both"/>
+      </w:pPr>
+      <w:r>
+        <w:rPr>
+          <w:rFonts w:ascii="Times New Roman" w:cs="Times New Roman" w:eastAsia="Times New Roman" w:hAnsi="Times New Roman"/>
+          <w:sz w:val="22"/>
+          <w:szCs w:val="22"/>
+        </w:rPr>
+        <w:t xml:space="preserve">To guarantee the integrity of the critical domain rules (such as the Parent Guard Triggers or the RBAC matrix), Taskinator utilizes Stryker Mutator to measure true test efficacy.</w:t>
+      </w:r>
+    </w:p>
+    <w:p>
+      <w:pPr>
+        <w:spacing w:after="120" w:before="0"/>
+        <w:jc w:val="both"/>
+      </w:pPr>
+      <w:r>
+        <w:rPr>
+          <w:rFonts w:ascii="Times New Roman" w:cs="Times New Roman" w:eastAsia="Times New Roman" w:hAnsi="Times New Roman"/>
+          <w:sz w:val="22"/>
+          <w:szCs w:val="22"/>
+        </w:rPr>
+        <w:t xml:space="preserve">Instead of merely parsing the Abstract Syntax Tree (AST) for execution coverage, Stryker actively injects algorithmic bugs (mutants) directly into the source code during the testing phase. For example, it might change an equality check (=== to !==), alter a SQL comparison boundary (&gt;= to &lt;), or mutate a boolean logic gate (&amp;&amp; to ||).</w:t>
+      </w:r>
+    </w:p>
+    <w:p>
+      <w:pPr>
+        <w:spacing w:after="120" w:before="0"/>
+        <w:jc w:val="both"/>
+      </w:pPr>
+      <w:r>
+        <w:rPr>
+          <w:rFonts w:ascii="Times New Roman" w:cs="Times New Roman" w:eastAsia="Times New Roman" w:hAnsi="Times New Roman"/>
+          <w:sz w:val="22"/>
+          <w:szCs w:val="22"/>
+        </w:rPr>
+        <w:t xml:space="preserve">It then runs the Jest test suite against this mutated code. If the test suite passes despite the injected bug, the mutant is considered to have "survived." A surviving mutant indicates a severe flaw in the test assertions, proving that the test suite is incapable of catching regressions. By achieving a high "Mutation Score," the development team gains unparalleled confidence that the complex event-driven business logic is definitively protected against silent degradation.</w:t>
+      </w:r>
+    </w:p>
+    <w:p>
+      <w:pPr>
+        <w:pStyle w:val="Heading2"/>
+        <w:spacing w:after="180" w:before="280"/>
+      </w:pPr>
+      <w:r>
+        <w:rPr>
+          <w:rFonts w:ascii="Times New Roman" w:cs="Times New Roman" w:eastAsia="Times New Roman" w:hAnsi="Times New Roman"/>
+          <w:b/>
+          <w:bCs/>
+          <w:sz w:val="24"/>
+          <w:szCs w:val="24"/>
+        </w:rPr>
+        <w:t xml:space="preserve">7.3 Performance Analysis and Metrics</w:t>
       </w:r>
     </w:p>
     <w:p>
@@ -7582,7 +8237,7 @@
           <w:sz w:val="22"/>
           <w:szCs w:val="22"/>
         </w:rPr>
-        <w:t xml:space="preserve">A customized Apache JMeter test plan was developed, utilizing distributed load generation across multiple worker nodes to simulate thousands of concurrent users executing a brutal mix of read queries and heavy write mutations.</w:t>
+        <w:t xml:space="preserve">A customized Apache JMeter test plan was developed, utilizing distributed load generation across multiple worker nodes to simulate thousands of concurrent users executing a brutal mix of read queries, heavy write mutations, and recursive deletions.</w:t>
       </w:r>
     </w:p>
     <w:p>
@@ -7606,7 +8261,7 @@
           <w:sz w:val="22"/>
           <w:szCs w:val="22"/>
         </w:rPr>
-        <w:t xml:space="preserve">Table 6.1: Performance Metrics at 10,000 RPS</w:t>
+        <w:t xml:space="preserve">Table 7.1: Performance Metrics at 10,000 RPS</w:t>
       </w:r>
     </w:p>
     <w:tbl>
@@ -8225,7 +8880,7 @@
           <w:sz w:val="22"/>
           <w:szCs w:val="22"/>
         </w:rPr>
-        <w:t xml:space="preserve">The results clearly demonstrate the effectiveness of the non-blocking architecture. Despite the massive influx of write requests, the primary GraphQL API Gateway maintained a 95th percentile latency of under 40 milliseconds. This was achieved because the API simply inserts the row and the Outbox event in a single transaction (wCTE) and immediately returns, offloading all subsequent side-effects to the Kafka brokers.</w:t>
+        <w:t xml:space="preserve">The results clearly demonstrate the effectiveness of the non-blocking architecture. Despite the massive influx of write requests, the primary GraphQL API Gateway maintained a 95th percentile latency of under 40 milliseconds. This was achieved exclusively because the API simply inserts the row and the Outbox event in a single transaction (wCTE) and immediately returns, offloading all subsequent side-effects to the Kafka brokers.</w:t>
       </w:r>
     </w:p>
     <w:p>
@@ -8241,7 +8896,7 @@
           <w:sz w:val="22"/>
           <w:szCs w:val="22"/>
         </w:rPr>
-        <w:t xml:space="preserve">6.3.1 Optimization Benchmarks</w:t>
+        <w:t xml:space="preserve">7.3.1 Optimization Benchmarks: Chunked Deletion vs Cascade</w:t>
       </w:r>
     </w:p>
     <w:p>
@@ -8279,7 +8934,7 @@
           <w:sz w:val="22"/>
           <w:szCs w:val="22"/>
         </w:rPr>
-        <w:t xml:space="preserve">Table 6.2: Chunked vs Unbounded Deletion Benchmarks</w:t>
+        <w:t xml:space="preserve">Table 7.2: Chunked vs Unbounded Deletion Benchmarks</w:t>
       </w:r>
     </w:p>
     <w:tbl>
@@ -8743,7 +9398,7 @@
           <w:sz w:val="28"/>
           <w:szCs w:val="28"/>
         </w:rPr>
-        <w:t xml:space="preserve">7. CONCLUSION AND FUTURE WORK</w:t>
+        <w:t xml:space="preserve">8. CONCLUSION AND FUTURE WORK</w:t>
       </w:r>
     </w:p>
     <w:p>
@@ -8759,7 +9414,7 @@
           <w:sz w:val="24"/>
           <w:szCs w:val="24"/>
         </w:rPr>
-        <w:t xml:space="preserve">7.1 Conclusion</w:t>
+        <w:t xml:space="preserve">8.1 Conclusion</w:t>
       </w:r>
     </w:p>
     <w:p>
@@ -8787,21 +9442,21 @@
           <w:sz w:val="22"/>
           <w:szCs w:val="22"/>
         </w:rPr>
-        <w:t xml:space="preserve">By fundamentally challenging traditional synchronous CRUD philosophies, this thesis demonstrates the necessity of structural trade-offs. While sacrificing immediate Strong Consistency initially appears detrimental to user experience, the implementation of Optimistic UI caching and Zero-Fan-Out Real-Time SSE synchronization completely masks this eventual consistency from the end-user.</w:t>
-      </w:r>
-    </w:p>
-    <w:p>
-      <w:pPr>
-        <w:spacing w:after="120" w:before="0"/>
-        <w:jc w:val="both"/>
-      </w:pPr>
-      <w:r>
-        <w:rPr>
-          <w:rFonts w:ascii="Times New Roman" w:cs="Times New Roman" w:eastAsia="Times New Roman" w:hAnsi="Times New Roman"/>
-          <w:sz w:val="22"/>
-          <w:szCs w:val="22"/>
-        </w:rPr>
-        <w:t xml:space="preserve">Furthermore, the introduction of advanced database patterns—specifically Custom Closure Tables updated asynchronously, wCTE Transactional Outboxes, and Chunked Self-Signaling deletions—provides a robust, academically sound blueprint for modern enterprise applications seeking to escape the limitations of monolithic database locking.</w:t>
+        <w:t xml:space="preserve">By fundamentally challenging traditional synchronous CRUD philosophies, this thesis demonstrates the necessity of structural trade-offs. While sacrificing immediate Strong Consistency initially appears detrimental to user experience, the implementation of localized Optimistic UI caching and Zero-Fan-Out Real-Time SSE synchronization completely masks this eventual consistency from the end-user. The perceived performance of the system remains instantaneous.</w:t>
+      </w:r>
+    </w:p>
+    <w:p>
+      <w:pPr>
+        <w:spacing w:after="120" w:before="0"/>
+        <w:jc w:val="both"/>
+      </w:pPr>
+      <w:r>
+        <w:rPr>
+          <w:rFonts w:ascii="Times New Roman" w:cs="Times New Roman" w:eastAsia="Times New Roman" w:hAnsi="Times New Roman"/>
+          <w:sz w:val="22"/>
+          <w:szCs w:val="22"/>
+        </w:rPr>
+        <w:t xml:space="preserve">Furthermore, the introduction of advanced database patterns—specifically Custom Closure Tables updated asynchronously, wCTE Transactional Outboxes, and Chunked Self-Signaling recursive deletions—provides a robust, academically sound blueprint for modern enterprise applications seeking to escape the limitations of monolithic database locking and B-Tree contention.</w:t>
       </w:r>
     </w:p>
     <w:p>
@@ -8817,21 +9472,35 @@
           <w:sz w:val="24"/>
           <w:szCs w:val="24"/>
         </w:rPr>
-        <w:t xml:space="preserve">7.2 Future Work</w:t>
-      </w:r>
-    </w:p>
-    <w:p>
-      <w:pPr>
-        <w:spacing w:after="120" w:before="0"/>
-        <w:jc w:val="both"/>
-      </w:pPr>
-      <w:r>
-        <w:rPr>
-          <w:rFonts w:ascii="Times New Roman" w:cs="Times New Roman" w:eastAsia="Times New Roman" w:hAnsi="Times New Roman"/>
-          <w:sz w:val="22"/>
-          <w:szCs w:val="22"/>
-        </w:rPr>
-        <w:t xml:space="preserve">While the current architecture successfully mitigates database write amplification, future research and development on the Taskinator platform should focus on the deployment topology. Investigating the transition from a Modular Monolith into a fully distributed microservice mesh utilizing Kubernetes auto-scaling (KEDA) based on Kafka lag metrics would provide even greater elastic resilience. Additionally, researching the integration of a specialized graph database (such as Neo4j) to offload the Reachability Engine entirely from PostgreSQL could yield further performance enhancements for projects exceeding one million nested tasks.</w:t>
+        <w:t xml:space="preserve">8.2 Future Work</w:t>
+      </w:r>
+    </w:p>
+    <w:p>
+      <w:pPr>
+        <w:spacing w:after="120" w:before="0"/>
+        <w:jc w:val="both"/>
+      </w:pPr>
+      <w:r>
+        <w:rPr>
+          <w:rFonts w:ascii="Times New Roman" w:cs="Times New Roman" w:eastAsia="Times New Roman" w:hAnsi="Times New Roman"/>
+          <w:sz w:val="22"/>
+          <w:szCs w:val="22"/>
+        </w:rPr>
+        <w:t xml:space="preserve">While the current architecture successfully mitigates database write amplification and network saturation, future research and development on the Taskinator platform should focus on the deployment topology. Investigating the transition from a Modular Monolith into a fully distributed microservice mesh utilizing Kubernetes Event-Driven Autoscaling (KEDA) based on exact Kafka partition lag metrics would provide even greater elastic resilience.</w:t>
+      </w:r>
+    </w:p>
+    <w:p>
+      <w:pPr>
+        <w:spacing w:after="120" w:before="0"/>
+        <w:jc w:val="both"/>
+      </w:pPr>
+      <w:r>
+        <w:rPr>
+          <w:rFonts w:ascii="Times New Roman" w:cs="Times New Roman" w:eastAsia="Times New Roman" w:hAnsi="Times New Roman"/>
+          <w:sz w:val="22"/>
+          <w:szCs w:val="22"/>
+        </w:rPr>
+        <w:t xml:space="preserve">Additionally, researching the integration of a specialized graph database engine (such as Neo4j or Amazon Neptune) to offload the Reachability Engine entirely from PostgreSQL could yield further performance enhancements for organizations managing projects that exceed millions of nested hierarchical tasks.</w:t>
       </w:r>
     </w:p>
     <w:p>
@@ -8868,7 +9537,7 @@
         <w:pStyle w:val="ListParagraph"/>
         <w:numPr>
           <w:ilvl w:val="0"/>
-          <w:numId w:val="11"/>
+          <w:numId w:val="10"/>
         </w:numPr>
         <w:spacing w:after="80" w:before="0"/>
       </w:pPr>
@@ -8886,7 +9555,7 @@
         <w:pStyle w:val="ListParagraph"/>
         <w:numPr>
           <w:ilvl w:val="0"/>
-          <w:numId w:val="11"/>
+          <w:numId w:val="10"/>
         </w:numPr>
         <w:spacing w:after="80" w:before="0"/>
       </w:pPr>
@@ -8904,7 +9573,7 @@
         <w:pStyle w:val="ListParagraph"/>
         <w:numPr>
           <w:ilvl w:val="0"/>
-          <w:numId w:val="11"/>
+          <w:numId w:val="10"/>
         </w:numPr>
         <w:spacing w:after="80" w:before="0"/>
       </w:pPr>
@@ -8922,7 +9591,7 @@
         <w:pStyle w:val="ListParagraph"/>
         <w:numPr>
           <w:ilvl w:val="0"/>
-          <w:numId w:val="11"/>
+          <w:numId w:val="10"/>
         </w:numPr>
         <w:spacing w:after="80" w:before="0"/>
       </w:pPr>
@@ -8940,7 +9609,7 @@
         <w:pStyle w:val="ListParagraph"/>
         <w:numPr>
           <w:ilvl w:val="0"/>
-          <w:numId w:val="11"/>
+          <w:numId w:val="10"/>
         </w:numPr>
         <w:spacing w:after="80" w:before="0"/>
       </w:pPr>
@@ -8958,7 +9627,7 @@
         <w:pStyle w:val="ListParagraph"/>
         <w:numPr>
           <w:ilvl w:val="0"/>
-          <w:numId w:val="11"/>
+          <w:numId w:val="10"/>
         </w:numPr>
         <w:spacing w:after="80" w:before="0"/>
       </w:pPr>
@@ -8969,6 +9638,24 @@
           <w:szCs w:val="22"/>
         </w:rPr>
         <w:t xml:space="preserve">Fowler, M. (2006). Patterns of Enterprise Application Architecture. Addison-Wesley Professional.</w:t>
+      </w:r>
+    </w:p>
+    <w:p>
+      <w:pPr>
+        <w:pStyle w:val="ListParagraph"/>
+        <w:numPr>
+          <w:ilvl w:val="0"/>
+          <w:numId w:val="10"/>
+        </w:numPr>
+        <w:spacing w:after="80" w:before="0"/>
+      </w:pPr>
+      <w:r>
+        <w:rPr>
+          <w:rFonts w:ascii="Times New Roman" w:cs="Times New Roman" w:eastAsia="Times New Roman" w:hAnsi="Times New Roman"/>
+          <w:sz w:val="22"/>
+          <w:szCs w:val="22"/>
+        </w:rPr>
+        <w:t xml:space="preserve">Banks, A. &amp; Gupta, R. (2014). MQTT Version 3.1.1. OASIS Standard.</w:t>
       </w:r>
     </w:p>
     <w:sectPr>
@@ -9342,12 +10029,6 @@
     </w:lvlOverride>
   </w:num>
   <w:num w:numId="10">
-    <w:abstractNumId w:val="10"/>
-    <w:lvlOverride w:ilvl="0">
-      <w:startOverride w:val="1"/>
-    </w:lvlOverride>
-  </w:num>
-  <w:num w:numId="11">
     <w:abstractNumId w:val="11"/>
     <w:lvlOverride w:ilvl="0">
       <w:startOverride w:val="1"/>

</xml_diff>

<commit_message>
refactor: replace imgPlaceholder with insertImage and update asset filenames throughout thesis sections
</commit_message>
<xml_diff>
--- a/thesis/builder/taskinator_thesis_v2.docx
+++ b/thesis/builder/taskinator_thesis_v2.docx
@@ -308,59 +308,52 @@
         <w:t xml:space="preserve"/>
       </w:r>
     </w:p>
-    <w:tbl>
-      <w:tblPr>
-        <w:tblW w:type="dxa" w:w="9026"/>
-        <w:tblBorders>
-          <w:top w:val="single" w:color="auto" w:sz="4"/>
-          <w:left w:val="single" w:color="auto" w:sz="4"/>
-          <w:bottom w:val="single" w:color="auto" w:sz="4"/>
-          <w:right w:val="single" w:color="auto" w:sz="4"/>
-          <w:insideH w:val="single" w:color="auto" w:sz="4"/>
-          <w:insideV w:val="single" w:color="auto" w:sz="4"/>
-        </w:tblBorders>
-      </w:tblPr>
-      <w:tblGrid>
-        <w:gridCol w:w="9026"/>
-      </w:tblGrid>
-      <w:tr>
-        <w:tc>
-          <w:tcPr>
-            <w:tcW w:type="dxa" w:w="9026"/>
-            <w:tcBorders>
-              <w:top w:val="dashed" w:color="888888" w:sz="6"/>
-              <w:left w:val="dashed" w:color="888888" w:sz="6"/>
-              <w:bottom w:val="dashed" w:color="888888" w:sz="6"/>
-              <w:right w:val="dashed" w:color="888888" w:sz="6"/>
-            </w:tcBorders>
-            <w:shd w:fill="F2F2F2" w:val="clear"/>
-            <w:tcMar>
-              <w:top w:type="dxa" w:w="220"/>
-              <w:left w:type="dxa" w:w="220"/>
-              <w:bottom w:type="dxa" w:w="220"/>
-              <w:right w:type="dxa" w:w="220"/>
-            </w:tcMar>
-            <w:vAlign w:val="center"/>
-          </w:tcPr>
-          <w:p>
-            <w:pPr>
-              <w:jc w:val="center"/>
-            </w:pPr>
-            <w:r>
-              <w:rPr>
-                <w:rFonts w:ascii="Times New Roman" w:cs="Times New Roman" w:eastAsia="Times New Roman" w:hAnsi="Times New Roman"/>
-                <w:i/>
-                <w:iCs/>
-                <w:color w:val="666666"/>
-                <w:sz w:val="20"/>
-                <w:szCs w:val="20"/>
-              </w:rPr>
-              <w:t xml:space="preserve">[ Image Placeholder: ICFAI University Tripura Logo ]</w:t>
-            </w:r>
-          </w:p>
-        </w:tc>
-      </w:tr>
-    </w:tbl>
+    <w:p>
+      <w:pPr>
+        <w:spacing w:after="120" w:before="120"/>
+        <w:jc w:val="center"/>
+      </w:pPr>
+      <w:r>
+        <w:drawing>
+          <wp:inline distT="0" distB="0" distL="0" distR="0">
+            <wp:extent cx="2143125" cy="2200275"/>
+            <wp:effectExtent t="0" r="0" b="0" l="0"/>
+            <wp:docPr id="1" name="" descr="" title=""/>
+            <wp:cNvGraphicFramePr>
+              <a:graphicFrameLocks xmlns:a="http://schemas.openxmlformats.org/drawingml/2006/main" noChangeAspect="1"/>
+            </wp:cNvGraphicFramePr>
+            <a:graphic xmlns:a="http://schemas.openxmlformats.org/drawingml/2006/main">
+              <a:graphicData uri="http://schemas.openxmlformats.org/drawingml/2006/picture">
+                <pic:pic xmlns:pic="http://schemas.openxmlformats.org/drawingml/2006/picture">
+                  <pic:nvPicPr>
+                    <pic:cNvPr id="0" name="" descr=""/>
+                    <pic:cNvPicPr>
+                      <a:picLocks noChangeAspect="1" noChangeArrowheads="1"/>
+                    </pic:cNvPicPr>
+                  </pic:nvPicPr>
+                  <pic:blipFill>
+                    <a:blip r:embed="rId8" cstate="none"/>
+                    <a:srcRect/>
+                    <a:stretch>
+                      <a:fillRect/>
+                    </a:stretch>
+                  </pic:blipFill>
+                  <pic:spPr bwMode="auto">
+                    <a:xfrm>
+                      <a:off x="0" y="0"/>
+                      <a:ext cx="2143125" cy="2200275"/>
+                    </a:xfrm>
+                    <a:prstGeom prst="rect">
+                      <a:avLst/>
+                    </a:prstGeom>
+                  </pic:spPr>
+                </pic:pic>
+              </a:graphicData>
+            </a:graphic>
+          </wp:inline>
+        </w:drawing>
+      </w:r>
+    </w:p>
     <w:p>
       <w:pPr>
         <w:spacing w:after="100" w:before="0"/>
@@ -510,59 +503,52 @@
         <w:t xml:space="preserve"/>
       </w:r>
     </w:p>
-    <w:tbl>
-      <w:tblPr>
-        <w:tblW w:type="dxa" w:w="9026"/>
-        <w:tblBorders>
-          <w:top w:val="single" w:color="auto" w:sz="4"/>
-          <w:left w:val="single" w:color="auto" w:sz="4"/>
-          <w:bottom w:val="single" w:color="auto" w:sz="4"/>
-          <w:right w:val="single" w:color="auto" w:sz="4"/>
-          <w:insideH w:val="single" w:color="auto" w:sz="4"/>
-          <w:insideV w:val="single" w:color="auto" w:sz="4"/>
-        </w:tblBorders>
-      </w:tblPr>
-      <w:tblGrid>
-        <w:gridCol w:w="9026"/>
-      </w:tblGrid>
-      <w:tr>
-        <w:tc>
-          <w:tcPr>
-            <w:tcW w:type="dxa" w:w="9026"/>
-            <w:tcBorders>
-              <w:top w:val="dashed" w:color="888888" w:sz="6"/>
-              <w:left w:val="dashed" w:color="888888" w:sz="6"/>
-              <w:bottom w:val="dashed" w:color="888888" w:sz="6"/>
-              <w:right w:val="dashed" w:color="888888" w:sz="6"/>
-            </w:tcBorders>
-            <w:shd w:fill="F2F2F2" w:val="clear"/>
-            <w:tcMar>
-              <w:top w:type="dxa" w:w="220"/>
-              <w:left w:type="dxa" w:w="220"/>
-              <w:bottom w:type="dxa" w:w="220"/>
-              <w:right w:type="dxa" w:w="220"/>
-            </w:tcMar>
-            <w:vAlign w:val="center"/>
-          </w:tcPr>
-          <w:p>
-            <w:pPr>
-              <w:jc w:val="center"/>
-            </w:pPr>
-            <w:r>
-              <w:rPr>
-                <w:rFonts w:ascii="Times New Roman" w:cs="Times New Roman" w:eastAsia="Times New Roman" w:hAnsi="Times New Roman"/>
-                <w:i/>
-                <w:iCs/>
-                <w:color w:val="666666"/>
-                <w:sz w:val="20"/>
-                <w:szCs w:val="20"/>
-              </w:rPr>
-              <w:t xml:space="preserve">[ Image Placeholder: ICFAI University Tripura Logo ]</w:t>
-            </w:r>
-          </w:p>
-        </w:tc>
-      </w:tr>
-    </w:tbl>
+    <w:p>
+      <w:pPr>
+        <w:spacing w:after="120" w:before="120"/>
+        <w:jc w:val="center"/>
+      </w:pPr>
+      <w:r>
+        <w:drawing>
+          <wp:inline distT="0" distB="0" distL="0" distR="0">
+            <wp:extent cx="2143125" cy="2200275"/>
+            <wp:effectExtent t="0" r="0" b="0" l="0"/>
+            <wp:docPr id="1" name="" descr="" title=""/>
+            <wp:cNvGraphicFramePr>
+              <a:graphicFrameLocks xmlns:a="http://schemas.openxmlformats.org/drawingml/2006/main" noChangeAspect="1"/>
+            </wp:cNvGraphicFramePr>
+            <a:graphic xmlns:a="http://schemas.openxmlformats.org/drawingml/2006/main">
+              <a:graphicData uri="http://schemas.openxmlformats.org/drawingml/2006/picture">
+                <pic:pic xmlns:pic="http://schemas.openxmlformats.org/drawingml/2006/picture">
+                  <pic:nvPicPr>
+                    <pic:cNvPr id="0" name="" descr=""/>
+                    <pic:cNvPicPr>
+                      <a:picLocks noChangeAspect="1" noChangeArrowheads="1"/>
+                    </pic:cNvPicPr>
+                  </pic:nvPicPr>
+                  <pic:blipFill>
+                    <a:blip r:embed="rId8" cstate="none"/>
+                    <a:srcRect/>
+                    <a:stretch>
+                      <a:fillRect/>
+                    </a:stretch>
+                  </pic:blipFill>
+                  <pic:spPr bwMode="auto">
+                    <a:xfrm>
+                      <a:off x="0" y="0"/>
+                      <a:ext cx="2143125" cy="2200275"/>
+                    </a:xfrm>
+                    <a:prstGeom prst="rect">
+                      <a:avLst/>
+                    </a:prstGeom>
+                  </pic:spPr>
+                </pic:pic>
+              </a:graphicData>
+            </a:graphic>
+          </wp:inline>
+        </w:drawing>
+      </w:r>
+    </w:p>
     <w:p>
       <w:pPr>
         <w:spacing w:after="100" w:before="0"/>
@@ -756,59 +742,52 @@
         <w:t xml:space="preserve"/>
       </w:r>
     </w:p>
-    <w:tbl>
-      <w:tblPr>
-        <w:tblW w:type="dxa" w:w="9026"/>
-        <w:tblBorders>
-          <w:top w:val="single" w:color="auto" w:sz="4"/>
-          <w:left w:val="single" w:color="auto" w:sz="4"/>
-          <w:bottom w:val="single" w:color="auto" w:sz="4"/>
-          <w:right w:val="single" w:color="auto" w:sz="4"/>
-          <w:insideH w:val="single" w:color="auto" w:sz="4"/>
-          <w:insideV w:val="single" w:color="auto" w:sz="4"/>
-        </w:tblBorders>
-      </w:tblPr>
-      <w:tblGrid>
-        <w:gridCol w:w="9026"/>
-      </w:tblGrid>
-      <w:tr>
-        <w:tc>
-          <w:tcPr>
-            <w:tcW w:type="dxa" w:w="9026"/>
-            <w:tcBorders>
-              <w:top w:val="dashed" w:color="888888" w:sz="6"/>
-              <w:left w:val="dashed" w:color="888888" w:sz="6"/>
-              <w:bottom w:val="dashed" w:color="888888" w:sz="6"/>
-              <w:right w:val="dashed" w:color="888888" w:sz="6"/>
-            </w:tcBorders>
-            <w:shd w:fill="F2F2F2" w:val="clear"/>
-            <w:tcMar>
-              <w:top w:type="dxa" w:w="220"/>
-              <w:left w:type="dxa" w:w="220"/>
-              <w:bottom w:type="dxa" w:w="220"/>
-              <w:right w:type="dxa" w:w="220"/>
-            </w:tcMar>
-            <w:vAlign w:val="center"/>
-          </w:tcPr>
-          <w:p>
-            <w:pPr>
-              <w:jc w:val="center"/>
-            </w:pPr>
-            <w:r>
-              <w:rPr>
-                <w:rFonts w:ascii="Times New Roman" w:cs="Times New Roman" w:eastAsia="Times New Roman" w:hAnsi="Times New Roman"/>
-                <w:i/>
-                <w:iCs/>
-                <w:color w:val="666666"/>
-                <w:sz w:val="20"/>
-                <w:szCs w:val="20"/>
-              </w:rPr>
-              <w:t xml:space="preserve">[ Image Placeholder: ICFAI University Tripura Logo ]</w:t>
-            </w:r>
-          </w:p>
-        </w:tc>
-      </w:tr>
-    </w:tbl>
+    <w:p>
+      <w:pPr>
+        <w:spacing w:after="120" w:before="120"/>
+        <w:jc w:val="center"/>
+      </w:pPr>
+      <w:r>
+        <w:drawing>
+          <wp:inline distT="0" distB="0" distL="0" distR="0">
+            <wp:extent cx="2143125" cy="2200275"/>
+            <wp:effectExtent t="0" r="0" b="0" l="0"/>
+            <wp:docPr id="1" name="" descr="" title=""/>
+            <wp:cNvGraphicFramePr>
+              <a:graphicFrameLocks xmlns:a="http://schemas.openxmlformats.org/drawingml/2006/main" noChangeAspect="1"/>
+            </wp:cNvGraphicFramePr>
+            <a:graphic xmlns:a="http://schemas.openxmlformats.org/drawingml/2006/main">
+              <a:graphicData uri="http://schemas.openxmlformats.org/drawingml/2006/picture">
+                <pic:pic xmlns:pic="http://schemas.openxmlformats.org/drawingml/2006/picture">
+                  <pic:nvPicPr>
+                    <pic:cNvPr id="0" name="" descr=""/>
+                    <pic:cNvPicPr>
+                      <a:picLocks noChangeAspect="1" noChangeArrowheads="1"/>
+                    </pic:cNvPicPr>
+                  </pic:nvPicPr>
+                  <pic:blipFill>
+                    <a:blip r:embed="rId8" cstate="none"/>
+                    <a:srcRect/>
+                    <a:stretch>
+                      <a:fillRect/>
+                    </a:stretch>
+                  </pic:blipFill>
+                  <pic:spPr bwMode="auto">
+                    <a:xfrm>
+                      <a:off x="0" y="0"/>
+                      <a:ext cx="2143125" cy="2200275"/>
+                    </a:xfrm>
+                    <a:prstGeom prst="rect">
+                      <a:avLst/>
+                    </a:prstGeom>
+                  </pic:spPr>
+                </pic:pic>
+              </a:graphicData>
+            </a:graphic>
+          </wp:inline>
+        </w:drawing>
+      </w:r>
+    </w:p>
     <w:p>
       <w:pPr>
         <w:spacing w:after="100" w:before="0"/>
@@ -4463,59 +4442,52 @@
         <w:t xml:space="preserve"/>
       </w:r>
     </w:p>
-    <w:tbl>
-      <w:tblPr>
-        <w:tblW w:type="dxa" w:w="9026"/>
-        <w:tblBorders>
-          <w:top w:val="single" w:color="auto" w:sz="4"/>
-          <w:left w:val="single" w:color="auto" w:sz="4"/>
-          <w:bottom w:val="single" w:color="auto" w:sz="4"/>
-          <w:right w:val="single" w:color="auto" w:sz="4"/>
-          <w:insideH w:val="single" w:color="auto" w:sz="4"/>
-          <w:insideV w:val="single" w:color="auto" w:sz="4"/>
-        </w:tblBorders>
-      </w:tblPr>
-      <w:tblGrid>
-        <w:gridCol w:w="9026"/>
-      </w:tblGrid>
-      <w:tr>
-        <w:tc>
-          <w:tcPr>
-            <w:tcW w:type="dxa" w:w="9026"/>
-            <w:tcBorders>
-              <w:top w:val="dashed" w:color="888888" w:sz="6"/>
-              <w:left w:val="dashed" w:color="888888" w:sz="6"/>
-              <w:bottom w:val="dashed" w:color="888888" w:sz="6"/>
-              <w:right w:val="dashed" w:color="888888" w:sz="6"/>
-            </w:tcBorders>
-            <w:shd w:fill="F2F2F2" w:val="clear"/>
-            <w:tcMar>
-              <w:top w:type="dxa" w:w="220"/>
-              <w:left w:type="dxa" w:w="220"/>
-              <w:bottom w:type="dxa" w:w="220"/>
-              <w:right w:type="dxa" w:w="220"/>
-            </w:tcMar>
-            <w:vAlign w:val="center"/>
-          </w:tcPr>
-          <w:p>
-            <w:pPr>
-              <w:jc w:val="center"/>
-            </w:pPr>
-            <w:r>
-              <w:rPr>
-                <w:rFonts w:ascii="Times New Roman" w:cs="Times New Roman" w:eastAsia="Times New Roman" w:hAnsi="Times New Roman"/>
-                <w:i/>
-                <w:iCs/>
-                <w:color w:val="666666"/>
-                <w:sz w:val="20"/>
-                <w:szCs w:val="20"/>
-              </w:rPr>
-              <w:t xml:space="preserve">[ Image Placeholder: Figure 3.1: Full-Stack Layered Architecture and Data Flow — Taskinator ]</w:t>
-            </w:r>
-          </w:p>
-        </w:tc>
-      </w:tr>
-    </w:tbl>
+    <w:p>
+      <w:pPr>
+        <w:spacing w:after="120" w:before="120"/>
+        <w:jc w:val="center"/>
+      </w:pPr>
+      <w:r>
+        <w:drawing>
+          <wp:inline distT="0" distB="0" distL="0" distR="0">
+            <wp:extent cx="5715000" cy="5457825"/>
+            <wp:effectExtent t="0" r="0" b="0" l="0"/>
+            <wp:docPr id="1" name="" descr="" title=""/>
+            <wp:cNvGraphicFramePr>
+              <a:graphicFrameLocks xmlns:a="http://schemas.openxmlformats.org/drawingml/2006/main" noChangeAspect="1"/>
+            </wp:cNvGraphicFramePr>
+            <a:graphic xmlns:a="http://schemas.openxmlformats.org/drawingml/2006/main">
+              <a:graphicData uri="http://schemas.openxmlformats.org/drawingml/2006/picture">
+                <pic:pic xmlns:pic="http://schemas.openxmlformats.org/drawingml/2006/picture">
+                  <pic:nvPicPr>
+                    <pic:cNvPr id="0" name="" descr=""/>
+                    <pic:cNvPicPr>
+                      <a:picLocks noChangeAspect="1" noChangeArrowheads="1"/>
+                    </pic:cNvPicPr>
+                  </pic:nvPicPr>
+                  <pic:blipFill>
+                    <a:blip r:embed="rId9" cstate="none"/>
+                    <a:srcRect/>
+                    <a:stretch>
+                      <a:fillRect/>
+                    </a:stretch>
+                  </pic:blipFill>
+                  <pic:spPr bwMode="auto">
+                    <a:xfrm>
+                      <a:off x="0" y="0"/>
+                      <a:ext cx="5715000" cy="5457825"/>
+                    </a:xfrm>
+                    <a:prstGeom prst="rect">
+                      <a:avLst/>
+                    </a:prstGeom>
+                  </pic:spPr>
+                </pic:pic>
+              </a:graphicData>
+            </a:graphic>
+          </wp:inline>
+        </w:drawing>
+      </w:r>
+    </w:p>
     <w:p>
       <w:pPr>
         <w:spacing w:after="240" w:before="80"/>
@@ -5026,59 +4998,52 @@
         <w:t xml:space="preserve"/>
       </w:r>
     </w:p>
-    <w:tbl>
-      <w:tblPr>
-        <w:tblW w:type="dxa" w:w="9026"/>
-        <w:tblBorders>
-          <w:top w:val="single" w:color="auto" w:sz="4"/>
-          <w:left w:val="single" w:color="auto" w:sz="4"/>
-          <w:bottom w:val="single" w:color="auto" w:sz="4"/>
-          <w:right w:val="single" w:color="auto" w:sz="4"/>
-          <w:insideH w:val="single" w:color="auto" w:sz="4"/>
-          <w:insideV w:val="single" w:color="auto" w:sz="4"/>
-        </w:tblBorders>
-      </w:tblPr>
-      <w:tblGrid>
-        <w:gridCol w:w="9026"/>
-      </w:tblGrid>
-      <w:tr>
-        <w:tc>
-          <w:tcPr>
-            <w:tcW w:type="dxa" w:w="9026"/>
-            <w:tcBorders>
-              <w:top w:val="dashed" w:color="888888" w:sz="6"/>
-              <w:left w:val="dashed" w:color="888888" w:sz="6"/>
-              <w:bottom w:val="dashed" w:color="888888" w:sz="6"/>
-              <w:right w:val="dashed" w:color="888888" w:sz="6"/>
-            </w:tcBorders>
-            <w:shd w:fill="F2F2F2" w:val="clear"/>
-            <w:tcMar>
-              <w:top w:type="dxa" w:w="220"/>
-              <w:left w:type="dxa" w:w="220"/>
-              <w:bottom w:type="dxa" w:w="220"/>
-              <w:right w:type="dxa" w:w="220"/>
-            </w:tcMar>
-            <w:vAlign w:val="center"/>
-          </w:tcPr>
-          <w:p>
-            <w:pPr>
-              <w:jc w:val="center"/>
-            </w:pPr>
-            <w:r>
-              <w:rPr>
-                <w:rFonts w:ascii="Times New Roman" w:cs="Times New Roman" w:eastAsia="Times New Roman" w:hAnsi="Times New Roman"/>
-                <w:i/>
-                <w:iCs/>
-                <w:color w:val="666666"/>
-                <w:sz w:val="20"/>
-                <w:szCs w:val="20"/>
-              </w:rPr>
-              <w:t xml:space="preserve">[ Image Placeholder: Figure 3.2: Core Domain Entity-Relationship (ER) Model ]</w:t>
-            </w:r>
-          </w:p>
-        </w:tc>
-      </w:tr>
-    </w:tbl>
+    <w:p>
+      <w:pPr>
+        <w:spacing w:after="120" w:before="120"/>
+        <w:jc w:val="center"/>
+      </w:pPr>
+      <w:r>
+        <w:drawing>
+          <wp:inline distT="0" distB="0" distL="0" distR="0">
+            <wp:extent cx="5715000" cy="4105275"/>
+            <wp:effectExtent t="0" r="0" b="0" l="0"/>
+            <wp:docPr id="1" name="" descr="" title=""/>
+            <wp:cNvGraphicFramePr>
+              <a:graphicFrameLocks xmlns:a="http://schemas.openxmlformats.org/drawingml/2006/main" noChangeAspect="1"/>
+            </wp:cNvGraphicFramePr>
+            <a:graphic xmlns:a="http://schemas.openxmlformats.org/drawingml/2006/main">
+              <a:graphicData uri="http://schemas.openxmlformats.org/drawingml/2006/picture">
+                <pic:pic xmlns:pic="http://schemas.openxmlformats.org/drawingml/2006/picture">
+                  <pic:nvPicPr>
+                    <pic:cNvPr id="0" name="" descr=""/>
+                    <pic:cNvPicPr>
+                      <a:picLocks noChangeAspect="1" noChangeArrowheads="1"/>
+                    </pic:cNvPicPr>
+                  </pic:nvPicPr>
+                  <pic:blipFill>
+                    <a:blip r:embed="rId10" cstate="none"/>
+                    <a:srcRect/>
+                    <a:stretch>
+                      <a:fillRect/>
+                    </a:stretch>
+                  </pic:blipFill>
+                  <pic:spPr bwMode="auto">
+                    <a:xfrm>
+                      <a:off x="0" y="0"/>
+                      <a:ext cx="5715000" cy="4105275"/>
+                    </a:xfrm>
+                    <a:prstGeom prst="rect">
+                      <a:avLst/>
+                    </a:prstGeom>
+                  </pic:spPr>
+                </pic:pic>
+              </a:graphicData>
+            </a:graphic>
+          </wp:inline>
+        </w:drawing>
+      </w:r>
+    </w:p>
     <w:p>
       <w:pPr>
         <w:spacing w:after="240" w:before="80"/>
@@ -5349,59 +5314,52 @@
         <w:t xml:space="preserve"/>
       </w:r>
     </w:p>
-    <w:tbl>
-      <w:tblPr>
-        <w:tblW w:type="dxa" w:w="9026"/>
-        <w:tblBorders>
-          <w:top w:val="single" w:color="auto" w:sz="4"/>
-          <w:left w:val="single" w:color="auto" w:sz="4"/>
-          <w:bottom w:val="single" w:color="auto" w:sz="4"/>
-          <w:right w:val="single" w:color="auto" w:sz="4"/>
-          <w:insideH w:val="single" w:color="auto" w:sz="4"/>
-          <w:insideV w:val="single" w:color="auto" w:sz="4"/>
-        </w:tblBorders>
-      </w:tblPr>
-      <w:tblGrid>
-        <w:gridCol w:w="9026"/>
-      </w:tblGrid>
-      <w:tr>
-        <w:tc>
-          <w:tcPr>
-            <w:tcW w:type="dxa" w:w="9026"/>
-            <w:tcBorders>
-              <w:top w:val="dashed" w:color="888888" w:sz="6"/>
-              <w:left w:val="dashed" w:color="888888" w:sz="6"/>
-              <w:bottom w:val="dashed" w:color="888888" w:sz="6"/>
-              <w:right w:val="dashed" w:color="888888" w:sz="6"/>
-            </w:tcBorders>
-            <w:shd w:fill="F2F2F2" w:val="clear"/>
-            <w:tcMar>
-              <w:top w:type="dxa" w:w="220"/>
-              <w:left w:type="dxa" w:w="220"/>
-              <w:bottom w:type="dxa" w:w="220"/>
-              <w:right w:type="dxa" w:w="220"/>
-            </w:tcMar>
-            <w:vAlign w:val="center"/>
-          </w:tcPr>
-          <w:p>
-            <w:pPr>
-              <w:jc w:val="center"/>
-            </w:pPr>
-            <w:r>
-              <w:rPr>
-                <w:rFonts w:ascii="Times New Roman" w:cs="Times New Roman" w:eastAsia="Times New Roman" w:hAnsi="Times New Roman"/>
-                <w:i/>
-                <w:iCs/>
-                <w:color w:val="666666"/>
-                <w:sz w:val="20"/>
-                <w:szCs w:val="20"/>
-              </w:rPr>
-              <w:t xml:space="preserve">[ Image Placeholder: Figure 3.3: Task Reachability Engine — Closure Table Cross-Join Expansion ]</w:t>
-            </w:r>
-          </w:p>
-        </w:tc>
-      </w:tr>
-    </w:tbl>
+    <w:p>
+      <w:pPr>
+        <w:spacing w:after="120" w:before="120"/>
+        <w:jc w:val="center"/>
+      </w:pPr>
+      <w:r>
+        <w:drawing>
+          <wp:inline distT="0" distB="0" distL="0" distR="0">
+            <wp:extent cx="2800350" cy="4781550"/>
+            <wp:effectExtent t="0" r="0" b="0" l="0"/>
+            <wp:docPr id="1" name="" descr="" title=""/>
+            <wp:cNvGraphicFramePr>
+              <a:graphicFrameLocks xmlns:a="http://schemas.openxmlformats.org/drawingml/2006/main" noChangeAspect="1"/>
+            </wp:cNvGraphicFramePr>
+            <a:graphic xmlns:a="http://schemas.openxmlformats.org/drawingml/2006/main">
+              <a:graphicData uri="http://schemas.openxmlformats.org/drawingml/2006/picture">
+                <pic:pic xmlns:pic="http://schemas.openxmlformats.org/drawingml/2006/picture">
+                  <pic:nvPicPr>
+                    <pic:cNvPr id="0" name="" descr=""/>
+                    <pic:cNvPicPr>
+                      <a:picLocks noChangeAspect="1" noChangeArrowheads="1"/>
+                    </pic:cNvPicPr>
+                  </pic:nvPicPr>
+                  <pic:blipFill>
+                    <a:blip r:embed="rId11" cstate="none"/>
+                    <a:srcRect/>
+                    <a:stretch>
+                      <a:fillRect/>
+                    </a:stretch>
+                  </pic:blipFill>
+                  <pic:spPr bwMode="auto">
+                    <a:xfrm>
+                      <a:off x="0" y="0"/>
+                      <a:ext cx="2800350" cy="4781550"/>
+                    </a:xfrm>
+                    <a:prstGeom prst="rect">
+                      <a:avLst/>
+                    </a:prstGeom>
+                  </pic:spPr>
+                </pic:pic>
+              </a:graphicData>
+            </a:graphic>
+          </wp:inline>
+        </w:drawing>
+      </w:r>
+    </w:p>
     <w:p>
       <w:pPr>
         <w:spacing w:after="240" w:before="80"/>
@@ -11173,59 +11131,52 @@
         <w:t xml:space="preserve"/>
       </w:r>
     </w:p>
-    <w:tbl>
-      <w:tblPr>
-        <w:tblW w:type="dxa" w:w="9026"/>
-        <w:tblBorders>
-          <w:top w:val="single" w:color="auto" w:sz="4"/>
-          <w:left w:val="single" w:color="auto" w:sz="4"/>
-          <w:bottom w:val="single" w:color="auto" w:sz="4"/>
-          <w:right w:val="single" w:color="auto" w:sz="4"/>
-          <w:insideH w:val="single" w:color="auto" w:sz="4"/>
-          <w:insideV w:val="single" w:color="auto" w:sz="4"/>
-        </w:tblBorders>
-      </w:tblPr>
-      <w:tblGrid>
-        <w:gridCol w:w="9026"/>
-      </w:tblGrid>
-      <w:tr>
-        <w:tc>
-          <w:tcPr>
-            <w:tcW w:type="dxa" w:w="9026"/>
-            <w:tcBorders>
-              <w:top w:val="dashed" w:color="888888" w:sz="6"/>
-              <w:left w:val="dashed" w:color="888888" w:sz="6"/>
-              <w:bottom w:val="dashed" w:color="888888" w:sz="6"/>
-              <w:right w:val="dashed" w:color="888888" w:sz="6"/>
-            </w:tcBorders>
-            <w:shd w:fill="F2F2F2" w:val="clear"/>
-            <w:tcMar>
-              <w:top w:type="dxa" w:w="220"/>
-              <w:left w:type="dxa" w:w="220"/>
-              <w:bottom w:type="dxa" w:w="220"/>
-              <w:right w:type="dxa" w:w="220"/>
-            </w:tcMar>
-            <w:vAlign w:val="center"/>
-          </w:tcPr>
-          <w:p>
-            <w:pPr>
-              <w:jc w:val="center"/>
-            </w:pPr>
-            <w:r>
-              <w:rPr>
-                <w:rFonts w:ascii="Times New Roman" w:cs="Times New Roman" w:eastAsia="Times New Roman" w:hAnsi="Times New Roman"/>
-                <w:i/>
-                <w:iCs/>
-                <w:color w:val="666666"/>
-                <w:sz w:val="20"/>
-                <w:szCs w:val="20"/>
-              </w:rPr>
-              <w:t xml:space="preserve">[ Image Placeholder: Figure 4.1: Transactional Outbox Workflow using wCTE ]</w:t>
-            </w:r>
-          </w:p>
-        </w:tc>
-      </w:tr>
-    </w:tbl>
+    <w:p>
+      <w:pPr>
+        <w:spacing w:after="120" w:before="120"/>
+        <w:jc w:val="center"/>
+      </w:pPr>
+      <w:r>
+        <w:drawing>
+          <wp:inline distT="0" distB="0" distL="0" distR="0">
+            <wp:extent cx="5715000" cy="4972050"/>
+            <wp:effectExtent t="0" r="0" b="0" l="0"/>
+            <wp:docPr id="1" name="" descr="" title=""/>
+            <wp:cNvGraphicFramePr>
+              <a:graphicFrameLocks xmlns:a="http://schemas.openxmlformats.org/drawingml/2006/main" noChangeAspect="1"/>
+            </wp:cNvGraphicFramePr>
+            <a:graphic xmlns:a="http://schemas.openxmlformats.org/drawingml/2006/main">
+              <a:graphicData uri="http://schemas.openxmlformats.org/drawingml/2006/picture">
+                <pic:pic xmlns:pic="http://schemas.openxmlformats.org/drawingml/2006/picture">
+                  <pic:nvPicPr>
+                    <pic:cNvPr id="0" name="" descr=""/>
+                    <pic:cNvPicPr>
+                      <a:picLocks noChangeAspect="1" noChangeArrowheads="1"/>
+                    </pic:cNvPicPr>
+                  </pic:nvPicPr>
+                  <pic:blipFill>
+                    <a:blip r:embed="rId12" cstate="none"/>
+                    <a:srcRect/>
+                    <a:stretch>
+                      <a:fillRect/>
+                    </a:stretch>
+                  </pic:blipFill>
+                  <pic:spPr bwMode="auto">
+                    <a:xfrm>
+                      <a:off x="0" y="0"/>
+                      <a:ext cx="5715000" cy="4972050"/>
+                    </a:xfrm>
+                    <a:prstGeom prst="rect">
+                      <a:avLst/>
+                    </a:prstGeom>
+                  </pic:spPr>
+                </pic:pic>
+              </a:graphicData>
+            </a:graphic>
+          </wp:inline>
+        </w:drawing>
+      </w:r>
+    </w:p>
     <w:p>
       <w:pPr>
         <w:spacing w:after="240" w:before="80"/>
@@ -11564,59 +11515,52 @@
         <w:t xml:space="preserve"/>
       </w:r>
     </w:p>
-    <w:tbl>
-      <w:tblPr>
-        <w:tblW w:type="dxa" w:w="9026"/>
-        <w:tblBorders>
-          <w:top w:val="single" w:color="auto" w:sz="4"/>
-          <w:left w:val="single" w:color="auto" w:sz="4"/>
-          <w:bottom w:val="single" w:color="auto" w:sz="4"/>
-          <w:right w:val="single" w:color="auto" w:sz="4"/>
-          <w:insideH w:val="single" w:color="auto" w:sz="4"/>
-          <w:insideV w:val="single" w:color="auto" w:sz="4"/>
-        </w:tblBorders>
-      </w:tblPr>
-      <w:tblGrid>
-        <w:gridCol w:w="9026"/>
-      </w:tblGrid>
-      <w:tr>
-        <w:tc>
-          <w:tcPr>
-            <w:tcW w:type="dxa" w:w="9026"/>
-            <w:tcBorders>
-              <w:top w:val="dashed" w:color="888888" w:sz="6"/>
-              <w:left w:val="dashed" w:color="888888" w:sz="6"/>
-              <w:bottom w:val="dashed" w:color="888888" w:sz="6"/>
-              <w:right w:val="dashed" w:color="888888" w:sz="6"/>
-            </w:tcBorders>
-            <w:shd w:fill="F2F2F2" w:val="clear"/>
-            <w:tcMar>
-              <w:top w:type="dxa" w:w="220"/>
-              <w:left w:type="dxa" w:w="220"/>
-              <w:bottom w:type="dxa" w:w="220"/>
-              <w:right w:type="dxa" w:w="220"/>
-            </w:tcMar>
-            <w:vAlign w:val="center"/>
-          </w:tcPr>
-          <w:p>
-            <w:pPr>
-              <w:jc w:val="center"/>
-            </w:pPr>
-            <w:r>
-              <w:rPr>
-                <w:rFonts w:ascii="Times New Roman" w:cs="Times New Roman" w:eastAsia="Times New Roman" w:hAnsi="Times New Roman"/>
-                <w:i/>
-                <w:iCs/>
-                <w:color w:val="666666"/>
-                <w:sz w:val="20"/>
-                <w:szCs w:val="20"/>
-              </w:rPr>
-              <w:t xml:space="preserve">[ Image Placeholder: Figure 4.2: Concurrent Outbox Polling: Mitigating the Thundering Herd with SKIP LOCKED ]</w:t>
-            </w:r>
-          </w:p>
-        </w:tc>
-      </w:tr>
-    </w:tbl>
+    <w:p>
+      <w:pPr>
+        <w:spacing w:after="120" w:before="120"/>
+        <w:jc w:val="center"/>
+      </w:pPr>
+      <w:r>
+        <w:drawing>
+          <wp:inline distT="0" distB="0" distL="0" distR="0">
+            <wp:extent cx="5715000" cy="3181350"/>
+            <wp:effectExtent t="0" r="0" b="0" l="0"/>
+            <wp:docPr id="1" name="" descr="" title=""/>
+            <wp:cNvGraphicFramePr>
+              <a:graphicFrameLocks xmlns:a="http://schemas.openxmlformats.org/drawingml/2006/main" noChangeAspect="1"/>
+            </wp:cNvGraphicFramePr>
+            <a:graphic xmlns:a="http://schemas.openxmlformats.org/drawingml/2006/main">
+              <a:graphicData uri="http://schemas.openxmlformats.org/drawingml/2006/picture">
+                <pic:pic xmlns:pic="http://schemas.openxmlformats.org/drawingml/2006/picture">
+                  <pic:nvPicPr>
+                    <pic:cNvPr id="0" name="" descr=""/>
+                    <pic:cNvPicPr>
+                      <a:picLocks noChangeAspect="1" noChangeArrowheads="1"/>
+                    </pic:cNvPicPr>
+                  </pic:nvPicPr>
+                  <pic:blipFill>
+                    <a:blip r:embed="rId13" cstate="none"/>
+                    <a:srcRect/>
+                    <a:stretch>
+                      <a:fillRect/>
+                    </a:stretch>
+                  </pic:blipFill>
+                  <pic:spPr bwMode="auto">
+                    <a:xfrm>
+                      <a:off x="0" y="0"/>
+                      <a:ext cx="5715000" cy="3181350"/>
+                    </a:xfrm>
+                    <a:prstGeom prst="rect">
+                      <a:avLst/>
+                    </a:prstGeom>
+                  </pic:spPr>
+                </pic:pic>
+              </a:graphicData>
+            </a:graphic>
+          </wp:inline>
+        </w:drawing>
+      </w:r>
+    </w:p>
     <w:p>
       <w:pPr>
         <w:spacing w:after="240" w:before="80"/>
@@ -11789,59 +11733,52 @@
         <w:t xml:space="preserve"/>
       </w:r>
     </w:p>
-    <w:tbl>
-      <w:tblPr>
-        <w:tblW w:type="dxa" w:w="9026"/>
-        <w:tblBorders>
-          <w:top w:val="single" w:color="auto" w:sz="4"/>
-          <w:left w:val="single" w:color="auto" w:sz="4"/>
-          <w:bottom w:val="single" w:color="auto" w:sz="4"/>
-          <w:right w:val="single" w:color="auto" w:sz="4"/>
-          <w:insideH w:val="single" w:color="auto" w:sz="4"/>
-          <w:insideV w:val="single" w:color="auto" w:sz="4"/>
-        </w:tblBorders>
-      </w:tblPr>
-      <w:tblGrid>
-        <w:gridCol w:w="9026"/>
-      </w:tblGrid>
-      <w:tr>
-        <w:tc>
-          <w:tcPr>
-            <w:tcW w:type="dxa" w:w="9026"/>
-            <w:tcBorders>
-              <w:top w:val="dashed" w:color="888888" w:sz="6"/>
-              <w:left w:val="dashed" w:color="888888" w:sz="6"/>
-              <w:bottom w:val="dashed" w:color="888888" w:sz="6"/>
-              <w:right w:val="dashed" w:color="888888" w:sz="6"/>
-            </w:tcBorders>
-            <w:shd w:fill="F2F2F2" w:val="clear"/>
-            <w:tcMar>
-              <w:top w:type="dxa" w:w="220"/>
-              <w:left w:type="dxa" w:w="220"/>
-              <w:bottom w:type="dxa" w:w="220"/>
-              <w:right w:type="dxa" w:w="220"/>
-            </w:tcMar>
-            <w:vAlign w:val="center"/>
-          </w:tcPr>
-          <w:p>
-            <w:pPr>
-              <w:jc w:val="center"/>
-            </w:pPr>
-            <w:r>
-              <w:rPr>
-                <w:rFonts w:ascii="Times New Roman" w:cs="Times New Roman" w:eastAsia="Times New Roman" w:hAnsi="Times New Roman"/>
-                <w:i/>
-                <w:iCs/>
-                <w:color w:val="666666"/>
-                <w:sz w:val="20"/>
-                <w:szCs w:val="20"/>
-              </w:rPr>
-              <w:t xml:space="preserve">[ Image Placeholder: Figure 4.3: Smart Batch Aggregator Data Flow and Semantic Folding ]</w:t>
-            </w:r>
-          </w:p>
-        </w:tc>
-      </w:tr>
-    </w:tbl>
+    <w:p>
+      <w:pPr>
+        <w:spacing w:after="120" w:before="120"/>
+        <w:jc w:val="center"/>
+      </w:pPr>
+      <w:r>
+        <w:drawing>
+          <wp:inline distT="0" distB="0" distL="0" distR="0">
+            <wp:extent cx="5715000" cy="1533525"/>
+            <wp:effectExtent t="0" r="0" b="0" l="0"/>
+            <wp:docPr id="1" name="" descr="" title=""/>
+            <wp:cNvGraphicFramePr>
+              <a:graphicFrameLocks xmlns:a="http://schemas.openxmlformats.org/drawingml/2006/main" noChangeAspect="1"/>
+            </wp:cNvGraphicFramePr>
+            <a:graphic xmlns:a="http://schemas.openxmlformats.org/drawingml/2006/main">
+              <a:graphicData uri="http://schemas.openxmlformats.org/drawingml/2006/picture">
+                <pic:pic xmlns:pic="http://schemas.openxmlformats.org/drawingml/2006/picture">
+                  <pic:nvPicPr>
+                    <pic:cNvPr id="0" name="" descr=""/>
+                    <pic:cNvPicPr>
+                      <a:picLocks noChangeAspect="1" noChangeArrowheads="1"/>
+                    </pic:cNvPicPr>
+                  </pic:nvPicPr>
+                  <pic:blipFill>
+                    <a:blip r:embed="rId14" cstate="none"/>
+                    <a:srcRect/>
+                    <a:stretch>
+                      <a:fillRect/>
+                    </a:stretch>
+                  </pic:blipFill>
+                  <pic:spPr bwMode="auto">
+                    <a:xfrm>
+                      <a:off x="0" y="0"/>
+                      <a:ext cx="5715000" cy="1533525"/>
+                    </a:xfrm>
+                    <a:prstGeom prst="rect">
+                      <a:avLst/>
+                    </a:prstGeom>
+                  </pic:spPr>
+                </pic:pic>
+              </a:graphicData>
+            </a:graphic>
+          </wp:inline>
+        </w:drawing>
+      </w:r>
+    </w:p>
     <w:p>
       <w:pPr>
         <w:spacing w:after="240" w:before="80"/>
@@ -12313,59 +12250,52 @@
         <w:t xml:space="preserve"/>
       </w:r>
     </w:p>
-    <w:tbl>
-      <w:tblPr>
-        <w:tblW w:type="dxa" w:w="9026"/>
-        <w:tblBorders>
-          <w:top w:val="single" w:color="auto" w:sz="4"/>
-          <w:left w:val="single" w:color="auto" w:sz="4"/>
-          <w:bottom w:val="single" w:color="auto" w:sz="4"/>
-          <w:right w:val="single" w:color="auto" w:sz="4"/>
-          <w:insideH w:val="single" w:color="auto" w:sz="4"/>
-          <w:insideV w:val="single" w:color="auto" w:sz="4"/>
-        </w:tblBorders>
-      </w:tblPr>
-      <w:tblGrid>
-        <w:gridCol w:w="9026"/>
-      </w:tblGrid>
-      <w:tr>
-        <w:tc>
-          <w:tcPr>
-            <w:tcW w:type="dxa" w:w="9026"/>
-            <w:tcBorders>
-              <w:top w:val="dashed" w:color="888888" w:sz="6"/>
-              <w:left w:val="dashed" w:color="888888" w:sz="6"/>
-              <w:bottom w:val="dashed" w:color="888888" w:sz="6"/>
-              <w:right w:val="dashed" w:color="888888" w:sz="6"/>
-            </w:tcBorders>
-            <w:shd w:fill="F2F2F2" w:val="clear"/>
-            <w:tcMar>
-              <w:top w:type="dxa" w:w="220"/>
-              <w:left w:type="dxa" w:w="220"/>
-              <w:bottom w:type="dxa" w:w="220"/>
-              <w:right w:type="dxa" w:w="220"/>
-            </w:tcMar>
-            <w:vAlign w:val="center"/>
-          </w:tcPr>
-          <w:p>
-            <w:pPr>
-              <w:jc w:val="center"/>
-            </w:pPr>
-            <w:r>
-              <w:rPr>
-                <w:rFonts w:ascii="Times New Roman" w:cs="Times New Roman" w:eastAsia="Times New Roman" w:hAnsi="Times New Roman"/>
-                <w:i/>
-                <w:iCs/>
-                <w:color w:val="666666"/>
-                <w:sz w:val="20"/>
-                <w:szCs w:val="20"/>
-              </w:rPr>
-              <w:t xml:space="preserve">[ Image Placeholder: Figure 4.4: Chunked Self-Signaling Deletion ("The Bubbling Effect") ]</w:t>
-            </w:r>
-          </w:p>
-        </w:tc>
-      </w:tr>
-    </w:tbl>
+    <w:p>
+      <w:pPr>
+        <w:spacing w:after="120" w:before="120"/>
+        <w:jc w:val="center"/>
+      </w:pPr>
+      <w:r>
+        <w:drawing>
+          <wp:inline distT="0" distB="0" distL="0" distR="0">
+            <wp:extent cx="5286375" cy="7639050"/>
+            <wp:effectExtent t="0" r="0" b="0" l="0"/>
+            <wp:docPr id="1" name="" descr="" title=""/>
+            <wp:cNvGraphicFramePr>
+              <a:graphicFrameLocks xmlns:a="http://schemas.openxmlformats.org/drawingml/2006/main" noChangeAspect="1"/>
+            </wp:cNvGraphicFramePr>
+            <a:graphic xmlns:a="http://schemas.openxmlformats.org/drawingml/2006/main">
+              <a:graphicData uri="http://schemas.openxmlformats.org/drawingml/2006/picture">
+                <pic:pic xmlns:pic="http://schemas.openxmlformats.org/drawingml/2006/picture">
+                  <pic:nvPicPr>
+                    <pic:cNvPr id="0" name="" descr=""/>
+                    <pic:cNvPicPr>
+                      <a:picLocks noChangeAspect="1" noChangeArrowheads="1"/>
+                    </pic:cNvPicPr>
+                  </pic:nvPicPr>
+                  <pic:blipFill>
+                    <a:blip r:embed="rId15" cstate="none"/>
+                    <a:srcRect/>
+                    <a:stretch>
+                      <a:fillRect/>
+                    </a:stretch>
+                  </pic:blipFill>
+                  <pic:spPr bwMode="auto">
+                    <a:xfrm>
+                      <a:off x="0" y="0"/>
+                      <a:ext cx="5286375" cy="7639050"/>
+                    </a:xfrm>
+                    <a:prstGeom prst="rect">
+                      <a:avLst/>
+                    </a:prstGeom>
+                  </pic:spPr>
+                </pic:pic>
+              </a:graphicData>
+            </a:graphic>
+          </wp:inline>
+        </w:drawing>
+      </w:r>
+    </w:p>
     <w:p>
       <w:pPr>
         <w:spacing w:after="240" w:before="80"/>
@@ -13146,59 +13076,52 @@
         <w:t xml:space="preserve"/>
       </w:r>
     </w:p>
-    <w:tbl>
-      <w:tblPr>
-        <w:tblW w:type="dxa" w:w="9026"/>
-        <w:tblBorders>
-          <w:top w:val="single" w:color="auto" w:sz="4"/>
-          <w:left w:val="single" w:color="auto" w:sz="4"/>
-          <w:bottom w:val="single" w:color="auto" w:sz="4"/>
-          <w:right w:val="single" w:color="auto" w:sz="4"/>
-          <w:insideH w:val="single" w:color="auto" w:sz="4"/>
-          <w:insideV w:val="single" w:color="auto" w:sz="4"/>
-        </w:tblBorders>
-      </w:tblPr>
-      <w:tblGrid>
-        <w:gridCol w:w="9026"/>
-      </w:tblGrid>
-      <w:tr>
-        <w:tc>
-          <w:tcPr>
-            <w:tcW w:type="dxa" w:w="9026"/>
-            <w:tcBorders>
-              <w:top w:val="dashed" w:color="888888" w:sz="6"/>
-              <w:left w:val="dashed" w:color="888888" w:sz="6"/>
-              <w:bottom w:val="dashed" w:color="888888" w:sz="6"/>
-              <w:right w:val="dashed" w:color="888888" w:sz="6"/>
-            </w:tcBorders>
-            <w:shd w:fill="F2F2F2" w:val="clear"/>
-            <w:tcMar>
-              <w:top w:type="dxa" w:w="220"/>
-              <w:left w:type="dxa" w:w="220"/>
-              <w:bottom w:type="dxa" w:w="220"/>
-              <w:right w:type="dxa" w:w="220"/>
-            </w:tcMar>
-            <w:vAlign w:val="center"/>
-          </w:tcPr>
-          <w:p>
-            <w:pPr>
-              <w:jc w:val="center"/>
-            </w:pPr>
-            <w:r>
-              <w:rPr>
-                <w:rFonts w:ascii="Times New Roman" w:cs="Times New Roman" w:eastAsia="Times New Roman" w:hAnsi="Times New Roman"/>
-                <w:i/>
-                <w:iCs/>
-                <w:color w:val="666666"/>
-                <w:sz w:val="20"/>
-                <w:szCs w:val="20"/>
-              </w:rPr>
-              <w:t xml:space="preserve">[ Image Placeholder: Figure 5.1: RBAC Authorization Flow ]</w:t>
-            </w:r>
-          </w:p>
-        </w:tc>
-      </w:tr>
-    </w:tbl>
+    <w:p>
+      <w:pPr>
+        <w:spacing w:after="120" w:before="120"/>
+        <w:jc w:val="center"/>
+      </w:pPr>
+      <w:r>
+        <w:drawing>
+          <wp:inline distT="0" distB="0" distL="0" distR="0">
+            <wp:extent cx="5715000" cy="5448300"/>
+            <wp:effectExtent t="0" r="0" b="0" l="0"/>
+            <wp:docPr id="1" name="" descr="" title=""/>
+            <wp:cNvGraphicFramePr>
+              <a:graphicFrameLocks xmlns:a="http://schemas.openxmlformats.org/drawingml/2006/main" noChangeAspect="1"/>
+            </wp:cNvGraphicFramePr>
+            <a:graphic xmlns:a="http://schemas.openxmlformats.org/drawingml/2006/main">
+              <a:graphicData uri="http://schemas.openxmlformats.org/drawingml/2006/picture">
+                <pic:pic xmlns:pic="http://schemas.openxmlformats.org/drawingml/2006/picture">
+                  <pic:nvPicPr>
+                    <pic:cNvPr id="0" name="" descr=""/>
+                    <pic:cNvPicPr>
+                      <a:picLocks noChangeAspect="1" noChangeArrowheads="1"/>
+                    </pic:cNvPicPr>
+                  </pic:nvPicPr>
+                  <pic:blipFill>
+                    <a:blip r:embed="rId16" cstate="none"/>
+                    <a:srcRect/>
+                    <a:stretch>
+                      <a:fillRect/>
+                    </a:stretch>
+                  </pic:blipFill>
+                  <pic:spPr bwMode="auto">
+                    <a:xfrm>
+                      <a:off x="0" y="0"/>
+                      <a:ext cx="5715000" cy="5448300"/>
+                    </a:xfrm>
+                    <a:prstGeom prst="rect">
+                      <a:avLst/>
+                    </a:prstGeom>
+                  </pic:spPr>
+                </pic:pic>
+              </a:graphicData>
+            </a:graphic>
+          </wp:inline>
+        </w:drawing>
+      </w:r>
+    </w:p>
     <w:p>
       <w:pPr>
         <w:spacing w:after="240" w:before="80"/>
@@ -13562,59 +13485,52 @@
         <w:t xml:space="preserve"/>
       </w:r>
     </w:p>
-    <w:tbl>
-      <w:tblPr>
-        <w:tblW w:type="dxa" w:w="9026"/>
-        <w:tblBorders>
-          <w:top w:val="single" w:color="auto" w:sz="4"/>
-          <w:left w:val="single" w:color="auto" w:sz="4"/>
-          <w:bottom w:val="single" w:color="auto" w:sz="4"/>
-          <w:right w:val="single" w:color="auto" w:sz="4"/>
-          <w:insideH w:val="single" w:color="auto" w:sz="4"/>
-          <w:insideV w:val="single" w:color="auto" w:sz="4"/>
-        </w:tblBorders>
-      </w:tblPr>
-      <w:tblGrid>
-        <w:gridCol w:w="9026"/>
-      </w:tblGrid>
-      <w:tr>
-        <w:tc>
-          <w:tcPr>
-            <w:tcW w:type="dxa" w:w="9026"/>
-            <w:tcBorders>
-              <w:top w:val="dashed" w:color="888888" w:sz="6"/>
-              <w:left w:val="dashed" w:color="888888" w:sz="6"/>
-              <w:bottom w:val="dashed" w:color="888888" w:sz="6"/>
-              <w:right w:val="dashed" w:color="888888" w:sz="6"/>
-            </w:tcBorders>
-            <w:shd w:fill="F2F2F2" w:val="clear"/>
-            <w:tcMar>
-              <w:top w:type="dxa" w:w="220"/>
-              <w:left w:type="dxa" w:w="220"/>
-              <w:bottom w:type="dxa" w:w="220"/>
-              <w:right w:type="dxa" w:w="220"/>
-            </w:tcMar>
-            <w:vAlign w:val="center"/>
-          </w:tcPr>
-          <w:p>
-            <w:pPr>
-              <w:jc w:val="center"/>
-            </w:pPr>
-            <w:r>
-              <w:rPr>
-                <w:rFonts w:ascii="Times New Roman" w:cs="Times New Roman" w:eastAsia="Times New Roman" w:hAnsi="Times New Roman"/>
-                <w:i/>
-                <w:iCs/>
-                <w:color w:val="666666"/>
-                <w:sz w:val="20"/>
-                <w:szCs w:val="20"/>
-              </w:rPr>
-              <w:t xml:space="preserve">[ Image Placeholder: Figure 6.1: Frontend UI State Machine ]</w:t>
-            </w:r>
-          </w:p>
-        </w:tc>
-      </w:tr>
-    </w:tbl>
+    <w:p>
+      <w:pPr>
+        <w:spacing w:after="120" w:before="120"/>
+        <w:jc w:val="center"/>
+      </w:pPr>
+      <w:r>
+        <w:drawing>
+          <wp:inline distT="0" distB="0" distL="0" distR="0">
+            <wp:extent cx="5715000" cy="2571750"/>
+            <wp:effectExtent t="0" r="0" b="0" l="0"/>
+            <wp:docPr id="1" name="" descr="" title=""/>
+            <wp:cNvGraphicFramePr>
+              <a:graphicFrameLocks xmlns:a="http://schemas.openxmlformats.org/drawingml/2006/main" noChangeAspect="1"/>
+            </wp:cNvGraphicFramePr>
+            <a:graphic xmlns:a="http://schemas.openxmlformats.org/drawingml/2006/main">
+              <a:graphicData uri="http://schemas.openxmlformats.org/drawingml/2006/picture">
+                <pic:pic xmlns:pic="http://schemas.openxmlformats.org/drawingml/2006/picture">
+                  <pic:nvPicPr>
+                    <pic:cNvPr id="0" name="" descr=""/>
+                    <pic:cNvPicPr>
+                      <a:picLocks noChangeAspect="1" noChangeArrowheads="1"/>
+                    </pic:cNvPicPr>
+                  </pic:nvPicPr>
+                  <pic:blipFill>
+                    <a:blip r:embed="rId17" cstate="none"/>
+                    <a:srcRect/>
+                    <a:stretch>
+                      <a:fillRect/>
+                    </a:stretch>
+                  </pic:blipFill>
+                  <pic:spPr bwMode="auto">
+                    <a:xfrm>
+                      <a:off x="0" y="0"/>
+                      <a:ext cx="5715000" cy="2571750"/>
+                    </a:xfrm>
+                    <a:prstGeom prst="rect">
+                      <a:avLst/>
+                    </a:prstGeom>
+                  </pic:spPr>
+                </pic:pic>
+              </a:graphicData>
+            </a:graphic>
+          </wp:inline>
+        </w:drawing>
+      </w:r>
+    </w:p>
     <w:p>
       <w:pPr>
         <w:spacing w:after="240" w:before="80"/>
@@ -13727,59 +13643,52 @@
         <w:t xml:space="preserve"/>
       </w:r>
     </w:p>
-    <w:tbl>
-      <w:tblPr>
-        <w:tblW w:type="dxa" w:w="9026"/>
-        <w:tblBorders>
-          <w:top w:val="single" w:color="auto" w:sz="4"/>
-          <w:left w:val="single" w:color="auto" w:sz="4"/>
-          <w:bottom w:val="single" w:color="auto" w:sz="4"/>
-          <w:right w:val="single" w:color="auto" w:sz="4"/>
-          <w:insideH w:val="single" w:color="auto" w:sz="4"/>
-          <w:insideV w:val="single" w:color="auto" w:sz="4"/>
-        </w:tblBorders>
-      </w:tblPr>
-      <w:tblGrid>
-        <w:gridCol w:w="9026"/>
-      </w:tblGrid>
-      <w:tr>
-        <w:tc>
-          <w:tcPr>
-            <w:tcW w:type="dxa" w:w="9026"/>
-            <w:tcBorders>
-              <w:top w:val="dashed" w:color="888888" w:sz="6"/>
-              <w:left w:val="dashed" w:color="888888" w:sz="6"/>
-              <w:bottom w:val="dashed" w:color="888888" w:sz="6"/>
-              <w:right w:val="dashed" w:color="888888" w:sz="6"/>
-            </w:tcBorders>
-            <w:shd w:fill="F2F2F2" w:val="clear"/>
-            <w:tcMar>
-              <w:top w:type="dxa" w:w="220"/>
-              <w:left w:type="dxa" w:w="220"/>
-              <w:bottom w:type="dxa" w:w="220"/>
-              <w:right w:type="dxa" w:w="220"/>
-            </w:tcMar>
-            <w:vAlign w:val="center"/>
-          </w:tcPr>
-          <w:p>
-            <w:pPr>
-              <w:jc w:val="center"/>
-            </w:pPr>
-            <w:r>
-              <w:rPr>
-                <w:rFonts w:ascii="Times New Roman" w:cs="Times New Roman" w:eastAsia="Times New Roman" w:hAnsi="Times New Roman"/>
-                <w:i/>
-                <w:iCs/>
-                <w:color w:val="666666"/>
-                <w:sz w:val="20"/>
-                <w:szCs w:val="20"/>
-              </w:rPr>
-              <w:t xml:space="preserve">[ Image Placeholder: Figure 6.2: Targeted Redis Routing for Real-time Server-Sent Events (SSE) ]</w:t>
-            </w:r>
-          </w:p>
-        </w:tc>
-      </w:tr>
-    </w:tbl>
+    <w:p>
+      <w:pPr>
+        <w:spacing w:after="120" w:before="120"/>
+        <w:jc w:val="center"/>
+      </w:pPr>
+      <w:r>
+        <w:drawing>
+          <wp:inline distT="0" distB="0" distL="0" distR="0">
+            <wp:extent cx="5715000" cy="2781300"/>
+            <wp:effectExtent t="0" r="0" b="0" l="0"/>
+            <wp:docPr id="1" name="" descr="" title=""/>
+            <wp:cNvGraphicFramePr>
+              <a:graphicFrameLocks xmlns:a="http://schemas.openxmlformats.org/drawingml/2006/main" noChangeAspect="1"/>
+            </wp:cNvGraphicFramePr>
+            <a:graphic xmlns:a="http://schemas.openxmlformats.org/drawingml/2006/main">
+              <a:graphicData uri="http://schemas.openxmlformats.org/drawingml/2006/picture">
+                <pic:pic xmlns:pic="http://schemas.openxmlformats.org/drawingml/2006/picture">
+                  <pic:nvPicPr>
+                    <pic:cNvPr id="0" name="" descr=""/>
+                    <pic:cNvPicPr>
+                      <a:picLocks noChangeAspect="1" noChangeArrowheads="1"/>
+                    </pic:cNvPicPr>
+                  </pic:nvPicPr>
+                  <pic:blipFill>
+                    <a:blip r:embed="rId18" cstate="none"/>
+                    <a:srcRect/>
+                    <a:stretch>
+                      <a:fillRect/>
+                    </a:stretch>
+                  </pic:blipFill>
+                  <pic:spPr bwMode="auto">
+                    <a:xfrm>
+                      <a:off x="0" y="0"/>
+                      <a:ext cx="5715000" cy="2781300"/>
+                    </a:xfrm>
+                    <a:prstGeom prst="rect">
+                      <a:avLst/>
+                    </a:prstGeom>
+                  </pic:spPr>
+                </pic:pic>
+              </a:graphicData>
+            </a:graphic>
+          </wp:inline>
+        </w:drawing>
+      </w:r>
+    </w:p>
     <w:p>
       <w:pPr>
         <w:spacing w:after="240" w:before="80"/>
@@ -13892,59 +13801,52 @@
         <w:t xml:space="preserve"/>
       </w:r>
     </w:p>
-    <w:tbl>
-      <w:tblPr>
-        <w:tblW w:type="dxa" w:w="9026"/>
-        <w:tblBorders>
-          <w:top w:val="single" w:color="auto" w:sz="4"/>
-          <w:left w:val="single" w:color="auto" w:sz="4"/>
-          <w:bottom w:val="single" w:color="auto" w:sz="4"/>
-          <w:right w:val="single" w:color="auto" w:sz="4"/>
-          <w:insideH w:val="single" w:color="auto" w:sz="4"/>
-          <w:insideV w:val="single" w:color="auto" w:sz="4"/>
-        </w:tblBorders>
-      </w:tblPr>
-      <w:tblGrid>
-        <w:gridCol w:w="9026"/>
-      </w:tblGrid>
-      <w:tr>
-        <w:tc>
-          <w:tcPr>
-            <w:tcW w:type="dxa" w:w="9026"/>
-            <w:tcBorders>
-              <w:top w:val="dashed" w:color="888888" w:sz="6"/>
-              <w:left w:val="dashed" w:color="888888" w:sz="6"/>
-              <w:bottom w:val="dashed" w:color="888888" w:sz="6"/>
-              <w:right w:val="dashed" w:color="888888" w:sz="6"/>
-            </w:tcBorders>
-            <w:shd w:fill="F2F2F2" w:val="clear"/>
-            <w:tcMar>
-              <w:top w:type="dxa" w:w="220"/>
-              <w:left w:type="dxa" w:w="220"/>
-              <w:bottom w:type="dxa" w:w="220"/>
-              <w:right w:type="dxa" w:w="220"/>
-            </w:tcMar>
-            <w:vAlign w:val="center"/>
-          </w:tcPr>
-          <w:p>
-            <w:pPr>
-              <w:jc w:val="center"/>
-            </w:pPr>
-            <w:r>
-              <w:rPr>
-                <w:rFonts w:ascii="Times New Roman" w:cs="Times New Roman" w:eastAsia="Times New Roman" w:hAnsi="Times New Roman"/>
-                <w:i/>
-                <w:iCs/>
-                <w:color w:val="666666"/>
-                <w:sz w:val="20"/>
-                <w:szCs w:val="20"/>
-              </w:rPr>
-              <w:t xml:space="preserve">[ Image Placeholder: Figure 6.3: Apollo Client SSE State Reconciliation Sequence ]</w:t>
-            </w:r>
-          </w:p>
-        </w:tc>
-      </w:tr>
-    </w:tbl>
+    <w:p>
+      <w:pPr>
+        <w:spacing w:after="120" w:before="120"/>
+        <w:jc w:val="center"/>
+      </w:pPr>
+      <w:r>
+        <w:drawing>
+          <wp:inline distT="0" distB="0" distL="0" distR="0">
+            <wp:extent cx="5715000" cy="1400175"/>
+            <wp:effectExtent t="0" r="0" b="0" l="0"/>
+            <wp:docPr id="1" name="" descr="" title=""/>
+            <wp:cNvGraphicFramePr>
+              <a:graphicFrameLocks xmlns:a="http://schemas.openxmlformats.org/drawingml/2006/main" noChangeAspect="1"/>
+            </wp:cNvGraphicFramePr>
+            <a:graphic xmlns:a="http://schemas.openxmlformats.org/drawingml/2006/main">
+              <a:graphicData uri="http://schemas.openxmlformats.org/drawingml/2006/picture">
+                <pic:pic xmlns:pic="http://schemas.openxmlformats.org/drawingml/2006/picture">
+                  <pic:nvPicPr>
+                    <pic:cNvPr id="0" name="" descr=""/>
+                    <pic:cNvPicPr>
+                      <a:picLocks noChangeAspect="1" noChangeArrowheads="1"/>
+                    </pic:cNvPicPr>
+                  </pic:nvPicPr>
+                  <pic:blipFill>
+                    <a:blip r:embed="rId19" cstate="none"/>
+                    <a:srcRect/>
+                    <a:stretch>
+                      <a:fillRect/>
+                    </a:stretch>
+                  </pic:blipFill>
+                  <pic:spPr bwMode="auto">
+                    <a:xfrm>
+                      <a:off x="0" y="0"/>
+                      <a:ext cx="5715000" cy="1400175"/>
+                    </a:xfrm>
+                    <a:prstGeom prst="rect">
+                      <a:avLst/>
+                    </a:prstGeom>
+                  </pic:spPr>
+                </pic:pic>
+              </a:graphicData>
+            </a:graphic>
+          </wp:inline>
+        </w:drawing>
+      </w:r>
+    </w:p>
     <w:p>
       <w:pPr>
         <w:spacing w:after="240" w:before="80"/>
@@ -14915,59 +14817,52 @@
         <w:t xml:space="preserve"/>
       </w:r>
     </w:p>
-    <w:tbl>
-      <w:tblPr>
-        <w:tblW w:type="dxa" w:w="9026"/>
-        <w:tblBorders>
-          <w:top w:val="single" w:color="auto" w:sz="4"/>
-          <w:left w:val="single" w:color="auto" w:sz="4"/>
-          <w:bottom w:val="single" w:color="auto" w:sz="4"/>
-          <w:right w:val="single" w:color="auto" w:sz="4"/>
-          <w:insideH w:val="single" w:color="auto" w:sz="4"/>
-          <w:insideV w:val="single" w:color="auto" w:sz="4"/>
-        </w:tblBorders>
-      </w:tblPr>
-      <w:tblGrid>
-        <w:gridCol w:w="9026"/>
-      </w:tblGrid>
-      <w:tr>
-        <w:tc>
-          <w:tcPr>
-            <w:tcW w:type="dxa" w:w="9026"/>
-            <w:tcBorders>
-              <w:top w:val="dashed" w:color="888888" w:sz="6"/>
-              <w:left w:val="dashed" w:color="888888" w:sz="6"/>
-              <w:bottom w:val="dashed" w:color="888888" w:sz="6"/>
-              <w:right w:val="dashed" w:color="888888" w:sz="6"/>
-            </w:tcBorders>
-            <w:shd w:fill="F2F2F2" w:val="clear"/>
-            <w:tcMar>
-              <w:top w:type="dxa" w:w="220"/>
-              <w:left w:type="dxa" w:w="220"/>
-              <w:bottom w:type="dxa" w:w="220"/>
-              <w:right w:type="dxa" w:w="220"/>
-            </w:tcMar>
-            <w:vAlign w:val="center"/>
-          </w:tcPr>
-          <w:p>
-            <w:pPr>
-              <w:jc w:val="center"/>
-            </w:pPr>
-            <w:r>
-              <w:rPr>
-                <w:rFonts w:ascii="Times New Roman" w:cs="Times New Roman" w:eastAsia="Times New Roman" w:hAnsi="Times New Roman"/>
-                <w:i/>
-                <w:iCs/>
-                <w:color w:val="666666"/>
-                <w:sz w:val="20"/>
-                <w:szCs w:val="20"/>
-              </w:rPr>
-              <w:t xml:space="preserve">[ Image Placeholder: Figure 7.1: Containerized Testing Architecture and Mutation Testing ]</w:t>
-            </w:r>
-          </w:p>
-        </w:tc>
-      </w:tr>
-    </w:tbl>
+    <w:p>
+      <w:pPr>
+        <w:spacing w:after="120" w:before="120"/>
+        <w:jc w:val="center"/>
+      </w:pPr>
+      <w:r>
+        <w:drawing>
+          <wp:inline distT="0" distB="0" distL="0" distR="0">
+            <wp:extent cx="4667250" cy="3648075"/>
+            <wp:effectExtent t="0" r="0" b="0" l="0"/>
+            <wp:docPr id="1" name="" descr="" title=""/>
+            <wp:cNvGraphicFramePr>
+              <a:graphicFrameLocks xmlns:a="http://schemas.openxmlformats.org/drawingml/2006/main" noChangeAspect="1"/>
+            </wp:cNvGraphicFramePr>
+            <a:graphic xmlns:a="http://schemas.openxmlformats.org/drawingml/2006/main">
+              <a:graphicData uri="http://schemas.openxmlformats.org/drawingml/2006/picture">
+                <pic:pic xmlns:pic="http://schemas.openxmlformats.org/drawingml/2006/picture">
+                  <pic:nvPicPr>
+                    <pic:cNvPr id="0" name="" descr=""/>
+                    <pic:cNvPicPr>
+                      <a:picLocks noChangeAspect="1" noChangeArrowheads="1"/>
+                    </pic:cNvPicPr>
+                  </pic:nvPicPr>
+                  <pic:blipFill>
+                    <a:blip r:embed="rId20" cstate="none"/>
+                    <a:srcRect/>
+                    <a:stretch>
+                      <a:fillRect/>
+                    </a:stretch>
+                  </pic:blipFill>
+                  <pic:spPr bwMode="auto">
+                    <a:xfrm>
+                      <a:off x="0" y="0"/>
+                      <a:ext cx="4667250" cy="3648075"/>
+                    </a:xfrm>
+                    <a:prstGeom prst="rect">
+                      <a:avLst/>
+                    </a:prstGeom>
+                  </pic:spPr>
+                </pic:pic>
+              </a:graphicData>
+            </a:graphic>
+          </wp:inline>
+        </w:drawing>
+      </w:r>
+    </w:p>
     <w:p>
       <w:pPr>
         <w:spacing w:after="240" w:before="80"/>

</xml_diff>

<commit_message>
chore: update thesis build artifact and replace old PDF version
</commit_message>
<xml_diff>
--- a/thesis/builder/taskinator_thesis_v2.docx
+++ b/thesis/builder/taskinator_thesis_v2.docx
@@ -119,7 +119,32 @@
           <w:sz w:val="24"/>
           <w:szCs w:val="24"/>
         </w:rPr>
-        <w:t>Kuchuk Borom Debbarma</w:t>
+        <w:t xml:space="preserve">Kuchuk </w:t>
+      </w:r>
+      <w:r>
+        <w:rPr>
+          <w:rFonts w:cs="Times New Roman"/>
+          <w:b/>
+          <w:bCs/>
+          <w:i w:val="0"/>
+          <w:iCs w:val="0"/>
+          <w:sz w:val="24"/>
+          <w:szCs w:val="24"/>
+          <w:lang w:val="en-US"/>
+        </w:rPr>
+        <w:t>Boram</w:t>
+      </w:r>
+      <w:r>
+        <w:rPr>
+          <w:rFonts w:ascii="Times New Roman" w:hAnsi="Times New Roman" w:eastAsia="Times New Roman" w:cs="Times New Roman"/>
+          <w:b/>
+          <w:bCs/>
+          <w:i w:val="0"/>
+          <w:iCs w:val="0"/>
+          <w:sz w:val="24"/>
+          <w:szCs w:val="24"/>
+        </w:rPr>
+        <w:t xml:space="preserve"> Debbarma</w:t>
       </w:r>
     </w:p>
     <w:p>
@@ -240,6 +265,12 @@
       <w:pPr>
         <w:spacing w:before="60" w:after="60"/>
         <w:jc w:val="center"/>
+        <w:rPr>
+          <w:rFonts w:hint="default"/>
+          <w:b w:val="0"/>
+          <w:bCs w:val="0"/>
+          <w:lang w:val="en-US"/>
+        </w:rPr>
       </w:pPr>
       <w:r>
         <w:rPr>
@@ -253,17 +284,15 @@
       </w:r>
       <w:r>
         <w:rPr>
-          <w:rFonts w:ascii="Times New Roman" w:hAnsi="Times New Roman" w:eastAsia="Times New Roman" w:cs="Times New Roman"/>
-          <w:sz w:val="22"/>
-          <w:szCs w:val="22"/>
-        </w:rPr>
-        <w:t>Coordinator CSE &amp; CA</w:t>
-      </w:r>
-    </w:p>
-    <w:p>
-      <w:pPr>
-        <w:spacing w:before="0" w:after="100"/>
-      </w:pPr>
+          <w:rFonts w:hint="default" w:cs="Times New Roman"/>
+          <w:b w:val="0"/>
+          <w:bCs w:val="0"/>
+          <w:sz w:val="22"/>
+          <w:szCs w:val="22"/>
+          <w:lang w:val="en-US"/>
+        </w:rPr>
+        <w:t>Head of Department</w:t>
+      </w:r>
     </w:p>
     <w:p>
       <w:pPr>
@@ -635,6 +664,11 @@
     <w:p>
       <w:pPr>
         <w:spacing w:before="0" w:after="80"/>
+        <w:rPr>
+          <w:rFonts w:ascii="Times New Roman" w:hAnsi="Times New Roman" w:eastAsia="Times New Roman" w:cs="Times New Roman"/>
+          <w:sz w:val="22"/>
+          <w:szCs w:val="22"/>
+        </w:rPr>
       </w:pPr>
       <w:r>
         <w:rPr>
@@ -652,22 +686,82 @@
           <w:sz w:val="22"/>
           <w:szCs w:val="22"/>
         </w:rPr>
-        <w:t>Kuchuk Borom Debbarma</w:t>
+        <w:t>Kuchuk Bor</w:t>
+      </w:r>
+      <w:r>
+        <w:rPr>
+          <w:rFonts w:hint="default" w:cs="Times New Roman"/>
+          <w:sz w:val="22"/>
+          <w:szCs w:val="22"/>
+          <w:lang w:val="en-US"/>
+        </w:rPr>
+        <w:t>a</w:t>
+      </w:r>
+      <w:r>
+        <w:rPr>
+          <w:rFonts w:ascii="Times New Roman" w:hAnsi="Times New Roman" w:eastAsia="Times New Roman" w:cs="Times New Roman"/>
+          <w:sz w:val="22"/>
+          <w:szCs w:val="22"/>
+        </w:rPr>
+        <w:t>m Debbarma</w:t>
       </w:r>
     </w:p>
     <w:p>
       <w:pPr>
         <w:spacing w:before="0" w:after="80"/>
-      </w:pPr>
-      <w:r>
-        <w:rPr>
-          <w:rFonts w:ascii="Times New Roman" w:hAnsi="Times New Roman" w:eastAsia="Times New Roman" w:cs="Times New Roman"/>
-          <w:b/>
-          <w:bCs/>
-          <w:sz w:val="22"/>
-          <w:szCs w:val="22"/>
-        </w:rPr>
-        <w:t>Department of CSE</w:t>
+        <w:rPr>
+          <w:rFonts w:hint="default" w:ascii="Times New Roman" w:hAnsi="Times New Roman" w:eastAsia="Times New Roman" w:cs="Times New Roman"/>
+          <w:sz w:val="22"/>
+          <w:szCs w:val="22"/>
+          <w:lang w:val="en-US"/>
+        </w:rPr>
+      </w:pPr>
+      <w:r>
+        <w:rPr>
+          <w:rFonts w:hint="default" w:ascii="Times New Roman Bold" w:hAnsi="Times New Roman Bold" w:cs="Times New Roman Bold"/>
+          <w:b/>
+          <w:bCs/>
+          <w:sz w:val="22"/>
+          <w:szCs w:val="22"/>
+          <w:lang w:val="en-US"/>
+        </w:rPr>
+        <w:t>ID</w:t>
+      </w:r>
+      <w:r>
+        <w:rPr>
+          <w:rFonts w:hint="default" w:cs="Times New Roman"/>
+          <w:sz w:val="22"/>
+          <w:szCs w:val="22"/>
+          <w:lang w:val="en-US"/>
+        </w:rPr>
+        <w:t>: 24IUT0600003</w:t>
+      </w:r>
+    </w:p>
+    <w:p>
+      <w:pPr>
+        <w:spacing w:before="0" w:after="80"/>
+      </w:pPr>
+      <w:r>
+        <w:rPr>
+          <w:rFonts w:ascii="Times New Roman" w:hAnsi="Times New Roman" w:eastAsia="Times New Roman" w:cs="Times New Roman"/>
+          <w:b/>
+          <w:bCs/>
+          <w:sz w:val="22"/>
+          <w:szCs w:val="22"/>
+        </w:rPr>
+        <w:t>Depart</w:t>
+      </w:r>
+      <w:bookmarkStart w:id="0" w:name="_GoBack"/>
+      <w:bookmarkEnd w:id="0"/>
+      <w:r>
+        <w:rPr>
+          <w:rFonts w:ascii="Times New Roman" w:hAnsi="Times New Roman" w:eastAsia="Times New Roman" w:cs="Times New Roman"/>
+          <w:b/>
+          <w:bCs/>
+          <w:sz w:val="22"/>
+          <w:szCs w:val="22"/>
+        </w:rPr>
+        <w:t>ment of CSE</w:t>
       </w:r>
     </w:p>
     <w:p>
@@ -806,7 +900,24 @@
           <w:sz w:val="22"/>
           <w:szCs w:val="22"/>
         </w:rPr>
-        <w:t>This is to certify that the project titled "Design and Implementation of a High-Throughput Event-Driven Project and Task Management Application" is the bonafide work carried out by Kuchuk Borom Debbarma student of M.Tech of Department of Computer Science and Engineering, during the Thesis report 2026, in partial fulfillment of the requirements for the award of the degree and that the project has not formed the basis for the award previously of any other degree, diploma, fellowship or any other similar title.</w:t>
+        <w:t xml:space="preserve">This is to certify that the project titled "Design and Implementation of a High-Throughput Event-Driven Project and Task Management Application" is the bonafide work carried out by Kuchuk </w:t>
+      </w:r>
+      <w:r>
+        <w:rPr>
+          <w:rFonts w:cs="Times New Roman"/>
+          <w:sz w:val="22"/>
+          <w:szCs w:val="22"/>
+          <w:lang w:val="en-US"/>
+        </w:rPr>
+        <w:t>Boram</w:t>
+      </w:r>
+      <w:r>
+        <w:rPr>
+          <w:rFonts w:ascii="Times New Roman" w:hAnsi="Times New Roman" w:eastAsia="Times New Roman" w:cs="Times New Roman"/>
+          <w:sz w:val="22"/>
+          <w:szCs w:val="22"/>
+        </w:rPr>
+        <w:t xml:space="preserve"> Debbarma student of M.Tech of Department of Computer Science and Engineering, during the Thesis report 2026, in partial fulfillment of the requirements for the award of the degree and that the project has not formed the basis for the award previously of any other degree, diploma, fellowship or any other similar title.</w:t>
       </w:r>
     </w:p>
     <w:p>
@@ -1246,7 +1357,7 @@
           <w:sz w:val="22"/>
           <w:szCs w:val="22"/>
         </w:rPr>
-        <w:t>for his able guidance and support in completing the project. A special thanks to the university administration, including the Principal, HOD, and Dean, for providing us with the necessary resources and opportunities to gain knowledge.</w:t>
+        <w:t>for his able guidance and support in completing the project. A special thanks to the university administration, including the Principal and Dean, for providing us with the necessary resources and opportunities to gain knowledge.</w:t>
       </w:r>
     </w:p>
     <w:p>
@@ -1288,31 +1399,160 @@
           <w:sz w:val="22"/>
           <w:szCs w:val="22"/>
         </w:rPr>
-        <w:t>Kuchuk Borom Debbarma</w:t>
+        <w:t xml:space="preserve">Kuchuk </w:t>
+      </w:r>
+      <w:r>
+        <w:rPr>
+          <w:rFonts w:cs="Times New Roman"/>
+          <w:sz w:val="22"/>
+          <w:szCs w:val="22"/>
+          <w:lang w:val="en-US"/>
+        </w:rPr>
+        <w:t>Boram</w:t>
+      </w:r>
+      <w:r>
+        <w:rPr>
+          <w:rFonts w:ascii="Times New Roman" w:hAnsi="Times New Roman" w:eastAsia="Times New Roman" w:cs="Times New Roman"/>
+          <w:sz w:val="22"/>
+          <w:szCs w:val="22"/>
+        </w:rPr>
+        <w:t xml:space="preserve"> Debbarma</w:t>
+      </w:r>
+      <w:r>
+        <w:rPr>
+          <w:rFonts w:hint="default" w:cs="Times New Roman"/>
+          <w:sz w:val="22"/>
+          <w:szCs w:val="22"/>
+          <w:lang w:val="en-US"/>
+        </w:rPr>
+        <w:t xml:space="preserve"> </w:t>
+      </w:r>
+      <w:r>
+        <w:rPr>
+          <w:rFonts w:hint="default" w:cs="Times New Roman"/>
+          <w:sz w:val="22"/>
+          <w:szCs w:val="22"/>
+          <w:lang w:val="en-US"/>
+        </w:rPr>
+        <w:tab/>
+      </w:r>
+      <w:r>
+        <w:rPr>
+          <w:rFonts w:hint="default" w:cs="Times New Roman"/>
+          <w:sz w:val="22"/>
+          <w:szCs w:val="22"/>
+          <w:lang w:val="en-US"/>
+        </w:rPr>
+        <w:tab/>
+      </w:r>
+      <w:r>
+        <w:rPr>
+          <w:rFonts w:hint="default" w:ascii="Times New Roman Bold" w:hAnsi="Times New Roman Bold" w:cs="Times New Roman Bold"/>
+          <w:b/>
+          <w:bCs/>
+          <w:sz w:val="22"/>
+          <w:szCs w:val="22"/>
+          <w:lang w:val="en-US"/>
+        </w:rPr>
+        <w:t>ID</w:t>
+      </w:r>
+      <w:r>
+        <w:rPr>
+          <w:rFonts w:hint="default" w:cs="Times New Roman"/>
+          <w:sz w:val="22"/>
+          <w:szCs w:val="22"/>
+          <w:lang w:val="en-US"/>
+        </w:rPr>
+        <w:t xml:space="preserve">: 24IUT0600003 </w:t>
+      </w:r>
+      <w:r>
+        <w:rPr>
+          <w:rFonts w:hint="default" w:cs="Times New Roman"/>
+          <w:sz w:val="22"/>
+          <w:szCs w:val="22"/>
+          <w:lang w:val="en-US"/>
+        </w:rPr>
+        <w:tab/>
+      </w:r>
+      <w:r>
+        <w:rPr>
+          <w:rFonts w:hint="default" w:cs="Times New Roman"/>
+          <w:sz w:val="22"/>
+          <w:szCs w:val="22"/>
+          <w:lang w:val="en-US"/>
+        </w:rPr>
+        <w:tab/>
+      </w:r>
+      <w:r>
+        <w:rPr>
+          <w:rFonts w:hint="default" w:cs="Times New Roman"/>
+          <w:sz w:val="22"/>
+          <w:szCs w:val="22"/>
+          <w:lang w:val="en-US"/>
+        </w:rPr>
+        <w:tab/>
+      </w:r>
+      <w:r>
+        <w:rPr>
+          <w:rFonts w:ascii="Times New Roman" w:hAnsi="Times New Roman" w:eastAsia="Times New Roman" w:cs="Times New Roman"/>
+          <w:b/>
+          <w:bCs/>
+          <w:sz w:val="22"/>
+          <w:szCs w:val="22"/>
+        </w:rPr>
+        <w:t xml:space="preserve">Course: </w:t>
+      </w:r>
+      <w:r>
+        <w:rPr>
+          <w:rFonts w:ascii="Times New Roman" w:hAnsi="Times New Roman" w:eastAsia="Times New Roman" w:cs="Times New Roman"/>
+          <w:sz w:val="22"/>
+          <w:szCs w:val="22"/>
+        </w:rPr>
+        <w:t>M.Tech CSE</w:t>
       </w:r>
     </w:p>
     <w:p>
       <w:pPr>
         <w:spacing w:before="0" w:after="80"/>
-      </w:pPr>
-      <w:r>
-        <w:rPr>
-          <w:rFonts w:ascii="Times New Roman" w:hAnsi="Times New Roman" w:eastAsia="Times New Roman" w:cs="Times New Roman"/>
-          <w:b/>
-          <w:bCs/>
-          <w:sz w:val="22"/>
-          <w:szCs w:val="22"/>
-        </w:rPr>
-        <w:t xml:space="preserve">Course: </w:t>
-      </w:r>
-      <w:r>
-        <w:rPr>
-          <w:rFonts w:ascii="Times New Roman" w:hAnsi="Times New Roman" w:eastAsia="Times New Roman" w:cs="Times New Roman"/>
-          <w:sz w:val="22"/>
-          <w:szCs w:val="22"/>
-        </w:rPr>
-        <w:t>M.Tech CSE</w:t>
-      </w:r>
+        <w:rPr>
+          <w:rFonts w:hint="default" w:cs="Times New Roman"/>
+          <w:sz w:val="22"/>
+          <w:szCs w:val="22"/>
+          <w:lang w:val="en-US"/>
+        </w:rPr>
+      </w:pPr>
+    </w:p>
+    <w:p>
+      <w:pPr>
+        <w:spacing w:before="0" w:after="80"/>
+        <w:rPr>
+          <w:rFonts w:hint="default" w:ascii="Times New Roman" w:hAnsi="Times New Roman" w:eastAsia="Times New Roman" w:cs="Times New Roman"/>
+          <w:sz w:val="22"/>
+          <w:szCs w:val="22"/>
+          <w:lang w:val="en-US"/>
+        </w:rPr>
+      </w:pPr>
+    </w:p>
+    <w:p>
+      <w:pPr>
+        <w:spacing w:before="0" w:after="80"/>
+        <w:rPr>
+          <w:rFonts w:ascii="Times New Roman" w:hAnsi="Times New Roman" w:eastAsia="Times New Roman" w:cs="Times New Roman"/>
+          <w:sz w:val="22"/>
+          <w:szCs w:val="22"/>
+        </w:rPr>
+      </w:pPr>
+    </w:p>
+    <w:p>
+      <w:pPr>
+        <w:spacing w:before="0" w:after="80"/>
+        <w:rPr>
+          <w:rFonts w:hint="default" w:cs="Times New Roman"/>
+          <w:sz w:val="22"/>
+          <w:szCs w:val="22"/>
+          <w:lang w:val="en-US"/>
+        </w:rPr>
+      </w:pPr>
     </w:p>
     <w:p>
       <w:r>
@@ -2641,8 +2881,6 @@
       <w:r>
         <w:br w:type="page"/>
       </w:r>
-      <w:bookmarkStart w:id="0" w:name="_GoBack"/>
-      <w:bookmarkEnd w:id="0"/>
     </w:p>
     <w:p>
       <w:pPr>
@@ -6026,6 +6264,13 @@
           <w:szCs w:val="22"/>
         </w:rPr>
         <w:tab/>
+      </w:r>
+      <w:r>
+        <w:rPr>
+          <w:rFonts w:ascii="Times New Roman" w:hAnsi="Times New Roman" w:eastAsia="Times New Roman" w:cs="Times New Roman"/>
+          <w:sz w:val="22"/>
+          <w:szCs w:val="22"/>
+        </w:rPr>
         <w:t xml:space="preserve">imes M$ new entries. The depth of the new path is calculated as: $Depth(Ancestor </w:t>
       </w:r>
       <w:r>
@@ -6035,6 +6280,13 @@
           <w:szCs w:val="22"/>
         </w:rPr>
         <w:tab/>
+      </w:r>
+      <w:r>
+        <w:rPr>
+          <w:rFonts w:ascii="Times New Roman" w:hAnsi="Times New Roman" w:eastAsia="Times New Roman" w:cs="Times New Roman"/>
+          <w:sz w:val="22"/>
+          <w:szCs w:val="22"/>
+        </w:rPr>
         <w:t xml:space="preserve">o Source) + 1 + Depth(Target </w:t>
       </w:r>
       <w:r>
@@ -6044,6 +6296,13 @@
           <w:szCs w:val="22"/>
         </w:rPr>
         <w:tab/>
+      </w:r>
+      <w:r>
+        <w:rPr>
+          <w:rFonts w:ascii="Times New Roman" w:hAnsi="Times New Roman" w:eastAsia="Times New Roman" w:cs="Times New Roman"/>
+          <w:sz w:val="22"/>
+          <w:szCs w:val="22"/>
+        </w:rPr>
         <w:t xml:space="preserve">o Descendant)$. By offloading this potentially expensive $O(N </w:t>
       </w:r>
       <w:r>
@@ -6053,6 +6312,13 @@
           <w:szCs w:val="22"/>
         </w:rPr>
         <w:tab/>
+      </w:r>
+      <w:r>
+        <w:rPr>
+          <w:rFonts w:ascii="Times New Roman" w:hAnsi="Times New Roman" w:eastAsia="Times New Roman" w:cs="Times New Roman"/>
+          <w:sz w:val="22"/>
+          <w:szCs w:val="22"/>
+        </w:rPr>
         <w:t>imes M)$ operation to the asynchronous Kafka consumer tier, Taskinator ensures that the synchronous user interaction remains entirely unaffected by the topological complexity of the graph.</w:t>
       </w:r>
     </w:p>

</xml_diff>

<commit_message>
feat: implement global create project modal, update task link API, and refine UI component styles
</commit_message>
<xml_diff>
--- a/thesis/builder/taskinator_thesis_v2.docx
+++ b/thesis/builder/taskinator_thesis_v2.docx
@@ -291,7 +291,20 @@
           <w:szCs w:val="22"/>
           <w:lang w:val="en-US"/>
         </w:rPr>
-        <w:t>Head of Department</w:t>
+        <w:t>Head of Department (CSE</w:t>
+      </w:r>
+      <w:bookmarkStart w:id="0" w:name="_GoBack"/>
+      <w:bookmarkEnd w:id="0"/>
+      <w:r>
+        <w:rPr>
+          <w:rFonts w:hint="default" w:cs="Times New Roman"/>
+          <w:b w:val="0"/>
+          <w:bCs w:val="0"/>
+          <w:sz w:val="22"/>
+          <w:szCs w:val="22"/>
+          <w:lang w:val="en-US"/>
+        </w:rPr>
+        <w:t>)</w:t>
       </w:r>
     </w:p>
     <w:p>
@@ -749,19 +762,7 @@
           <w:sz w:val="22"/>
           <w:szCs w:val="22"/>
         </w:rPr>
-        <w:t>Depart</w:t>
-      </w:r>
-      <w:bookmarkStart w:id="0" w:name="_GoBack"/>
-      <w:bookmarkEnd w:id="0"/>
-      <w:r>
-        <w:rPr>
-          <w:rFonts w:ascii="Times New Roman" w:hAnsi="Times New Roman" w:eastAsia="Times New Roman" w:cs="Times New Roman"/>
-          <w:b/>
-          <w:bCs/>
-          <w:sz w:val="22"/>
-          <w:szCs w:val="22"/>
-        </w:rPr>
-        <w:t>ment of CSE</w:t>
+        <w:t>Department of CSE</w:t>
       </w:r>
     </w:p>
     <w:p>

</xml_diff>